<commit_message>
Update Portuguese Bible reference text alignments for 2026-07-09
</commit_message>
<xml_diff>
--- a/por/docx/01.content.docx
+++ b/por/docx/01.content.docx
@@ -403,7 +403,7 @@
         <w:rPr>
           <w:lang w:val="pt_PT" w:bidi="pt_PT"/>
         </w:rPr>
-        <w:t xml:space="preserve"> Deus chamou a parte seca de "terra", e as águas de "mares". E ele viu que isso era bom.</w:t>
+        <w:t xml:space="preserve"> Deus chamou a parte seca de “terra”, e as águas de “mares”. E ele viu que isso era bom.</w:t>
       </w:r>
     </w:p>
     <w:p>
@@ -781,7 +781,7 @@
         <w:rPr>
           <w:lang w:val="pt_PT" w:bidi="pt_PT"/>
         </w:rPr>
-        <w:t xml:space="preserve"> Deus os abençoou e disse: "Multipliquem-se, encham a terra e a governem. Dominem os peixes do mar, as aves do céu e todos os animais que se movem sobre a terra".</w:t>
+        <w:t xml:space="preserve"> Deus os abençoou e disse: “Multipliquem-se, encham a terra e a governem. Dominem os peixes do mar, as aves do céu e todos os animais que se movem sobre a terra”.</w:t>
       </w:r>
     </w:p>
     <w:p>
@@ -823,7 +823,7 @@
         <w:rPr>
           <w:lang w:val="pt_PT" w:bidi="pt_PT"/>
         </w:rPr>
-        <w:t xml:space="preserve"> Dou todas as plantas como alimento a todos os seres vivos que possuem fôlego de vida, isto é, a todos os animais selvagens, às aves do céu e aos animais que rastejam pela terra". E assim aconteceu.</w:t>
+        <w:t xml:space="preserve"> Dou todas as plantas como alimento a todos os seres vivos que possuem fôlego de vida, isto é, a todos os animais selvagens, às aves do céu e aos animais que rastejam pela terra”. E assim aconteceu.</w:t>
       </w:r>
     </w:p>
     <w:p>
@@ -1112,7 +1112,7 @@
         <w:rPr>
           <w:lang w:val="pt_PT" w:bidi="pt_PT"/>
         </w:rPr>
-        <w:t xml:space="preserve"> Esse ouro era de excelente qualidade; lá também havia bdéliobdélio: O bdélio (bedolach), citado entre as riquezas de Havilá ao lado do ouro e do ônix, tem identificação incerta: pode designar uma resina aromática translúcida (semelhante à mirra) ou uma pedra preciosa." class="footnote-marker"&gt;1 e pedra de ônix.</w:t>
+        <w:t xml:space="preserve"> Esse ouro era de excelente qualidade; lá também havia bdélio e pedra de ônix.</w:t>
       </w:r>
     </w:p>
     <w:p>
@@ -1217,7 +1217,7 @@
         <w:rPr>
           <w:lang w:val="pt_PT" w:bidi="pt_PT"/>
         </w:rPr>
-        <w:t xml:space="preserve"> mas não coma da árvore do conhecimento do bem e do mal, pois no dia em que dela comer, certamente morrerá".</w:t>
+        <w:t xml:space="preserve"> mas não coma da árvore do conhecimento do bem e do mal, pois no dia em que dela comer, certamente morrerá”.</w:t>
       </w:r>
     </w:p>
     <w:p>
@@ -1422,7 +1422,7 @@
         <w:rPr>
           <w:lang w:val="pt_PT" w:bidi="pt_PT"/>
         </w:rPr>
-        <w:t xml:space="preserve"> A serpente era a mais astuta de todos os animais que o SENHOR Deus havia criado. Ela se aproximou da mulher e perguntou: "É verdade que Deus disse para vocês não comerem do fruto de nenhuma árvore do jardim?".</w:t>
+        <w:t xml:space="preserve"> A serpente era a mais astuta de todos os animais que o SENHOR Deus havia criado. Ela se aproximou da mulher e perguntou: “É verdade que Deus disse para vocês não comerem do fruto de nenhuma árvore do jardim?”.</w:t>
       </w:r>
     </w:p>
     <w:p>
@@ -1506,7 +1506,7 @@
         <w:rPr>
           <w:lang w:val="pt_PT" w:bidi="pt_PT"/>
         </w:rPr>
-        <w:t xml:space="preserve"> "Deus sabe que no momento em que comerem desse fruto, seus olhos se abrirão, e vocês, como Deus, conhecerão o bem e o mal."</w:t>
+        <w:t xml:space="preserve"> "Deus sabe que no momento em que comerem desse fruto, seus olhos se abrirão, e vocês, como Deus, conhecerão o bem e o mal.”</w:t>
       </w:r>
     </w:p>
     <w:p>
@@ -1590,7 +1590,7 @@
         <w:rPr>
           <w:lang w:val="pt_PT" w:bidi="pt_PT"/>
         </w:rPr>
-        <w:t xml:space="preserve"> O SENHOR Deus chamou o homem: "Onde você está?".</w:t>
+        <w:t xml:space="preserve"> O SENHOR Deus chamou o homem: “Onde você está?”.</w:t>
       </w:r>
     </w:p>
     <w:p>
@@ -1674,7 +1674,7 @@
         <w:rPr>
           <w:lang w:val="pt_PT" w:bidi="pt_PT"/>
         </w:rPr>
-        <w:t xml:space="preserve"> Então o SENHOR Deus perguntou à mulher: "O que foi que você fez?". A mulher respondeu: "A serpente me enganou, e eu comi".</w:t>
+        <w:t xml:space="preserve"> Então o SENHOR Deus perguntou à mulher: “O que foi que você fez?”. A mulher respondeu: “A serpente me enganou, e eu comi”.</w:t>
       </w:r>
     </w:p>
     <w:p>
@@ -1716,7 +1716,7 @@
         <w:rPr>
           <w:lang w:val="pt_PT" w:bidi="pt_PT"/>
         </w:rPr>
-        <w:t xml:space="preserve"> De agora em diante, haverá inimizade entre você e a mulher, e entre a sua descendência e a descendência dela. O descendente dela esmagará a sua cabeça, e você ferirá o calcanhar dele".</w:t>
+        <w:t xml:space="preserve"> De agora em diante, haverá inimizade entre você e a mulher, e entre a sua descendência e a descendência dela. O descendente dela esmagará a sua cabeça, e você ferirá o calcanhar dele”.</w:t>
       </w:r>
     </w:p>
     <w:p>
@@ -1942,7 +1942,7 @@
         <w:rPr>
           <w:lang w:val="pt_PT" w:bidi="pt_PT"/>
         </w:rPr>
-        <w:t xml:space="preserve"> Então Adão teve relações com Eva, e ela engravidou e deu à luz um filho, a quem chamou de Caim. Eva declarou: "Com a ajuda do SENHOR, consegui um filho homem!".</w:t>
+        <w:t xml:space="preserve"> Então Adão teve relações com Eva, e ela engravidou e deu à luz um filho, a quem chamou de Caim. Eva declarou: “Com a ajuda do SENHOR, consegui um filho homem!”.</w:t>
       </w:r>
     </w:p>
     <w:p>
@@ -2131,7 +2131,7 @@
         <w:rPr>
           <w:lang w:val="pt_PT" w:bidi="pt_PT"/>
         </w:rPr>
-        <w:t xml:space="preserve"> Então Deus disse: "O que você fez? O sangue do seu irmão clama a mim desde a terra onde foi derramado.</w:t>
+        <w:t xml:space="preserve"> Então Deus disse: “O que você fez? O sangue do seu irmão clama a mim desde a terra onde foi derramado.</w:t>
       </w:r>
     </w:p>
     <w:p>
@@ -2152,7 +2152,7 @@
         <w:rPr>
           <w:lang w:val="pt_PT" w:bidi="pt_PT"/>
         </w:rPr>
-        <w:t xml:space="preserve"> Por isso você será amaldiçoado nesta terra que foi manchada com o sangue dele.dele.: Tradução mais literal: "Agora, portanto, serás amaldiçoado e afastado da terra, a qual abriu a boca para receber, de tuas mãos, o sangue de teu irmão". " class="footnote-marker"&gt;1</w:t>
+        <w:t xml:space="preserve"> Por isso você será amaldiçoado nesta terra que foi manchada com o sangue dele.</w:t>
       </w:r>
     </w:p>
     <w:p>
@@ -2173,7 +2173,7 @@
         <w:rPr>
           <w:lang w:val="pt_PT" w:bidi="pt_PT"/>
         </w:rPr>
-        <w:t xml:space="preserve"> Quando você cultivar a terra, ela não produzirá mais o fruto do seu trabalho. Você será um fugitivo errante pela terra durante toda a sua vida".</w:t>
+        <w:t xml:space="preserve"> Quando você cultivar a terra, ela não produzirá mais o fruto do seu trabalho. Você será um fugitivo errante pela terra durante toda a sua vida”.</w:t>
       </w:r>
     </w:p>
     <w:p>
@@ -2215,7 +2215,7 @@
         <w:rPr>
           <w:lang w:val="pt_PT" w:bidi="pt_PT"/>
         </w:rPr>
-        <w:t xml:space="preserve"> Hoje me expulsas desta terra que cultivei, e terei de fugir da tua presença. Serei um fugitivo errante pela terra, e qualquer que me encontrar tentará me matar!".</w:t>
+        <w:t xml:space="preserve"> Hoje me expulsas desta terra que cultivei, e terei de fugir da tua presença. Serei um fugitivo errante pela terra, e qualquer que me encontrar tentará me matar!”.</w:t>
       </w:r>
     </w:p>
     <w:p>
@@ -2236,7 +2236,7 @@
         <w:rPr>
           <w:lang w:val="pt_PT" w:bidi="pt_PT"/>
         </w:rPr>
-        <w:t xml:space="preserve"> Mas o SENHOR lhe respondeu: "Isso não acontecerá. Quem matar você será punido sete vezes mais". E o SENHOR colocou um sinal em Caim, para que ninguém que o encontrasse o matasse.</w:t>
+        <w:t xml:space="preserve"> Mas o SENHOR lhe respondeu: “Isso não acontecerá. Quem matar você será punido sete vezes mais”. E o SENHOR colocou um sinal em Caim, para que ninguém que o encontrasse o matasse.</w:t>
       </w:r>
     </w:p>
     <w:p>
@@ -2525,7 +2525,7 @@
         <w:rPr>
           <w:lang w:val="pt_PT" w:bidi="pt_PT"/>
         </w:rPr>
-        <w:t xml:space="preserve"> homem e mulher os criou e os abençoou. Desde o dia em que foram criados, Deus os chamou de "humanos".</w:t>
+        <w:t xml:space="preserve"> homem e mulher os criou e os abençoou. Desde o dia em que foram criados, Deus os chamou de “humanos”.</w:t>
       </w:r>
     </w:p>
     <w:p>
@@ -3234,7 +3234,7 @@
         <w:rPr>
           <w:lang w:val="pt_PT" w:bidi="pt_PT"/>
         </w:rPr>
-        <w:t xml:space="preserve"> O SENHOR declarou: "Meu fôlego não ficará para sempre no homem, pois ele é carnal; seus dias serão limitados a 120 anos".</w:t>
+        <w:t xml:space="preserve"> O SENHOR declarou: “Meu fôlego não ficará para sempre no homem, pois ele é carnal; seus dias serão limitados a 120 anos”.</w:t>
       </w:r>
     </w:p>
     <w:p>
@@ -3612,7 +3612,7 @@
         <w:rPr>
           <w:lang w:val="pt_PT" w:bidi="pt_PT"/>
         </w:rPr>
-        <w:t xml:space="preserve"> Armazene também todo tipo de alimento, tanto para seu sustento como para o dos animais".</w:t>
+        <w:t xml:space="preserve"> Armazene também todo tipo de alimento, tanto para seu sustento como para o dos animais”.</w:t>
       </w:r>
     </w:p>
     <w:p>
@@ -4253,7 +4253,7 @@
         <w:rPr>
           <w:lang w:val="pt_PT" w:bidi="pt_PT"/>
         </w:rPr>
-        <w:t xml:space="preserve"> e, no décimo sétimo dia do sétimo mês,mês: O “décimo sétimo dia do sétimo mês” corresponde ao término dos 150 dias mencionados em Gênesis 7:24.﻿" class="footnote-marker"&gt;1 a embarcação pousou no cume das montanhas de Ararate.</w:t>
+        <w:t xml:space="preserve"> e, no décimo sétimo dia do sétimo mês, a embarcação pousou no cume das montanhas de Ararate.</w:t>
       </w:r>
     </w:p>
     <w:p>
@@ -4274,7 +4274,7 @@
         <w:rPr>
           <w:lang w:val="pt_PT" w:bidi="pt_PT"/>
         </w:rPr>
-        <w:t xml:space="preserve"> As águas continuaram a recuar até que, no primeiro dia do décimo mês,mês: Dois meses e meio depois do pouso da embarcação" class="footnote-marker"&gt;2 apareceram os cumes das montanhas.</w:t>
+        <w:t xml:space="preserve"> As águas continuaram a recuar até que, no primeiro dia do décimo mês, apareceram os cumes das montanhas.</w:t>
       </w:r>
     </w:p>
     <w:p>
@@ -4631,7 +4631,7 @@
         <w:rPr>
           <w:lang w:val="pt_PT" w:bidi="pt_PT"/>
         </w:rPr>
-        <w:t xml:space="preserve"> Enquanto a terra existir, haverá semeadura e colheita, frio e calor, verão e inverno, dia e noite".</w:t>
+        <w:t xml:space="preserve"> Enquanto a terra existir, haverá semeadura e colheita, frio e calor, verão e inverno, dia e noite”.</w:t>
       </w:r>
     </w:p>
     <w:p>
@@ -4794,7 +4794,7 @@
         <w:rPr>
           <w:lang w:val="pt_PT" w:bidi="pt_PT"/>
         </w:rPr>
-        <w:t xml:space="preserve"> Multipliquem-se, povoem novamente a terra e exerçam domínio sobre ela".</w:t>
+        <w:t xml:space="preserve"> Multipliquem-se, povoem novamente a terra e exerçam domínio sobre ela”.</w:t>
       </w:r>
     </w:p>
     <w:p>
@@ -4878,7 +4878,7 @@
         <w:rPr>
           <w:lang w:val="pt_PT" w:bidi="pt_PT"/>
         </w:rPr>
-        <w:t xml:space="preserve"> Estabeleço uma aliança com vocês: nunca mais os seres vivos da terra serão destruídos pelas águas. Nunca mais haverá um dilúvio para destruir a terra".</w:t>
+        <w:t xml:space="preserve"> Estabeleço uma aliança com vocês: nunca mais os seres vivos da terra serão destruídos pelas águas. Nunca mais haverá um dilúvio para destruir a terra”.</w:t>
       </w:r>
     </w:p>
     <w:p>
@@ -6086,7 +6086,7 @@
         <w:rPr>
           <w:lang w:val="pt_PT" w:bidi="pt_PT"/>
         </w:rPr>
-        <w:t xml:space="preserve"> Então, o SENHOR observou: "Eles formam um único povo e compartilham a mesma língua. Se já começaram a realizar isso, em breve nada poderá impedir seus empreendimentos.</w:t>
+        <w:t xml:space="preserve"> Então, o SENHOR observou: “Eles formam um único povo e compartilham a mesma língua. Se já começaram a realizar isso, em breve nada poderá impedir seus empreendimentos.</w:t>
       </w:r>
     </w:p>
     <w:p>
@@ -6107,7 +6107,7 @@
         <w:rPr>
           <w:lang w:val="pt_PT" w:bidi="pt_PT"/>
         </w:rPr>
-        <w:t xml:space="preserve"> Venham, desçamos e confundamos a língua deles, para que não se entendam mais uns aos outros".</w:t>
+        <w:t xml:space="preserve"> Venham, desçamos e confundamos a língua deles, para que não se entendam mais uns aos outros”.</w:t>
       </w:r>
     </w:p>
     <w:p>
@@ -6711,7 +6711,7 @@
         <w:rPr>
           <w:lang w:val="pt_PT" w:bidi="pt_PT"/>
         </w:rPr>
-        <w:t xml:space="preserve"> Abençoarei quem abençoá-lo e amaldiçoarei quem amaldiçoá-lo. E por meio de você, todas as nações da terra serão abençoadas".</w:t>
+        <w:t xml:space="preserve"> Abençoarei quem abençoá-lo e amaldiçoarei quem amaldiçoá-lo. E por meio de você, todas as nações da terra serão abençoadas”.</w:t>
       </w:r>
     </w:p>
     <w:p>
@@ -6879,7 +6879,7 @@
         <w:rPr>
           <w:lang w:val="pt_PT" w:bidi="pt_PT"/>
         </w:rPr>
-        <w:t xml:space="preserve"> Quando Abrão estava prestes a entrar no Egito, disse a Sarai, sua esposa: "Sei que você é uma mulher muito bonita.</w:t>
+        <w:t xml:space="preserve"> Quando Abrão estava prestes a entrar no Egito, disse a Sarai, sua esposa: “Sei que você é uma mulher muito bonita.</w:t>
       </w:r>
     </w:p>
     <w:p>
@@ -7441,7 +7441,7 @@
         <w:rPr>
           <w:lang w:val="pt_PT" w:bidi="pt_PT"/>
         </w:rPr>
-        <w:t xml:space="preserve"> Percorra toda a extensão da terra, de norte a sul e de leste a oeste, pois eu a darei a você".</w:t>
+        <w:t xml:space="preserve"> Percorra toda a extensão da terra, de norte a sul e de leste a oeste, pois eu a darei a você”.</w:t>
       </w:r>
     </w:p>
     <w:p>
@@ -8040,7 +8040,7 @@
         <w:rPr>
           <w:lang w:val="pt_PT" w:bidi="pt_PT"/>
         </w:rPr>
-        <w:t xml:space="preserve"> Mas Abrão perguntou: “Ó SENHOR Soberano, que benefício me concederás, se permaneço sem descendência e quem herdará meus bens é Eliézer, de Damasco?".</w:t>
+        <w:t xml:space="preserve"> Mas Abrão perguntou: “Ó SENHOR Soberano, que benefício me concederás, se permaneço sem descendência e quem herdará meus bens é Eliézer, de Damasco?”.</w:t>
       </w:r>
     </w:p>
     <w:p>
@@ -8061,7 +8061,7 @@
         <w:rPr>
           <w:lang w:val="pt_PT" w:bidi="pt_PT"/>
         </w:rPr>
-        <w:t xml:space="preserve"> E prosseguiu: "Não me concedeste filhos; por isso, um dos servos da minha casa herdará tudo".</w:t>
+        <w:t xml:space="preserve"> E prosseguiu: “Não me concedeste filhos; por isso, um dos servos da minha casa herdará tudo”.</w:t>
       </w:r>
     </w:p>
     <w:p>
@@ -8707,7 +8707,7 @@
         <w:rPr>
           <w:lang w:val="pt_PT" w:bidi="pt_PT"/>
         </w:rPr>
-        <w:t xml:space="preserve"> Seu filho será como um jumento selvagem, livre e indomável. Ele estará em conflito com todos, e todos estarão em conflito com ele; e viverá em hostilidade diante de seus parentes".</w:t>
+        <w:t xml:space="preserve"> Seu filho será como um jumento selvagem, livre e indomável. Ele estará em conflito com todos, e todos estarão em conflito com ele; e viverá em hostilidade diante de seus parentes”.</w:t>
       </w:r>
     </w:p>
     <w:p>
@@ -8849,7 +8849,7 @@
         <w:rPr>
           <w:lang w:val="pt_PT" w:bidi="pt_PT"/>
         </w:rPr>
-        <w:t xml:space="preserve"> Farei uma aliança com você e multiplicarei os seus descendentes extraordinariamente".</w:t>
+        <w:t xml:space="preserve"> Farei uma aliança com você e multiplicarei os seus descendentes extraordinariamente”.</w:t>
       </w:r>
     </w:p>
     <w:p>
@@ -8975,7 +8975,7 @@
         <w:rPr>
           <w:lang w:val="pt_PT" w:bidi="pt_PT"/>
         </w:rPr>
-        <w:t xml:space="preserve"> E darei a eles toda a terra de Canaã, onde você reside como estrangeiro. Ela será para sempre dos seus descendentes, e eu serei o Deus deles".</w:t>
+        <w:t xml:space="preserve"> E darei a eles toda a terra de Canaã, onde você reside como estrangeiro. Ela será para sempre dos seus descendentes, e eu serei o Deus deles”.</w:t>
       </w:r>
     </w:p>
     <w:p>
@@ -8996,7 +8996,7 @@
         <w:rPr>
           <w:lang w:val="pt_PT" w:bidi="pt_PT"/>
         </w:rPr>
-        <w:t xml:space="preserve"> Então Deus declarou: "Cabe a você e à sua descendência manterem a fidelidade à minha aliança em cada geração.</w:t>
+        <w:t xml:space="preserve"> Então Deus declarou: “Cabe a você e à sua descendência manterem a fidelidade à minha aliança em cada geração.</w:t>
       </w:r>
     </w:p>
     <w:p>
@@ -9101,7 +9101,7 @@
         <w:rPr>
           <w:lang w:val="pt_PT" w:bidi="pt_PT"/>
         </w:rPr>
-        <w:t xml:space="preserve"> Todo homem que não for circuncidado será excluído do seu povo, pois violou a minha aliança".</w:t>
+        <w:t xml:space="preserve"> Todo homem que não for circuncidado será excluído do seu povo, pois violou a minha aliança”.</w:t>
       </w:r>
     </w:p>
     <w:p>
@@ -9122,7 +9122,7 @@
         <w:rPr>
           <w:lang w:val="pt_PT" w:bidi="pt_PT"/>
         </w:rPr>
-        <w:t xml:space="preserve"> Deus também disse a Abraão: "Quanto à sua esposa Sarai, de agora em diante ela não será chamada Sarai, mas sim Sara.</w:t>
+        <w:t xml:space="preserve"> Deus também disse a Abraão: “Quanto à sua esposa Sarai, de agora em diante ela não será chamada Sarai, mas sim Sara.</w:t>
       </w:r>
     </w:p>
     <w:p>
@@ -9143,7 +9143,7 @@
         <w:rPr>
           <w:lang w:val="pt_PT" w:bidi="pt_PT"/>
         </w:rPr>
-        <w:t xml:space="preserve"> Abençoarei Sara e darei a você um filho por meio dela. Sim, eu a abençoarei e ela se tornará mãe de nações!".</w:t>
+        <w:t xml:space="preserve"> Abençoarei Sara e darei a você um filho por meio dela. Sim, eu a abençoarei e ela se tornará mãe de nações!”.</w:t>
       </w:r>
     </w:p>
     <w:p>
@@ -9206,7 +9206,7 @@
         <w:rPr>
           <w:lang w:val="pt_PT" w:bidi="pt_PT"/>
         </w:rPr>
-        <w:t xml:space="preserve"> Deus respondeu: "Sua esposa Sara lhe dará um filho, e você o chamará Isaque. Com ele confirmarei a minha aliança, que permanecerá para sempre com sua descendência.</w:t>
+        <w:t xml:space="preserve"> Deus respondeu: “Sua esposa Sara lhe dará um filho, e você o chamará Isaque. Com ele confirmarei a minha aliança, que permanecerá para sempre com sua descendência.</w:t>
       </w:r>
     </w:p>
     <w:p>
@@ -9248,7 +9248,7 @@
         <w:rPr>
           <w:lang w:val="pt_PT" w:bidi="pt_PT"/>
         </w:rPr>
-        <w:t xml:space="preserve"> Mas a minha aliança será com Isaque, o filho que Sara lhe dará dentro de um ano".</w:t>
+        <w:t xml:space="preserve"> Mas a minha aliança será com Isaque, o filho que Sara lhe dará dentro de um ano”.</w:t>
       </w:r>
     </w:p>
     <w:p>
@@ -9789,7 +9789,7 @@
         <w:rPr>
           <w:lang w:val="pt_PT" w:bidi="pt_PT"/>
         </w:rPr>
-        <w:t xml:space="preserve"> Pois eu o escolhi para que ordene a seus filhos e à sua casa que sigam o caminho do SENHOR, praticando o que é justo e correto, para que eu cumpra tudo o que prometi a Abraão".</w:t>
+        <w:t xml:space="preserve"> Pois eu o escolhi para que ordene a seus filhos e à sua casa que sigam o caminho do SENHOR, praticando o que é justo e correto, para que eu cumpra tudo o que prometi a Abraão”.</w:t>
       </w:r>
     </w:p>
     <w:p>
@@ -10372,7 +10372,7 @@
         <w:rPr>
           <w:lang w:val="pt_PT" w:bidi="pt_PT"/>
         </w:rPr>
-        <w:t xml:space="preserve"> Estamos prestes a destruir este lugar, porque o clamor contra seus habitantes se tornou muito grande diante do SENHOR, que nos enviou para acabar com tudo".</w:t>
+        <w:t xml:space="preserve"> Estamos prestes a destruir este lugar, porque o clamor contra seus habitantes se tornou muito grande diante do SENHOR, que nos enviou para acabar com tudo”.</w:t>
       </w:r>
     </w:p>
     <w:p>
@@ -10414,7 +10414,7 @@
         <w:rPr>
           <w:lang w:val="pt_PT" w:bidi="pt_PT"/>
         </w:rPr>
-        <w:t xml:space="preserve"> No dia seguinte, logo ao amanhecer, os anjos apressaram Ló: "Levante-se depressa. Pegue sua esposa e suas duas filhas, e saiam daqui enquanto há tempo! Vocês correm o risco de morrer na destruição desta cidade".</w:t>
+        <w:t xml:space="preserve"> No dia seguinte, logo ao amanhecer, os anjos apressaram Ló: “Levante-se depressa. Pegue sua esposa e suas duas filhas, e saiam daqui enquanto há tempo! Vocês correm o risco de morrer na destruição desta cidade”.</w:t>
       </w:r>
     </w:p>
     <w:p>
@@ -10477,7 +10477,7 @@
         <w:rPr>
           <w:lang w:val="pt_PT" w:bidi="pt_PT"/>
         </w:rPr>
-        <w:t xml:space="preserve"> Mas Ló respondeu: "Não, meu Senhor, eu te peço!</w:t>
+        <w:t xml:space="preserve"> Mas Ló respondeu: “Não, meu Senhor, eu te peço!</w:t>
       </w:r>
     </w:p>
     <w:p>
@@ -10519,7 +10519,7 @@
         <w:rPr>
           <w:lang w:val="pt_PT" w:bidi="pt_PT"/>
         </w:rPr>
-        <w:t xml:space="preserve"> Deixem-me ir para aquela cidade pequena. Ela está bem perto, e eu poderia fugir para lá e estar seguro".</w:t>
+        <w:t xml:space="preserve"> Deixem-me ir para aquela cidade pequena. Ela está bem perto, e eu poderia fugir para lá e estar seguro”.</w:t>
       </w:r>
     </w:p>
     <w:p>
@@ -10561,7 +10561,7 @@
         <w:rPr>
           <w:lang w:val="pt_PT" w:bidi="pt_PT"/>
         </w:rPr>
-        <w:t xml:space="preserve"> Depressa! Refugie-se ali, pois nada posso fazer até que você chegue". Por isso a cidade recebeu o nome de Zoar.</w:t>
+        <w:t xml:space="preserve"> Depressa! Refugie-se ali, pois nada posso fazer até que você chegue”. Por isso a cidade recebeu o nome de Zoar.</w:t>
       </w:r>
     </w:p>
     <w:p>
@@ -10976,7 +10976,7 @@
         <w:rPr>
           <w:lang w:val="pt_PT" w:bidi="pt_PT"/>
         </w:rPr>
-        <w:t xml:space="preserve"> Mas Deus veio a Abimeleque em sonho, durante a noite, e lhe disse: "Você vai morrer por causa da mulher que tomou para si, pois ela é casada".</w:t>
+        <w:t xml:space="preserve"> Mas Deus veio a Abimeleque em sonho, durante a noite, e lhe disse: “Você vai morrer por causa da mulher que tomou para si, pois ela é casada”.</w:t>
       </w:r>
     </w:p>
     <w:p>
@@ -10997,7 +10997,7 @@
         <w:rPr>
           <w:lang w:val="pt_PT" w:bidi="pt_PT"/>
         </w:rPr>
-        <w:t xml:space="preserve"> No entanto, Abimeleque não havia tocado em Sara. Então ele disse: "Senhor, destruirias uma nação inocente?</w:t>
+        <w:t xml:space="preserve"> No entanto, Abimeleque não havia tocado em Sara. Então ele disse: “Senhor, destruirias uma nação inocente?</w:t>
       </w:r>
     </w:p>
     <w:p>
@@ -11018,7 +11018,7 @@
         <w:rPr>
           <w:lang w:val="pt_PT" w:bidi="pt_PT"/>
         </w:rPr>
-        <w:t xml:space="preserve"> Não foi Abraão quem me disse: 'Ela é minha irmã'? E não foi ela que também afirmou: 'Ele é meu irmão'? Agi com sinceridade de coração e em minha inocência fiz o que fiz".</w:t>
+        <w:t xml:space="preserve"> Não foi Abraão quem me disse: ‘Ela é minha irmã’? E não foi ela que também afirmou: ‘Ele é meu irmão’? Agi com sinceridade de coração e em minha inocência fiz o que fiz”.</w:t>
       </w:r>
     </w:p>
     <w:p>
@@ -11039,7 +11039,7 @@
         <w:rPr>
           <w:lang w:val="pt_PT" w:bidi="pt_PT"/>
         </w:rPr>
-        <w:t xml:space="preserve"> Ainda em sonho, Deus respondeu: "Sim, eu sei que você agiu com sinceridade de coração. Por isso, impedi você de tocá-la e de pecar contra mim.</w:t>
+        <w:t xml:space="preserve"> Ainda em sonho, Deus respondeu: “Sim, eu sei que você agiu com sinceridade de coração. Por isso, impedi você de tocá-la e de pecar contra mim.</w:t>
       </w:r>
     </w:p>
     <w:p>
@@ -11060,7 +11060,7 @@
         <w:rPr>
           <w:lang w:val="pt_PT" w:bidi="pt_PT"/>
         </w:rPr>
-        <w:t xml:space="preserve"> Agora, devolva Sara ao marido dela. Ele é profeta e intercederá por você para que viva. Contudo, se não a devolver, saiba que você e todos os seus morrerão".</w:t>
+        <w:t xml:space="preserve"> Agora, devolva Sara ao marido dela. Ele é profeta e intercederá por você para que viva. Contudo, se não a devolver, saiba que você e todos os seus morrerão”.</w:t>
       </w:r>
     </w:p>
     <w:p>
@@ -11102,7 +11102,7 @@
         <w:rPr>
           <w:lang w:val="pt_PT" w:bidi="pt_PT"/>
         </w:rPr>
-        <w:t xml:space="preserve"> Depois, o rei convocou Abraão e perguntou: “Por que você fez isso conosco? O que fiz eu a você para me levar a cometer tamanha transgressão? Este pecado traria calamidade para mim e para meu reino. Você agiu mal".</w:t>
+        <w:t xml:space="preserve"> Depois, o rei convocou Abraão e perguntou: “Por que você fez isso conosco? O que fiz eu a você para me levar a cometer tamanha transgressão? Este pecado traria calamidade para mim e para meu reino. Você agiu mal”.</w:t>
       </w:r>
     </w:p>
     <w:p>
@@ -11123,7 +11123,7 @@
         <w:rPr>
           <w:lang w:val="pt_PT" w:bidi="pt_PT"/>
         </w:rPr>
-        <w:t xml:space="preserve"> Então Abimeleque perguntou a Abraão: "O que o motivou a fazer isso?".</w:t>
+        <w:t xml:space="preserve"> Então Abimeleque perguntou a Abraão: “O que o motivou a fazer isso?”.</w:t>
       </w:r>
     </w:p>
     <w:p>
@@ -11144,7 +11144,7 @@
         <w:rPr>
           <w:lang w:val="pt_PT" w:bidi="pt_PT"/>
         </w:rPr>
-        <w:t xml:space="preserve"> Abraão respondeu: "Eu pensei: certamente neste lugar não há temor a Deus, e vão me matar por causa da minha esposa.</w:t>
+        <w:t xml:space="preserve"> Abraão respondeu: “Eu pensei: certamente neste lugar não há temor a Deus, e vão me matar por causa da minha esposa.</w:t>
       </w:r>
     </w:p>
     <w:p>
@@ -11186,7 +11186,7 @@
         <w:rPr>
           <w:lang w:val="pt_PT" w:bidi="pt_PT"/>
         </w:rPr>
-        <w:t xml:space="preserve"> Quando Deus me mandou sair da casa de meu pai e ir para uma terra estrangeira, eu disse a Sara: 'Por favor, diga que é minha irmã, para que me tratem bem por sua causa'".</w:t>
+        <w:t xml:space="preserve"> Quando Deus me mandou sair da casa de meu pai e ir para uma terra estrangeira, eu disse a Sara: ‘Por favor, diga que é minha irmã, para que me tratem bem por sua causa’”.</w:t>
       </w:r>
     </w:p>
     <w:p>
@@ -11228,7 +11228,7 @@
         <w:rPr>
           <w:lang w:val="pt_PT" w:bidi="pt_PT"/>
         </w:rPr>
-        <w:t xml:space="preserve"> E Abimeleque disse: "Minha terra está à sua disposição. Escolha o lugar que desejar para viver".</w:t>
+        <w:t xml:space="preserve"> E Abimeleque disse: “Minha terra está à sua disposição. Escolha o lugar que desejar para viver”.</w:t>
       </w:r>
     </w:p>
     <w:p>
@@ -11249,7 +11249,7 @@
         <w:rPr>
           <w:lang w:val="pt_PT" w:bidi="pt_PT"/>
         </w:rPr>
-        <w:t xml:space="preserve"> E disse a Sara: "Veja, eu dei ao seu irmão mil peças de prata, para reparar a ofensa feita a você. Isso é uma prova pública da sua inocência diante de todos".</w:t>
+        <w:t xml:space="preserve"> E disse a Sara: “Veja, eu dei ao seu irmão mil peças de prata, para reparar a ofensa feita a você. Isso é uma prova pública da sua inocência diante de todos”.</w:t>
       </w:r>
     </w:p>
     <w:p>
@@ -11433,7 +11433,7 @@
         <w:rPr>
           <w:lang w:val="pt_PT" w:bidi="pt_PT"/>
         </w:rPr>
-        <w:t xml:space="preserve"> Sara disse: "Deus me trouxe motivo de riso, e todo aquele que ouvir isso rirá comigo".</w:t>
+        <w:t xml:space="preserve"> Sara disse: “Deus me trouxe motivo de riso, e todo aquele que ouvir isso rirá comigo”.</w:t>
       </w:r>
     </w:p>
     <w:p>
@@ -11685,7 +11685,7 @@
         <w:rPr>
           <w:lang w:val="pt_PT" w:bidi="pt_PT"/>
         </w:rPr>
-        <w:t xml:space="preserve"> Vamos! Levante-se, erga o menino e segure-o pela mão, porque dele farei uma grande nação".</w:t>
+        <w:t xml:space="preserve"> Vamos! Levante-se, erga o menino e segure-o pela mão, porque dele farei uma grande nação”.</w:t>
       </w:r>
     </w:p>
     <w:p>
@@ -11790,7 +11790,7 @@
         <w:rPr>
           <w:lang w:val="pt_PT" w:bidi="pt_PT"/>
         </w:rPr>
-        <w:t xml:space="preserve"> Agora, peço que jure diante de Deus que não vai me enganar, nem a mim, nem aos meus filhos e descendentes. Quero que trate a mim e a esta terra com a mesma bondade que eu tive com você".</w:t>
+        <w:t xml:space="preserve"> Agora, peço que jure diante de Deus que não vai me enganar, nem a mim, nem aos meus filhos e descendentes. Quero que trate a mim e a esta terra com a mesma bondade que eu tive com você”.</w:t>
       </w:r>
     </w:p>
     <w:p>
@@ -12268,7 +12268,7 @@
         <w:rPr>
           <w:lang w:val="pt_PT" w:bidi="pt_PT"/>
         </w:rPr>
-        <w:t xml:space="preserve"> Nesse instante, o Anjo do SENHOR chamou do céu: "Abraão! Abraão!". E ele respondeu: "Aqui estou!".</w:t>
+        <w:t xml:space="preserve"> Nesse instante, o Anjo do SENHOR chamou do céu: “Abraão! Abraão!”. E ele respondeu: “Aqui estou!”.</w:t>
       </w:r>
     </w:p>
     <w:p>
@@ -12289,7 +12289,7 @@
         <w:rPr>
           <w:lang w:val="pt_PT" w:bidi="pt_PT"/>
         </w:rPr>
-        <w:t xml:space="preserve"> E o Anjo disse: “Não toque no menino, nem lhe faça mal algum. Agora sei que você teme a Deus, pois não me negou o seu amado filho, o seu único filho".</w:t>
+        <w:t xml:space="preserve"> E o Anjo disse: “Não toque no menino, nem lhe faça mal algum. Agora sei que você teme a Deus, pois não me negou o seu amado filho, o seu único filho”.</w:t>
       </w:r>
     </w:p>
     <w:p>
@@ -12373,7 +12373,7 @@
         <w:rPr>
           <w:lang w:val="pt_PT" w:bidi="pt_PT"/>
         </w:rPr>
-        <w:t xml:space="preserve"> e disse: "Assim declara o SENHOR: Porque você obedeceu e não me negou seu único filho, juro pelo meu próprio nome que</w:t>
+        <w:t xml:space="preserve"> e disse: “Assim declara o SENHOR: Porque você obedeceu e não me negou seu único filho, juro pelo meu próprio nome que</w:t>
       </w:r>
     </w:p>
     <w:p>
@@ -12415,7 +12415,7 @@
         <w:rPr>
           <w:lang w:val="pt_PT" w:bidi="pt_PT"/>
         </w:rPr>
-        <w:t xml:space="preserve"> e, por meio deles, todas as nações da terra serão abençoadas, porque você obedeceu a mim".</w:t>
+        <w:t xml:space="preserve"> e, por meio deles, todas as nações da terra serão abençoadas, porque você obedeceu a mim”.</w:t>
       </w:r>
     </w:p>
     <w:p>
@@ -12683,7 +12683,7 @@
         <w:rPr>
           <w:lang w:val="pt_PT" w:bidi="pt_PT"/>
         </w:rPr>
-        <w:t xml:space="preserve"> "Ouça-nos: O senhor é um príncipe de Deus entre nós. Sepulte sua esposa numa de nossas melhores sepulturas; nenhum de nós recusará a sepultura para o senhor enterrar sua esposa".</w:t>
+        <w:t xml:space="preserve"> "Ouça-nos: O senhor é um príncipe de Deus entre nós. Sepulte sua esposa numa de nossas melhores sepulturas; nenhum de nós recusará a sepultura para o senhor enterrar sua esposa”.</w:t>
       </w:r>
     </w:p>
     <w:p>
@@ -12725,7 +12725,7 @@
         <w:rPr>
           <w:lang w:val="pt_PT" w:bidi="pt_PT"/>
         </w:rPr>
-        <w:t xml:space="preserve"> e lhes disse: "Já que estão sendo tão gentis em permitir que eu enterre minha esposa, por favor, intercedam por mim junto a Efrom, filho de Zoar.</w:t>
+        <w:t xml:space="preserve"> e lhes disse: “Já que estão sendo tão gentis em permitir que eu enterre minha esposa, por favor, intercedam por mim junto a Efrom, filho de Zoar.</w:t>
       </w:r>
     </w:p>
     <w:p>
@@ -12788,7 +12788,7 @@
         <w:rPr>
           <w:lang w:val="pt_PT" w:bidi="pt_PT"/>
         </w:rPr>
-        <w:t xml:space="preserve"> "De modo algum, meu senhor. Ouça-me: eu lhe dou o campo e a caverna que nele está. Diante do meu povo, eu lhe dou o terreno. Sepulte sua mulher".</w:t>
+        <w:t xml:space="preserve"> "De modo algum, meu senhor. Ouça-me: eu lhe dou o campo e a caverna que nele está. Diante do meu povo, eu lhe dou o terreno. Sepulte sua mulher”.</w:t>
       </w:r>
     </w:p>
     <w:p>
@@ -12830,7 +12830,7 @@
         <w:rPr>
           <w:lang w:val="pt_PT" w:bidi="pt_PT"/>
         </w:rPr>
-        <w:t xml:space="preserve"> e disse a Efrom, na presença dos hititas reunidos: "Se você concorda, por favor, ouça-me: desejo pagar o preço do campo. Após o pagamento, sepultarei minha esposa".</w:t>
+        <w:t xml:space="preserve"> e disse a Efrom, na presença dos hititas reunidos: “Se você concorda, por favor, ouça-me: desejo pagar o preço do campo. Após o pagamento, sepultarei minha esposa”.</w:t>
       </w:r>
     </w:p>
     <w:p>
@@ -12872,7 +12872,7 @@
         <w:rPr>
           <w:lang w:val="pt_PT" w:bidi="pt_PT"/>
         </w:rPr>
-        <w:t xml:space="preserve"> "Ouça-me, meu senhor; aquele terreno vale quatrocentas moedas de prata, mas o que é isso entre nós? Vá e sepulte sua esposa".</w:t>
+        <w:t xml:space="preserve"> "Ouça-me, meu senhor; aquele terreno vale quatrocentas moedas de prata, mas o que é isso entre nós? Vá e sepulte sua esposa”.</w:t>
       </w:r>
     </w:p>
     <w:p>
@@ -13035,7 +13035,7 @@
         <w:rPr>
           <w:lang w:val="pt_PT" w:bidi="pt_PT"/>
         </w:rPr>
-        <w:t xml:space="preserve"> Abraão chamou seu servo mais velho, que era o responsável por todos os seus bens, e disse: "Coloque a mão debaixo da minha coxa</w:t>
+        <w:t xml:space="preserve"> Abraão chamou seu servo mais velho, que era o responsável por todos os seus bens, e disse: “Coloque a mão debaixo da minha coxa</w:t>
       </w:r>
     </w:p>
     <w:p>
@@ -13077,7 +13077,7 @@
         <w:rPr>
           <w:lang w:val="pt_PT" w:bidi="pt_PT"/>
         </w:rPr>
-        <w:t xml:space="preserve"> Mas vá até minha terra natal e entre meus parentes, e dali traga uma esposa para meu filho Isaque".</w:t>
+        <w:t xml:space="preserve"> Mas vá até minha terra natal e entre meus parentes, e dali traga uma esposa para meu filho Isaque”.</w:t>
       </w:r>
     </w:p>
     <w:p>
@@ -13098,7 +13098,7 @@
         <w:rPr>
           <w:lang w:val="pt_PT" w:bidi="pt_PT"/>
         </w:rPr>
-        <w:t xml:space="preserve"> O servo perguntou: "E se a mulher não quiser vir comigo para esta terra? Devo então levar seu filho de volta para a terra de onde o senhor veio?".</w:t>
+        <w:t xml:space="preserve"> O servo perguntou: “E se a mulher não quiser vir comigo para esta terra? Devo então levar seu filho de volta para a terra de onde o senhor veio?”.</w:t>
       </w:r>
     </w:p>
     <w:p>
@@ -13119,7 +13119,7 @@
         <w:rPr>
           <w:lang w:val="pt_PT" w:bidi="pt_PT"/>
         </w:rPr>
-        <w:t xml:space="preserve"> Abraão respondeu: "Cuidado para não fazer isso! Não leve meu filho de volta para lá.</w:t>
+        <w:t xml:space="preserve"> Abraão respondeu: “Cuidado para não fazer isso! Não leve meu filho de volta para lá.</w:t>
       </w:r>
     </w:p>
     <w:p>
@@ -13161,7 +13161,7 @@
         <w:rPr>
           <w:lang w:val="pt_PT" w:bidi="pt_PT"/>
         </w:rPr>
-        <w:t xml:space="preserve"> Se ela não quiser vir, você estará livre do juramento que fez comigo; mas não leve meu filho de volta para lá".</w:t>
+        <w:t xml:space="preserve"> Se ela não quiser vir, você estará livre do juramento que fez comigo; mas não leve meu filho de volta para lá”.</w:t>
       </w:r>
     </w:p>
     <w:p>
@@ -13518,7 +13518,7 @@
         <w:rPr>
           <w:lang w:val="pt_PT" w:bidi="pt_PT"/>
         </w:rPr>
-        <w:t xml:space="preserve"> E acrescentou: “Temos palha, muito pasto para os animais e lugar para os hóspedes passarem a noite".</w:t>
+        <w:t xml:space="preserve"> E acrescentou: “Temos palha, muito pasto para os animais e lugar para os hóspedes passarem a noite”.</w:t>
       </w:r>
     </w:p>
     <w:p>
@@ -13560,7 +13560,7 @@
         <w:rPr>
           <w:lang w:val="pt_PT" w:bidi="pt_PT"/>
         </w:rPr>
-        <w:t xml:space="preserve"> dizendo: "Bendito seja o SENHOR, Deus de meu senhor Abraão, que não retirou sua bondade e fidelidade de meu senhor; quanto a mim, guiou-me, por caminho reto, à casa dos parentes de meu senhor".</w:t>
+        <w:t xml:space="preserve"> dizendo: “Bendito seja o SENHOR, Deus de meu senhor Abraão, que não retirou sua bondade e fidelidade de meu senhor; quanto a mim, guiou-me, por caminho reto, à casa dos parentes de meu senhor”.</w:t>
       </w:r>
     </w:p>
     <w:p>
@@ -13686,7 +13686,7 @@
         <w:rPr>
           <w:lang w:val="pt_PT" w:bidi="pt_PT"/>
         </w:rPr>
-        <w:t xml:space="preserve"> Depois que serviram comida, o homem disse: “Não posso comer até contar o motivo da minha vinda”. Labão respondeu: “Está certo. Conte-me".</w:t>
+        <w:t xml:space="preserve"> Depois que serviram comida, o homem disse: “Não posso comer até contar o motivo da minha vinda”. Labão respondeu: “Está certo. Conte-me”.</w:t>
       </w:r>
     </w:p>
     <w:p>
@@ -13770,7 +13770,7 @@
         <w:rPr>
           <w:lang w:val="pt_PT" w:bidi="pt_PT"/>
         </w:rPr>
-        <w:t xml:space="preserve"> E meu senhor me fez jurar, dizendo: 'Você não tomará uma esposa para meu filho dentre as filhas dos cananeus que vivem aqui,</w:t>
+        <w:t xml:space="preserve"> E meu senhor me fez jurar, dizendo: ‘Você não tomará uma esposa para meu filho dentre as filhas dos cananeus que vivem aqui,</w:t>
       </w:r>
     </w:p>
     <w:p>
@@ -13791,7 +13791,7 @@
         <w:rPr>
           <w:lang w:val="pt_PT" w:bidi="pt_PT"/>
         </w:rPr>
-        <w:t xml:space="preserve"> mas irá à casa de meu pai e à minha família buscar uma esposa para meu filho'.</w:t>
+        <w:t xml:space="preserve"> mas irá à casa de meu pai e à minha família buscar uma esposa para meu filho’.</w:t>
       </w:r>
     </w:p>
     <w:p>
@@ -13812,7 +13812,7 @@
         <w:rPr>
           <w:lang w:val="pt_PT" w:bidi="pt_PT"/>
         </w:rPr>
-        <w:t xml:space="preserve"> Perguntei ao meu senhor: 'E se a mulher não quiser vir comigo?'.</w:t>
+        <w:t xml:space="preserve"> Perguntei ao meu senhor: ‘E se a mulher não quiser vir comigo?’.</w:t>
       </w:r>
     </w:p>
     <w:p>
@@ -13854,7 +13854,7 @@
         <w:rPr>
           <w:lang w:val="pt_PT" w:bidi="pt_PT"/>
         </w:rPr>
-        <w:t xml:space="preserve"> Quando você chegar à minha família, estará livre do juramento se eles não quiserem entregá-la a você'.</w:t>
+        <w:t xml:space="preserve"> Quando você chegar à minha família, estará livre do juramento se eles não quiserem entregá-la a você’.</w:t>
       </w:r>
     </w:p>
     <w:p>
@@ -13896,7 +13896,7 @@
         <w:rPr>
           <w:lang w:val="pt_PT" w:bidi="pt_PT"/>
         </w:rPr>
-        <w:t xml:space="preserve"> Aqui estou perto desta fonte; se uma moça vier tirar água e eu lhe pedir: 'Por favor, dê-me um pouco da água do seu cântaro',</w:t>
+        <w:t xml:space="preserve"> Aqui estou perto desta fonte; se uma moça vier tirar água e eu lhe pedir: ‘Por favor, dê-me um pouco da água do seu cântaro’,</w:t>
       </w:r>
     </w:p>
     <w:p>
@@ -13917,7 +13917,7 @@
         <w:rPr>
           <w:lang w:val="pt_PT" w:bidi="pt_PT"/>
         </w:rPr>
-        <w:t xml:space="preserve"> e, se ela me responder: 'Beba. Também darei água aos seus camelos', que essa seja a jovem que o SENHOR escolheu para o filho do meu senhor'.</w:t>
+        <w:t xml:space="preserve"> e, se ela me responder: ‘Beba. Também darei água aos seus camelos’, que essa seja a jovem que o SENHOR escolheu para o filho do meu senhor’.</w:t>
       </w:r>
     </w:p>
     <w:p>
@@ -13938,7 +13938,7 @@
         <w:rPr>
           <w:lang w:val="pt_PT" w:bidi="pt_PT"/>
         </w:rPr>
-        <w:t xml:space="preserve"> Antes que eu terminasse de orar em meu coração, Rebeca saiu com o cântaro no ombro; ela desceu à fonte, tirou água, e eu lhe disse: 'Por favor, dê-me um pouco de água para beber'.</w:t>
+        <w:t xml:space="preserve"> Antes que eu terminasse de orar em meu coração, Rebeca saiu com o cântaro no ombro; ela desceu à fonte, tirou água, e eu lhe disse: ‘Por favor, dê-me um pouco de água para beber’.</w:t>
       </w:r>
     </w:p>
     <w:p>
@@ -14022,7 +14022,7 @@
         <w:rPr>
           <w:lang w:val="pt_PT" w:bidi="pt_PT"/>
         </w:rPr>
-        <w:t xml:space="preserve"> Agora, digam-me se vocês mostrarão lealdade e bondade ao meu senhor; se não, por favor, digam-me também, para que eu saiba qual caminho seguir".</w:t>
+        <w:t xml:space="preserve"> Agora, digam-me se vocês mostrarão lealdade e bondade ao meu senhor; se não, por favor, digam-me também, para que eu saiba qual caminho seguir”.</w:t>
       </w:r>
     </w:p>
     <w:p>
@@ -14043,7 +14043,7 @@
         <w:rPr>
           <w:lang w:val="pt_PT" w:bidi="pt_PT"/>
         </w:rPr>
-        <w:t xml:space="preserve"> Labão e Betuel afirmaram: "Sem dúvida, isso é obra de Deus; não temos nada a acrescentar.</w:t>
+        <w:t xml:space="preserve"> Labão e Betuel afirmaram: “Sem dúvida, isso é obra de Deus; não temos nada a acrescentar.</w:t>
       </w:r>
     </w:p>
     <w:p>
@@ -14064,7 +14064,7 @@
         <w:rPr>
           <w:lang w:val="pt_PT" w:bidi="pt_PT"/>
         </w:rPr>
-        <w:t xml:space="preserve"> Aqui está Rebeca; leve-a. Que ela venha a ser esposa do filho do seu senhor, segundo declarou o SENHOR".</w:t>
+        <w:t xml:space="preserve"> Aqui está Rebeca; leve-a. Que ela venha a ser esposa do filho do seu senhor, segundo declarou o SENHOR”.</w:t>
       </w:r>
     </w:p>
     <w:p>
@@ -14127,7 +14127,7 @@
         <w:rPr>
           <w:lang w:val="pt_PT" w:bidi="pt_PT"/>
         </w:rPr>
-        <w:t xml:space="preserve"> Depois, ele e os homens que o acompanhavam comeram, beberam e ali repousaram durante a noite. Ao amanhecer, levantaram-se cedo, e o servo de Abraão declarou: "Permitam-me regressar ao meu senhor".</w:t>
+        <w:t xml:space="preserve"> Depois, ele e os homens que o acompanhavam comeram, beberam e ali repousaram durante a noite. Ao amanhecer, levantaram-se cedo, e o servo de Abraão declarou: “Permitam-me regressar ao meu senhor”.</w:t>
       </w:r>
     </w:p>
     <w:p>
@@ -14148,7 +14148,7 @@
         <w:rPr>
           <w:lang w:val="pt_PT" w:bidi="pt_PT"/>
         </w:rPr>
-        <w:t xml:space="preserve"> Mas o irmão e a mãe da jovem responderam: "Desejamos que ela permaneça conosco por cerca de dez dias; depois seguirá com você".</w:t>
+        <w:t xml:space="preserve"> Mas o irmão e a mãe da jovem responderam: “Desejamos que ela permaneça conosco por cerca de dez dias; depois seguirá com você”.</w:t>
       </w:r>
     </w:p>
     <w:p>
@@ -14169,7 +14169,7 @@
         <w:rPr>
           <w:lang w:val="pt_PT" w:bidi="pt_PT"/>
         </w:rPr>
-        <w:t xml:space="preserve"> Mas o servo insistiu: "Não me impeçam, por favor! O SENHOR fez prosperar minha missão. Deixem-me regressar ao meu senhor".</w:t>
+        <w:t xml:space="preserve"> Mas o servo insistiu: “Não me impeçam, por favor! O SENHOR fez prosperar minha missão. Deixem-me regressar ao meu senhor”.</w:t>
       </w:r>
     </w:p>
     <w:p>
@@ -14190,7 +14190,7 @@
         <w:rPr>
           <w:lang w:val="pt_PT" w:bidi="pt_PT"/>
         </w:rPr>
-        <w:t xml:space="preserve"> Então responderam: "Chamemos a jovem e escutemos o que ela tem a dizer".</w:t>
+        <w:t xml:space="preserve"> Então responderam: “Chamemos a jovem e escutemos o que ela tem a dizer”.</w:t>
       </w:r>
     </w:p>
     <w:p>
@@ -14211,7 +14211,7 @@
         <w:rPr>
           <w:lang w:val="pt_PT" w:bidi="pt_PT"/>
         </w:rPr>
-        <w:t xml:space="preserve"> Chamaram Rebeca e lhe perguntaram: "Você quer seguir com este homem?". Ela respondeu: "Quero. Eu irei com ele".</w:t>
+        <w:t xml:space="preserve"> Chamaram Rebeca e lhe perguntaram: “Você quer seguir com este homem?”. Ela respondeu: “Quero. Eu irei com ele”.</w:t>
       </w:r>
     </w:p>
     <w:p>
@@ -14253,7 +14253,7 @@
         <w:rPr>
           <w:lang w:val="pt_PT" w:bidi="pt_PT"/>
         </w:rPr>
-        <w:t xml:space="preserve"> E abençoaram Rebeca, dizendo: "Nossa irmã, que você se torne mãe de incontáveis multidões! Que a sua descendência tome posse das cidades daqueles que lhes são hostis".</w:t>
+        <w:t xml:space="preserve"> E abençoaram Rebeca, dizendo: “Nossa irmã, que você se torne mãe de incontáveis multidões! Que a sua descendência tome posse das cidades daqueles que lhes são hostis”.</w:t>
       </w:r>
     </w:p>
     <w:p>
@@ -14358,7 +14358,7 @@
         <w:rPr>
           <w:lang w:val="pt_PT" w:bidi="pt_PT"/>
         </w:rPr>
-        <w:t xml:space="preserve"> Ela perguntou ao servo: "Quem é aquele homem que vem pelo campo ao nosso encontro?". O servo respondeu: "É o meu senhor". Então Rebeca tomou o véu e se cobriu.</w:t>
+        <w:t xml:space="preserve"> Ela perguntou ao servo: “Quem é aquele homem que vem pelo campo ao nosso encontro?”. O servo respondeu: “É o meu senhor”. Então Rebeca tomou o véu e se cobriu.</w:t>
       </w:r>
     </w:p>
     <w:p>
@@ -14878,7 +14878,7 @@
         <w:rPr>
           <w:lang w:val="pt_PT" w:bidi="pt_PT"/>
         </w:rPr>
-        <w:t xml:space="preserve"> Os filhos se agitavam dentro do ventre dela, e então Rebeca indagou: "Por que me acontece isto?". Depois foi buscar orientação junto ao SENHOR.</w:t>
+        <w:t xml:space="preserve"> Os filhos se agitavam dentro do ventre dela, e então Rebeca indagou: “Por que me acontece isto?”. Depois foi buscar orientação junto ao SENHOR.</w:t>
       </w:r>
     </w:p>
     <w:p>
@@ -14899,7 +14899,7 @@
         <w:rPr>
           <w:lang w:val="pt_PT" w:bidi="pt_PT"/>
         </w:rPr>
-        <w:t xml:space="preserve"> O SENHOR disse: "Duas nações se formarão dentro de você. Uma será mais poderosa que a outra, e o primogênito servirá ao caçula".</w:t>
+        <w:t xml:space="preserve"> O SENHOR disse: “Duas nações se formarão dentro de você. Uma será mais poderosa que a outra, e o primogênito servirá ao caçula”.</w:t>
       </w:r>
     </w:p>
     <w:p>
@@ -15046,7 +15046,7 @@
         <w:rPr>
           <w:lang w:val="pt_PT" w:bidi="pt_PT"/>
         </w:rPr>
-        <w:t xml:space="preserve"> Esaú disse a Jacó: "Deixe-me comer desse ensopado vermelho, pois estou exausto". Por isso também ficou conhecido como Edom.</w:t>
+        <w:t xml:space="preserve"> Esaú disse a Jacó: “Deixe-me comer desse ensopado vermelho, pois estou exausto”. Por isso também ficou conhecido como Edom.</w:t>
       </w:r>
     </w:p>
     <w:p>
@@ -15067,7 +15067,7 @@
         <w:rPr>
           <w:lang w:val="pt_PT" w:bidi="pt_PT"/>
         </w:rPr>
-        <w:t xml:space="preserve"> Jacó respondeu: "Sim, mas venda-me primeiro o seu direito de primogenitura".</w:t>
+        <w:t xml:space="preserve"> Jacó respondeu: “Sim, mas venda-me primeiro o seu direito de primogenitura”.</w:t>
       </w:r>
     </w:p>
     <w:p>
@@ -15088,7 +15088,7 @@
         <w:rPr>
           <w:lang w:val="pt_PT" w:bidi="pt_PT"/>
         </w:rPr>
-        <w:t xml:space="preserve"> Esaú comentou: "Estou prestes a morrer de fome; de que me serve a primogenitura?".</w:t>
+        <w:t xml:space="preserve"> Esaú comentou: “Estou prestes a morrer de fome; de que me serve a primogenitura?”.</w:t>
       </w:r>
     </w:p>
     <w:p>
@@ -15109,7 +15109,7 @@
         <w:rPr>
           <w:lang w:val="pt_PT" w:bidi="pt_PT"/>
         </w:rPr>
-        <w:t xml:space="preserve"> Em seguida, Jacó falou: "Primeiro faça um juramento". Então Esaú jurou, entregando a Jacó o direito de primogenitura.</w:t>
+        <w:t xml:space="preserve"> Em seguida, Jacó falou: “Primeiro faça um juramento”. Então Esaú jurou, entregando a Jacó o direito de primogenitura.</w:t>
       </w:r>
     </w:p>
     <w:p>
@@ -15188,7 +15188,7 @@
         <w:rPr>
           <w:lang w:val="pt_PT" w:bidi="pt_PT"/>
         </w:rPr>
-        <w:t xml:space="preserve"> O SENHOR apareceu a Isaque e disse: "Não desça ao Egito. Fique na terra que eu lhe indicar.</w:t>
+        <w:t xml:space="preserve"> O SENHOR apareceu a Isaque e disse: “Não desça ao Egito. Fique na terra que eu lhe indicar.</w:t>
       </w:r>
     </w:p>
     <w:p>
@@ -15251,7 +15251,7 @@
         <w:rPr>
           <w:lang w:val="pt_PT" w:bidi="pt_PT"/>
         </w:rPr>
-        <w:t xml:space="preserve"> Farei isso porque Abraão obedeceu à minha voz e guardou os meus mandamentos, os meus estatutos e as minhas instruções".</w:t>
+        <w:t xml:space="preserve"> Farei isso porque Abraão obedeceu à minha voz e guardou os meus mandamentos, os meus estatutos e as minhas instruções”.</w:t>
       </w:r>
     </w:p>
     <w:p>
@@ -15293,7 +15293,7 @@
         <w:rPr>
           <w:lang w:val="pt_PT" w:bidi="pt_PT"/>
         </w:rPr>
-        <w:t xml:space="preserve"> Quando os homens daquele lugar perguntaram sobre sua esposa, ele respondeu: "Ela é minha irmã". Isaque temia declarar que era sua mulher, pois pensava: "Os homens daqui podem me matar por causa de Rebeca, já que ela é muito formosa".</w:t>
+        <w:t xml:space="preserve"> Quando os homens daquele lugar perguntaram sobre sua esposa, ele respondeu: “Ela é minha irmã”. Isaque temia declarar que era sua mulher, pois pensava: “Os homens daqui podem me matar por causa de Rebeca, já que ela é muito formosa”.</w:t>
       </w:r>
     </w:p>
     <w:p>
@@ -15335,7 +15335,7 @@
         <w:rPr>
           <w:lang w:val="pt_PT" w:bidi="pt_PT"/>
         </w:rPr>
-        <w:t xml:space="preserve"> Então Abimeleque mandou chamar Isaque e disse: "É evidente que ela é sua esposa! Por que você afirmou que era sua irmã?". Isaque respondeu: "Tive medo. Imaginei que alguém poderia me matar para ficar com ela".</w:t>
+        <w:t xml:space="preserve"> Então Abimeleque mandou chamar Isaque e disse: “É evidente que ela é sua esposa! Por que você afirmou que era sua irmã?”. Isaque respondeu: “Tive medo. Imaginei que alguém poderia me matar para ficar com ela”.</w:t>
       </w:r>
     </w:p>
     <w:p>
@@ -15356,7 +15356,7 @@
         <w:rPr>
           <w:lang w:val="pt_PT" w:bidi="pt_PT"/>
         </w:rPr>
-        <w:t xml:space="preserve"> Abimeleque disse: "Como você pôde agir assim contra nós? Um de nossos homens poderia ter-se deitado com sua esposa, e você teria trazido sobre nós culpa e condenação".</w:t>
+        <w:t xml:space="preserve"> Abimeleque disse: “Como você pôde agir assim contra nós? Um de nossos homens poderia ter-se deitado com sua esposa, e você teria trazido sobre nós culpa e condenação”.</w:t>
       </w:r>
     </w:p>
     <w:p>
@@ -15377,7 +15377,7 @@
         <w:rPr>
           <w:lang w:val="pt_PT" w:bidi="pt_PT"/>
         </w:rPr>
-        <w:t xml:space="preserve"> Então o rei ordenou ao povo: "Quem tocar neste homem ou em sua esposa será condenado à morte".</w:t>
+        <w:t xml:space="preserve"> Então o rei ordenou ao povo: “Quem tocar neste homem ou em sua esposa será condenado à morte”.</w:t>
       </w:r>
     </w:p>
     <w:p>
@@ -15566,7 +15566,7 @@
         <w:rPr>
           <w:lang w:val="pt_PT" w:bidi="pt_PT"/>
         </w:rPr>
-        <w:t xml:space="preserve"> Mas os pastores de Gerar entraram em conflito com os pastores de Isaque, dizendo: "Esta água nos pertence!". Por isso, Isaque deu ao poço o nome de Eseque, porque houve disputa por causa dele.</w:t>
+        <w:t xml:space="preserve"> Mas os pastores de Gerar entraram em conflito com os pastores de Isaque, dizendo: “Esta água nos pertence!”. Por isso, Isaque deu ao poço o nome de Eseque, porque houve disputa por causa dele.</w:t>
       </w:r>
     </w:p>
     <w:p>
@@ -15608,7 +15608,7 @@
         <w:rPr>
           <w:lang w:val="pt_PT" w:bidi="pt_PT"/>
         </w:rPr>
-        <w:t xml:space="preserve"> Isaque deixou aquele lugar e mandou cavar outro poço. Como não houve disputa por causa dele, chamou-o de Reobote e declarou: "Agora o SENHOR nos concedeu espaço, e prosperaremos nesta terra".</w:t>
+        <w:t xml:space="preserve"> Isaque deixou aquele lugar e mandou cavar outro poço. Como não houve disputa por causa dele, chamou-o de Reobote e declarou: “Agora o SENHOR nos concedeu espaço, e prosperaremos nesta terra”.</w:t>
       </w:r>
     </w:p>
     <w:p>
@@ -15650,7 +15650,7 @@
         <w:rPr>
           <w:lang w:val="pt_PT" w:bidi="pt_PT"/>
         </w:rPr>
-        <w:t xml:space="preserve"> Naquela noite, o SENHOR apareceu a Isaque e disse: "Eu sou o Deus de seu pai Abraão. Não tenha medo, pois estou com você; eu o abençoarei e multiplicarei sua descendência, por causa do meu servo Abraão".</w:t>
+        <w:t xml:space="preserve"> Naquela noite, o SENHOR apareceu a Isaque e disse: “Eu sou o Deus de seu pai Abraão. Não tenha medo, pois estou com você; eu o abençoarei e multiplicarei sua descendência, por causa do meu servo Abraão”.</w:t>
       </w:r>
     </w:p>
     <w:p>
@@ -15713,7 +15713,7 @@
         <w:rPr>
           <w:lang w:val="pt_PT" w:bidi="pt_PT"/>
         </w:rPr>
-        <w:t xml:space="preserve"> Isaque lhes perguntou: "Por que vieram até mim, se foram hostis contra mim e me expulsaram?".</w:t>
+        <w:t xml:space="preserve"> Isaque lhes perguntou: “Por que vieram até mim, se foram hostis contra mim e me expulsaram?”.</w:t>
       </w:r>
     </w:p>
     <w:p>
@@ -15734,7 +15734,7 @@
         <w:rPr>
           <w:lang w:val="pt_PT" w:bidi="pt_PT"/>
         </w:rPr>
-        <w:t xml:space="preserve"> Disseram: "Percebemos que o SENHOR está ao seu lado. Por isso queremos firmar um acordo com você.</w:t>
+        <w:t xml:space="preserve"> Disseram: “Percebemos que o SENHOR está ao seu lado. Por isso queremos firmar um acordo com você.</w:t>
       </w:r>
     </w:p>
     <w:p>
@@ -15755,7 +15755,7 @@
         <w:rPr>
           <w:lang w:val="pt_PT" w:bidi="pt_PT"/>
         </w:rPr>
-        <w:t xml:space="preserve"> Vamos fazer um juramento entre nós e estabelecer uma aliança. Você não nos fará mal, assim como nós também não lhe fizemos mal. Pelo contrário, tratamos você com bondade e o despedimos em paz. Agora reconhecemos que o SENHOR tem abençoado você".</w:t>
+        <w:t xml:space="preserve"> Vamos fazer um juramento entre nós e estabelecer uma aliança. Você não nos fará mal, assim como nós também não lhe fizemos mal. Pelo contrário, tratamos você com bondade e o despedimos em paz. Agora reconhecemos que o SENHOR tem abençoado você”.</w:t>
       </w:r>
     </w:p>
     <w:p>
@@ -15818,7 +15818,7 @@
         <w:rPr>
           <w:lang w:val="pt_PT" w:bidi="pt_PT"/>
         </w:rPr>
-        <w:t xml:space="preserve"> Naquele mesmo dia, os servos de Isaque vieram falar com ele sobre o poço que haviam cavado e disseram: "Encontramos água!".</w:t>
+        <w:t xml:space="preserve"> Naquele mesmo dia, os servos de Isaque vieram falar com ele sobre o poço que haviam cavado e disseram: “Encontramos água!”.</w:t>
       </w:r>
     </w:p>
     <w:p>
@@ -15981,7 +15981,7 @@
         <w:rPr>
           <w:lang w:val="pt_PT" w:bidi="pt_PT"/>
         </w:rPr>
-        <w:t xml:space="preserve"> Prepare uma refeição saborosa, do jeito que gosto, e a traga para que eu coma e lhe dê a bênção antes da minha morte".</w:t>
+        <w:t xml:space="preserve"> Prepare uma refeição saborosa, do jeito que gosto, e a traga para que eu coma e lhe dê a bênção antes da minha morte”.</w:t>
       </w:r>
     </w:p>
     <w:p>
@@ -16044,7 +16044,7 @@
         <w:rPr>
           <w:lang w:val="pt_PT" w:bidi="pt_PT"/>
         </w:rPr>
-        <w:t xml:space="preserve"> 'Traga-me uma caça e prepare uma refeição saborosa, para que eu a coma e lhe dê a bênção diante do SENHOR antes que eu morra'.</w:t>
+        <w:t xml:space="preserve"> 'Traga-me uma caça e prepare uma refeição saborosa, para que eu a coma e lhe dê a bênção diante do SENHOR antes que eu morra’.</w:t>
       </w:r>
     </w:p>
     <w:p>
@@ -16107,7 +16107,7 @@
         <w:rPr>
           <w:lang w:val="pt_PT" w:bidi="pt_PT"/>
         </w:rPr>
-        <w:t xml:space="preserve"> Leve-a ao seu pai, para que ele coma e lhe conceda a bênção antes que morra".</w:t>
+        <w:t xml:space="preserve"> Leve-a ao seu pai, para que ele coma e lhe conceda a bênção antes que morra”.</w:t>
       </w:r>
     </w:p>
     <w:p>
@@ -16149,7 +16149,7 @@
         <w:rPr>
           <w:lang w:val="pt_PT" w:bidi="pt_PT"/>
         </w:rPr>
-        <w:t xml:space="preserve"> E se meu pai me apalpar e notar que estou enganando? Vou parecer um trapaceiro e, no lugar da bênção, vou acabar amaldiçoado".</w:t>
+        <w:t xml:space="preserve"> E se meu pai me apalpar e notar que estou enganando? Vou parecer um trapaceiro e, no lugar da bênção, vou acabar amaldiçoado”.</w:t>
       </w:r>
     </w:p>
     <w:p>
@@ -16170,7 +16170,7 @@
         <w:rPr>
           <w:lang w:val="pt_PT" w:bidi="pt_PT"/>
         </w:rPr>
-        <w:t xml:space="preserve"> A mãe respondeu: "Se houver maldição, que recaia sobre mim, meu filho! Apenas obedeça ao que eu digo. Vá e traga os cabritos para mim".</w:t>
+        <w:t xml:space="preserve"> A mãe respondeu: “Se houver maldição, que recaia sobre mim, meu filho! Apenas obedeça ao que eu digo. Vá e traga os cabritos para mim”.</w:t>
       </w:r>
     </w:p>
     <w:p>
@@ -16275,7 +16275,7 @@
         <w:rPr>
           <w:lang w:val="pt_PT" w:bidi="pt_PT"/>
         </w:rPr>
-        <w:t xml:space="preserve"> Jacó foi até seu pai e disse: "Pai!". Isaque respondeu: "Aqui estou, meu filho. Mas quem é você, Esaú ou Jacó?".</w:t>
+        <w:t xml:space="preserve"> Jacó foi até seu pai e disse: “Pai!”. Isaque respondeu: “Aqui estou, meu filho. Mas quem é você, Esaú ou Jacó?”.</w:t>
       </w:r>
     </w:p>
     <w:p>
@@ -16359,7 +16359,7 @@
         <w:rPr>
           <w:lang w:val="pt_PT" w:bidi="pt_PT"/>
         </w:rPr>
-        <w:t xml:space="preserve"> Jacó aproximou-se de seu pai Isaque, que o tocou e disse: "A voz soa como a de Jacó, porém as mãos parecem as de Esaú".</w:t>
+        <w:t xml:space="preserve"> Jacó aproximou-se de seu pai Isaque, que o tocou e disse: “A voz soa como a de Jacó, porém as mãos parecem as de Esaú”.</w:t>
       </w:r>
     </w:p>
     <w:p>
@@ -16401,7 +16401,7 @@
         <w:rPr>
           <w:lang w:val="pt_PT" w:bidi="pt_PT"/>
         </w:rPr>
-        <w:t xml:space="preserve"> E Isaque tornou a perguntar: “Você é de fato meu filho Esaú?”. Jacó respondeu: “Sim, sou eu".</w:t>
+        <w:t xml:space="preserve"> E Isaque tornou a perguntar: “Você é de fato meu filho Esaú?”. Jacó respondeu: “Sim, sou eu”.</w:t>
       </w:r>
     </w:p>
     <w:p>
@@ -16464,7 +16464,7 @@
         <w:rPr>
           <w:lang w:val="pt_PT" w:bidi="pt_PT"/>
         </w:rPr>
-        <w:t xml:space="preserve"> Jacó se aproximou, beijou o pai, e Isaque, ao sentir o cheiro das roupas, declarou: "O aroma do meu filho é como o de um campo cheio da bênção do SENHOR.</w:t>
+        <w:t xml:space="preserve"> Jacó se aproximou, beijou o pai, e Isaque, ao sentir o cheiro das roupas, declarou: “O aroma do meu filho é como o de um campo cheio da bênção do SENHOR.</w:t>
       </w:r>
     </w:p>
     <w:p>
@@ -16506,7 +16506,7 @@
         <w:rPr>
           <w:lang w:val="pt_PT" w:bidi="pt_PT"/>
         </w:rPr>
-        <w:t xml:space="preserve"> Que os povos se coloquem sob sua autoridade, e que você seja estimado entre eles. Seja chefe sobre seus irmãos, e que os filhos de sua mãe se inclinem diante de você. Maldito seja quem o amaldiçoar, e abençoado seja quem o abençoar".</w:t>
+        <w:t xml:space="preserve"> Que os povos se coloquem sob sua autoridade, e que você seja estimado entre eles. Seja chefe sobre seus irmãos, e que os filhos de sua mãe se inclinem diante de você. Maldito seja quem o amaldiçoar, e abençoado seja quem o abençoar”.</w:t>
       </w:r>
     </w:p>
     <w:p>
@@ -16590,7 +16590,7 @@
         <w:rPr>
           <w:lang w:val="pt_PT" w:bidi="pt_PT"/>
         </w:rPr>
-        <w:t xml:space="preserve"> Isaque estremeceu intensamente e disse: “Então quem foi que me trouxe a caça? Eu já comi antes de você chegar, e a ele dei a bênção, e essa bênção não pode ser revogada".</w:t>
+        <w:t xml:space="preserve"> Isaque estremeceu intensamente e disse: “Então quem foi que me trouxe a caça? Eu já comi antes de você chegar, e a ele dei a bênção, e essa bênção não pode ser revogada”.</w:t>
       </w:r>
     </w:p>
     <w:p>
@@ -16716,7 +16716,7 @@
         <w:rPr>
           <w:lang w:val="pt_PT" w:bidi="pt_PT"/>
         </w:rPr>
-        <w:t xml:space="preserve"> Então Isaque respondeu: "Sua morada será longe das terras férteis, sem o orvalho que vem do céu.</w:t>
+        <w:t xml:space="preserve"> Então Isaque respondeu: “Sua morada será longe das terras férteis, sem o orvalho que vem do céu.</w:t>
       </w:r>
     </w:p>
     <w:p>
@@ -16737,7 +16737,7 @@
         <w:rPr>
           <w:lang w:val="pt_PT" w:bidi="pt_PT"/>
         </w:rPr>
-        <w:t xml:space="preserve"> Você viverá pela sua espada e servirá ao seu irmão. Mas chegará o tempo em que romperá esse jugo e se libertará".</w:t>
+        <w:t xml:space="preserve"> Você viverá pela sua espada e servirá ao seu irmão. Mas chegará o tempo em que romperá esse jugo e se libertará”.</w:t>
       </w:r>
     </w:p>
     <w:p>
@@ -16842,7 +16842,7 @@
         <w:rPr>
           <w:lang w:val="pt_PT" w:bidi="pt_PT"/>
         </w:rPr>
-        <w:t xml:space="preserve"> Quando a raiva dele passar e Esaú esquecer o que você fez, eu mandarei chamá‑lo de volta. Afinal, não quero perder meus dois filhos no mesmo dia".</w:t>
+        <w:t xml:space="preserve"> Quando a raiva dele passar e Esaú esquecer o que você fez, eu mandarei chamá‑lo de volta. Afinal, não quero perder meus dois filhos no mesmo dia”.</w:t>
       </w:r>
     </w:p>
     <w:p>
@@ -16863,7 +16863,7 @@
         <w:rPr>
           <w:lang w:val="pt_PT" w:bidi="pt_PT"/>
         </w:rPr>
-        <w:t xml:space="preserve"> Rebeca disse a Isaque: "Estou desgostosa da vida com as mulheres hititas que temos como noras. Se Jacó também se casar com uma delas, que sentido terá para mim continuar a viver?".</w:t>
+        <w:t xml:space="preserve"> Rebeca disse a Isaque: “Estou desgostosa da vida com as mulheres hititas que temos como noras. Se Jacó também se casar com uma delas, que sentido terá para mim continuar a viver?”.</w:t>
       </w:r>
     </w:p>
     <w:p>
@@ -16963,7 +16963,7 @@
         <w:rPr>
           <w:lang w:val="pt_PT" w:bidi="pt_PT"/>
         </w:rPr>
-        <w:t xml:space="preserve"> Que ele conceda a você e à sua descendência as bênçãos prometidas a Abraão, para que você e seus filhos possuam esta terra onde agora habitamos como estrangeiros, a terra que Deus entregou a Abraão".</w:t>
+        <w:t xml:space="preserve"> Que ele conceda a você e à sua descendência as bênçãos prometidas a Abraão, para que você e seus filhos possuam esta terra onde agora habitamos como estrangeiros, a terra que Deus entregou a Abraão”.</w:t>
       </w:r>
     </w:p>
     <w:p>
@@ -17152,7 +17152,7 @@
         <w:rPr>
           <w:lang w:val="pt_PT" w:bidi="pt_PT"/>
         </w:rPr>
-        <w:t xml:space="preserve"> De repente, o SENHOR apareceu ao lado dele e disse: "Eu sou o SENHOR, Deus de Abraão e de seu pai Isaque. Entrego a você e à sua descendência a terra onde agora você repousa.</w:t>
+        <w:t xml:space="preserve"> De repente, o SENHOR apareceu ao lado dele e disse: “Eu sou o SENHOR, Deus de Abraão e de seu pai Isaque. Entrego a você e à sua descendência a terra onde agora você repousa.</w:t>
       </w:r>
     </w:p>
     <w:p>
@@ -17194,7 +17194,7 @@
         <w:rPr>
           <w:lang w:val="pt_PT" w:bidi="pt_PT"/>
         </w:rPr>
-        <w:t xml:space="preserve"> Eu estarei ao seu lado e vou protegê-lo em todos os caminhos. Vou garantir que você volte para esta terra e não vou deixá-lo até realizar tudo o que prometi".</w:t>
+        <w:t xml:space="preserve"> Eu estarei ao seu lado e vou protegê-lo em todos os caminhos. Vou garantir que você volte para esta terra e não vou deixá-lo até realizar tudo o que prometi”.</w:t>
       </w:r>
     </w:p>
     <w:p>
@@ -17215,7 +17215,7 @@
         <w:rPr>
           <w:lang w:val="pt_PT" w:bidi="pt_PT"/>
         </w:rPr>
-        <w:t xml:space="preserve"> Jacó despertou e exclamou: "Certamente o SENHOR está neste lugar, e eu não havia percebido!".</w:t>
+        <w:t xml:space="preserve"> Jacó despertou e exclamou: “Certamente o SENHOR está neste lugar, e eu não havia percebido!”.</w:t>
       </w:r>
     </w:p>
     <w:p>
@@ -17299,7 +17299,7 @@
         <w:rPr>
           <w:lang w:val="pt_PT" w:bidi="pt_PT"/>
         </w:rPr>
-        <w:t xml:space="preserve"> Então, fez um voto: "Se Deus estiver comigo, me guardar nesta viagem e me sustentar com alimento e roupas;</w:t>
+        <w:t xml:space="preserve"> Então, fez um voto: “Se Deus estiver comigo, me guardar nesta viagem e me sustentar com alimento e roupas;</w:t>
       </w:r>
     </w:p>
     <w:p>
@@ -17341,7 +17341,7 @@
         <w:rPr>
           <w:lang w:val="pt_PT" w:bidi="pt_PT"/>
         </w:rPr>
-        <w:t xml:space="preserve"> Esta pedra que ergui como coluna será para mim a Casa de Deus, um lugar sagrado. E de tudo o que me der, eu lhe darei a décima parte".</w:t>
+        <w:t xml:space="preserve"> Esta pedra que ergui como coluna será para mim a Casa de Deus, um lugar sagrado. E de tudo o que me der, eu lhe darei a décima parte”.</w:t>
       </w:r>
     </w:p>
     <w:p>
@@ -17441,7 +17441,7 @@
         <w:rPr>
           <w:lang w:val="pt_PT" w:bidi="pt_PT"/>
         </w:rPr>
-        <w:t xml:space="preserve"> Jacó aproximou-se dos pastores e perguntou: "Companheiros, de onde são vocês?". Eles disseram: "Somos de Harã".</w:t>
+        <w:t xml:space="preserve"> Jacó aproximou-se dos pastores e perguntou: “Companheiros, de onde são vocês?”. Eles disseram: “Somos de Harã”.</w:t>
       </w:r>
     </w:p>
     <w:p>
@@ -17483,7 +17483,7 @@
         <w:rPr>
           <w:lang w:val="pt_PT" w:bidi="pt_PT"/>
         </w:rPr>
-        <w:t xml:space="preserve"> Jacó continuou: "Ele está bem?". Eles disseram: "Está sim. Veja, ali vem Raquel, a filha dele, trazendo as ovelhas".</w:t>
+        <w:t xml:space="preserve"> Jacó continuou: “Ele está bem?”. Eles disseram: “Está sim. Veja, ali vem Raquel, a filha dele, trazendo as ovelhas”.</w:t>
       </w:r>
     </w:p>
     <w:p>
@@ -17504,7 +17504,7 @@
         <w:rPr>
           <w:lang w:val="pt_PT" w:bidi="pt_PT"/>
         </w:rPr>
-        <w:t xml:space="preserve"> Então Jacó disse: "O dia ainda está claro, cedo demais para recolher os rebanhos. Deem água às ovelhas e levem-nas de volta ao campo".</w:t>
+        <w:t xml:space="preserve"> Então Jacó disse: “O dia ainda está claro, cedo demais para recolher os rebanhos. Deem água às ovelhas e levem-nas de volta ao campo”.</w:t>
       </w:r>
     </w:p>
     <w:p>
@@ -17525,7 +17525,7 @@
         <w:rPr>
           <w:lang w:val="pt_PT" w:bidi="pt_PT"/>
         </w:rPr>
-        <w:t xml:space="preserve"> Eles responderam: "Não podemos. Precisamos esperar que os rebanhos se juntem e que a pedra seja removida da entrada do poço; então daremos de beber às ovelhas".</w:t>
+        <w:t xml:space="preserve"> Eles responderam: “Não podemos. Precisamos esperar que os rebanhos se juntem e que a pedra seja removida da entrada do poço; então daremos de beber às ovelhas”.</w:t>
       </w:r>
     </w:p>
     <w:p>
@@ -17651,7 +17651,7 @@
         <w:rPr>
           <w:lang w:val="pt_PT" w:bidi="pt_PT"/>
         </w:rPr>
-        <w:t xml:space="preserve"> Então Labão disse a Jacó: "Você é de fato da minha carne e do meu sangue!". Jacó permaneceu um mês na casa de Labão.</w:t>
+        <w:t xml:space="preserve"> Então Labão disse a Jacó: “Você é de fato da minha carne e do meu sangue!”. Jacó permaneceu um mês na casa de Labão.</w:t>
       </w:r>
     </w:p>
     <w:p>
@@ -17672,7 +17672,7 @@
         <w:rPr>
           <w:lang w:val="pt_PT" w:bidi="pt_PT"/>
         </w:rPr>
-        <w:t xml:space="preserve"> Depois, Labão lhe disse: "Não é só por ser meu parente que você vai trabalhar sem pagamento. Diga-me, qual salário deseja receber?".</w:t>
+        <w:t xml:space="preserve"> Depois, Labão lhe disse: “Não é só por ser meu parente que você vai trabalhar sem pagamento. Diga-me, qual salário deseja receber?”.</w:t>
       </w:r>
     </w:p>
     <w:p>
@@ -17735,7 +17735,7 @@
         <w:rPr>
           <w:lang w:val="pt_PT" w:bidi="pt_PT"/>
         </w:rPr>
-        <w:t xml:space="preserve"> Jacó se afeiçoou a Raquel e declarou: "Prestarei trabalho por sete anos, para que eu possa tomar como esposa Raquel, sua filha mais nova".</w:t>
+        <w:t xml:space="preserve"> Jacó se afeiçoou a Raquel e declarou: “Prestarei trabalho por sete anos, para que eu possa tomar como esposa Raquel, sua filha mais nova”.</w:t>
       </w:r>
     </w:p>
     <w:p>
@@ -17756,7 +17756,7 @@
         <w:rPr>
           <w:lang w:val="pt_PT" w:bidi="pt_PT"/>
         </w:rPr>
-        <w:t xml:space="preserve"> Labão respondeu: "É melhor entregá-la a você do que a um homem desconhecido. Continue comigo".</w:t>
+        <w:t xml:space="preserve"> Labão respondeu: “É melhor entregá-la a você do que a um homem desconhecido. Continue comigo”.</w:t>
       </w:r>
     </w:p>
     <w:p>
@@ -17798,7 +17798,7 @@
         <w:rPr>
           <w:lang w:val="pt_PT" w:bidi="pt_PT"/>
         </w:rPr>
-        <w:t xml:space="preserve"> Passados os sete anos, Jacó falou a Labão: "Dê-me minha mulher, já que o tempo combinado se cumpriu, para que eu possa me unir a ela".</w:t>
+        <w:t xml:space="preserve"> Passados os sete anos, Jacó falou a Labão: “Dê-me minha mulher, já que o tempo combinado se cumpriu, para que eu possa me unir a ela”.</w:t>
       </w:r>
     </w:p>
     <w:p>
@@ -17882,7 +17882,7 @@
         <w:rPr>
           <w:lang w:val="pt_PT" w:bidi="pt_PT"/>
         </w:rPr>
-        <w:t xml:space="preserve"> Quando amanheceu, Jacó percebeu que havia se deitado com Lia, e não com Raquel. Então disse a Labão: "Por que o senhor agiu assim comigo? Não foi por Raquel que trabalhei? Por que me enganou?".</w:t>
+        <w:t xml:space="preserve"> Quando amanheceu, Jacó percebeu que havia se deitado com Lia, e não com Raquel. Então disse a Labão: “Por que o senhor agiu assim comigo? Não foi por Raquel que trabalhei? Por que me enganou?”.</w:t>
       </w:r>
     </w:p>
     <w:p>
@@ -17903,7 +17903,7 @@
         <w:rPr>
           <w:lang w:val="pt_PT" w:bidi="pt_PT"/>
         </w:rPr>
-        <w:t xml:space="preserve"> Labão respondeu: "Não é tradição nesta terra casar a filha mais nova antes da mais velha.</w:t>
+        <w:t xml:space="preserve"> Labão respondeu: “Não é tradição nesta terra casar a filha mais nova antes da mais velha.</w:t>
       </w:r>
     </w:p>
     <w:p>
@@ -17924,7 +17924,7 @@
         <w:rPr>
           <w:lang w:val="pt_PT" w:bidi="pt_PT"/>
         </w:rPr>
-        <w:t xml:space="preserve"> Complete primeiro esta semana de núpcias, e depois lhe entregaremos a filha mais jovem, mediante mais sete anos de trabalho".</w:t>
+        <w:t xml:space="preserve"> Complete primeiro esta semana de núpcias, e depois lhe entregaremos a filha mais jovem, mediante mais sete anos de trabalho”.</w:t>
       </w:r>
     </w:p>
     <w:p>
@@ -18029,7 +18029,7 @@
         <w:rPr>
           <w:lang w:val="pt_PT" w:bidi="pt_PT"/>
         </w:rPr>
-        <w:t xml:space="preserve"> Lia engravidou e deu à luz um menino, a quem chamou Rúben, dizendo: "O SENHOR viu a minha aflição; agora meu marido me amará".</w:t>
+        <w:t xml:space="preserve"> Lia engravidou e deu à luz um menino, a quem chamou Rúben, dizendo: “O SENHOR viu a minha aflição; agora meu marido me amará”.</w:t>
       </w:r>
     </w:p>
     <w:p>
@@ -18050,7 +18050,7 @@
         <w:rPr>
           <w:lang w:val="pt_PT" w:bidi="pt_PT"/>
         </w:rPr>
-        <w:t xml:space="preserve"> Lia tornou a conceber e, ao dar à luz, disse: "O SENHOR ouviu que eu era rejeitada e me presenteou com este filho". Por essa razão, chamou-o Simeão.</w:t>
+        <w:t xml:space="preserve"> Lia tornou a conceber e, ao dar à luz, disse: “O SENHOR ouviu que eu era rejeitada e me presenteou com este filho”. Por essa razão, chamou-o Simeão.</w:t>
       </w:r>
     </w:p>
     <w:p>
@@ -18071,7 +18071,7 @@
         <w:rPr>
           <w:lang w:val="pt_PT" w:bidi="pt_PT"/>
         </w:rPr>
-        <w:t xml:space="preserve"> Lia engravidou mais uma vez e, quando nasceu o terceiro menino, declarou: "Desta vez meu marido se apegará a mim, pois já lhe dei três filhos". Por isso, chamou-o Levi.</w:t>
+        <w:t xml:space="preserve"> Lia engravidou mais uma vez e, quando nasceu o terceiro menino, declarou: “Desta vez meu marido se apegará a mim, pois já lhe dei três filhos”. Por isso, chamou-o Levi.</w:t>
       </w:r>
     </w:p>
     <w:p>
@@ -18092,7 +18092,7 @@
         <w:rPr>
           <w:lang w:val="pt_PT" w:bidi="pt_PT"/>
         </w:rPr>
-        <w:t xml:space="preserve"> Lia engravidou ainda outra vez e, ao dar à luz um filho, disse: "Agora louvarei o SENHOR". Por isso chamou-o Judá. Então, deixou de ter filhos.</w:t>
+        <w:t xml:space="preserve"> Lia engravidou ainda outra vez e, ao dar à luz um filho, disse: “Agora louvarei o SENHOR”. Por isso chamou-o Judá. Então, deixou de ter filhos.</w:t>
       </w:r>
     </w:p>
     <w:p>
@@ -18129,7 +18129,7 @@
         <w:rPr>
           <w:lang w:val="pt_PT" w:bidi="pt_PT"/>
         </w:rPr>
-        <w:t xml:space="preserve"> Quando Raquel viu que não conseguia dar filhos a Jacó, ficou com inveja da irmã e disse a ele: "Dá-me filhos, ou morrerei!".</w:t>
+        <w:t xml:space="preserve"> Quando Raquel viu que não conseguia dar filhos a Jacó, ficou com inveja da irmã e disse a ele: “Dá-me filhos, ou morrerei!”.</w:t>
       </w:r>
     </w:p>
     <w:p>
@@ -18150,7 +18150,7 @@
         <w:rPr>
           <w:lang w:val="pt_PT" w:bidi="pt_PT"/>
         </w:rPr>
-        <w:t xml:space="preserve"> Jacó se irritou e perguntou: "Acaso estou na posição de Deus, que impediu que você tivesse filhos?".</w:t>
+        <w:t xml:space="preserve"> Jacó se irritou e perguntou: “Acaso estou na posição de Deus, que impediu que você tivesse filhos?”.</w:t>
       </w:r>
     </w:p>
     <w:p>
@@ -18171,7 +18171,7 @@
         <w:rPr>
           <w:lang w:val="pt_PT" w:bidi="pt_PT"/>
         </w:rPr>
-        <w:t xml:space="preserve"> Então Raquel respondeu: "Tome minha serva Bila. Deite-se com ela, e que nasçam filhos dela. Eu os receberei como se fossem meus".</w:t>
+        <w:t xml:space="preserve"> Então Raquel respondeu: “Tome minha serva Bila. Deite-se com ela, e que nasçam filhos dela. Eu os receberei como se fossem meus”.</w:t>
       </w:r>
     </w:p>
     <w:p>
@@ -18234,7 +18234,7 @@
         <w:rPr>
           <w:lang w:val="pt_PT" w:bidi="pt_PT"/>
         </w:rPr>
-        <w:t xml:space="preserve"> Raquel afirmou: "Deus julgou minha causa, escutou meu clamor e concedeu-me um filho". E ela lhe deu o nome de Dã.</w:t>
+        <w:t xml:space="preserve"> Raquel afirmou: “Deus julgou minha causa, escutou meu clamor e concedeu-me um filho”. E ela lhe deu o nome de Dã.</w:t>
       </w:r>
     </w:p>
     <w:p>
@@ -18276,7 +18276,7 @@
         <w:rPr>
           <w:lang w:val="pt_PT" w:bidi="pt_PT"/>
         </w:rPr>
-        <w:t xml:space="preserve"> Então Raquel declarou: "Minha luta contra minha irmã foi intensa, mas saí vencedora". Por isso chamou o menino de Naftali.</w:t>
+        <w:t xml:space="preserve"> Então Raquel declarou: “Minha luta contra minha irmã foi intensa, mas saí vencedora”. Por isso chamou o menino de Naftali.</w:t>
       </w:r>
     </w:p>
     <w:p>
@@ -18339,7 +18339,7 @@
         <w:rPr>
           <w:lang w:val="pt_PT" w:bidi="pt_PT"/>
         </w:rPr>
-        <w:t xml:space="preserve"> Lia exclamou: "Sou afortunada!". E deu ao menino o nome de Gade.</w:t>
+        <w:t xml:space="preserve"> Lia exclamou: “Sou afortunada!”. E deu ao menino o nome de Gade.</w:t>
       </w:r>
     </w:p>
     <w:p>
@@ -18381,7 +18381,7 @@
         <w:rPr>
           <w:lang w:val="pt_PT" w:bidi="pt_PT"/>
         </w:rPr>
-        <w:t xml:space="preserve"> Então Lia exclamou: "Que felicidade a minha! As demais mulheres reconhecerão que sou feliz". E chamou o menino de Aser.</w:t>
+        <w:t xml:space="preserve"> Então Lia exclamou: “Que felicidade a minha! As demais mulheres reconhecerão que sou feliz”. E chamou o menino de Aser.</w:t>
       </w:r>
     </w:p>
     <w:p>
@@ -18402,7 +18402,7 @@
         <w:rPr>
           <w:lang w:val="pt_PT" w:bidi="pt_PT"/>
         </w:rPr>
-        <w:t xml:space="preserve"> Era tempo de colher trigo. Rúben encontrou mandrágoras no campo e levou-as para sua mãe Lia. Então Raquel disse a Lia: "Quero algumas das mandrágoras que seu filho trouxe".</w:t>
+        <w:t xml:space="preserve"> Era tempo de colher trigo. Rúben encontrou mandrágoras no campo e levou-as para sua mãe Lia. Então Raquel disse a Lia: “Quero algumas das mandrágoras que seu filho trouxe”.</w:t>
       </w:r>
     </w:p>
     <w:p>
@@ -18423,7 +18423,7 @@
         <w:rPr>
           <w:lang w:val="pt_PT" w:bidi="pt_PT"/>
         </w:rPr>
-        <w:t xml:space="preserve"> Lia perguntou: "Já não basta tomar meu marido? Agora também quer as mandrágoras do meu filho?". Então Raquel disse: "Nesta noite deixarei que Jacó durma com você, em troca das mandrágoras do seu filho".</w:t>
+        <w:t xml:space="preserve"> Lia perguntou: “Já não basta tomar meu marido? Agora também quer as mandrágoras do meu filho?”. Então Raquel disse: “Nesta noite deixarei que Jacó durma com você, em troca das mandrágoras do seu filho”.</w:t>
       </w:r>
     </w:p>
     <w:p>
@@ -18444,7 +18444,7 @@
         <w:rPr>
           <w:lang w:val="pt_PT" w:bidi="pt_PT"/>
         </w:rPr>
-        <w:t xml:space="preserve"> Ao entardecer, quando Jacó voltou do campo, Lia foi ao encontro dele e disse: "Hoje você ficará comigo, pois consegui esse direito com as mandrágoras que meu filho trouxe". E naquela noite Jacó se deitou com ela.</w:t>
+        <w:t xml:space="preserve"> Ao entardecer, quando Jacó voltou do campo, Lia foi ao encontro dele e disse: “Hoje você ficará comigo, pois consegui esse direito com as mandrágoras que meu filho trouxe”. E naquela noite Jacó se deitou com ela.</w:t>
       </w:r>
     </w:p>
     <w:p>
@@ -18486,7 +18486,7 @@
         <w:rPr>
           <w:lang w:val="pt_PT" w:bidi="pt_PT"/>
         </w:rPr>
-        <w:t xml:space="preserve"> Então Lia disse: "Deus me recompensou, pois entreguei minha serva ao meu marido". E chamou o menino de Issacar.</w:t>
+        <w:t xml:space="preserve"> Então Lia disse: “Deus me recompensou, pois entreguei minha serva ao meu marido”. E chamou o menino de Issacar.</w:t>
       </w:r>
     </w:p>
     <w:p>
@@ -18528,7 +18528,7 @@
         <w:rPr>
           <w:lang w:val="pt_PT" w:bidi="pt_PT"/>
         </w:rPr>
-        <w:t xml:space="preserve"> Lia afirmou: "Deus me concedeu presentes preciosos. Agora, sim, meu marido me honrará e permanecerá comigo, pois lhe dei seis filhos". Por isso chamou o menino de Zebulom.</w:t>
+        <w:t xml:space="preserve"> Lia afirmou: “Deus me concedeu presentes preciosos. Agora, sim, meu marido me honrará e permanecerá comigo, pois lhe dei seis filhos”. Por isso chamou o menino de Zebulom.</w:t>
       </w:r>
     </w:p>
     <w:p>
@@ -18591,7 +18591,7 @@
         <w:rPr>
           <w:lang w:val="pt_PT" w:bidi="pt_PT"/>
         </w:rPr>
-        <w:t xml:space="preserve"> Ela concebeu, deu à luz um filho e declarou: "Deus removeu a minha vergonha".</w:t>
+        <w:t xml:space="preserve"> Ela concebeu, deu à luz um filho e declarou: “Deus removeu a minha vergonha”.</w:t>
       </w:r>
     </w:p>
     <w:p>
@@ -18612,7 +18612,7 @@
         <w:rPr>
           <w:lang w:val="pt_PT" w:bidi="pt_PT"/>
         </w:rPr>
-        <w:t xml:space="preserve"> Ela lhe deu o nome de José e disse: "Que o SENHOR me conceda ainda outro filho".</w:t>
+        <w:t xml:space="preserve"> Ela lhe deu o nome de José e disse: “Que o SENHOR me conceda ainda outro filho”.</w:t>
       </w:r>
     </w:p>
     <w:p>
@@ -18633,7 +18633,7 @@
         <w:rPr>
           <w:lang w:val="pt_PT" w:bidi="pt_PT"/>
         </w:rPr>
-        <w:t xml:space="preserve"> Depois que Raquel deu à luz José, Jacó disse a Labão: "Deixe-me retornar à minha terra natal.</w:t>
+        <w:t xml:space="preserve"> Depois que Raquel deu à luz José, Jacó disse a Labão: “Deixe-me retornar à minha terra natal.</w:t>
       </w:r>
     </w:p>
     <w:p>
@@ -18654,7 +18654,7 @@
         <w:rPr>
           <w:lang w:val="pt_PT" w:bidi="pt_PT"/>
         </w:rPr>
-        <w:t xml:space="preserve"> Permita que eu parta, levando comigo meus filhos e minhas mulheres, por quem trabalhei. Você sabe perfeitamente quanto me dediquei ao seu serviço".</w:t>
+        <w:t xml:space="preserve"> Permita que eu parta, levando comigo meus filhos e minhas mulheres, por quem trabalhei. Você sabe perfeitamente quanto me dediquei ao seu serviço”.</w:t>
       </w:r>
     </w:p>
     <w:p>
@@ -18675,7 +18675,7 @@
         <w:rPr>
           <w:lang w:val="pt_PT" w:bidi="pt_PT"/>
         </w:rPr>
-        <w:t xml:space="preserve"> Labão, porém, respondeu: "Não vá embora. Eu reconheço que o SENHOR tem me favorecido por sua presença".</w:t>
+        <w:t xml:space="preserve"> Labão, porém, respondeu: “Não vá embora. Eu reconheço que o SENHOR tem me favorecido por sua presença”.</w:t>
       </w:r>
     </w:p>
     <w:p>
@@ -18696,7 +18696,7 @@
         <w:rPr>
           <w:lang w:val="pt_PT" w:bidi="pt_PT"/>
         </w:rPr>
-        <w:t xml:space="preserve"> E acrescentou: "Diga-me quanto quer de pagamento, e eu lhe darei".</w:t>
+        <w:t xml:space="preserve"> E acrescentou: “Diga-me quanto quer de pagamento, e eu lhe darei”.</w:t>
       </w:r>
     </w:p>
     <w:p>
@@ -18717,7 +18717,7 @@
         <w:rPr>
           <w:lang w:val="pt_PT" w:bidi="pt_PT"/>
         </w:rPr>
-        <w:t xml:space="preserve"> Jacó respondeu: "Você sabe muito bem como trabalhei para você e como cuidei do seu rebanho.</w:t>
+        <w:t xml:space="preserve"> Jacó respondeu: “Você sabe muito bem como trabalhei para você e como cuidei do seu rebanho.</w:t>
       </w:r>
     </w:p>
     <w:p>
@@ -18759,7 +18759,7 @@
         <w:rPr>
           <w:lang w:val="pt_PT" w:bidi="pt_PT"/>
         </w:rPr>
-        <w:t xml:space="preserve"> Então Labão perguntou: "Qual pagamento deseja receber?". Jacó respondeu: "Não quero salário; voltarei a cuidar dos seus rebanhos, contanto que me conceda uma condição:</w:t>
+        <w:t xml:space="preserve"> Então Labão perguntou: “Qual pagamento deseja receber?”. Jacó respondeu: “Não quero salário; voltarei a cuidar dos seus rebanhos, contanto que me conceda uma condição:</w:t>
       </w:r>
     </w:p>
     <w:p>
@@ -18801,7 +18801,7 @@
         <w:rPr>
           <w:lang w:val="pt_PT" w:bidi="pt_PT"/>
         </w:rPr>
-        <w:t xml:space="preserve"> Assim será fácil comprovar minha honestidade quando você verificar o pagamento. Se encontrar entre minhas cabras alguma sem listas ou manchas, ou um cordeiro que não seja preto, poderá me acusar de roubo".</w:t>
+        <w:t xml:space="preserve"> Assim será fácil comprovar minha honestidade quando você verificar o pagamento. Se encontrar entre minhas cabras alguma sem listas ou manchas, ou um cordeiro que não seja preto, poderá me acusar de roubo”.</w:t>
       </w:r>
     </w:p>
     <w:p>
@@ -18822,7 +18822,7 @@
         <w:rPr>
           <w:lang w:val="pt_PT" w:bidi="pt_PT"/>
         </w:rPr>
-        <w:t xml:space="preserve"> Labão respondeu: "Está bem! Combinado! O acordo está feito".</w:t>
+        <w:t xml:space="preserve"> Labão respondeu: “Está bem! Combinado! O acordo está feito”.</w:t>
       </w:r>
     </w:p>
     <w:p>
@@ -19195,7 +19195,7 @@
         <w:rPr>
           <w:lang w:val="pt_PT" w:bidi="pt_PT"/>
         </w:rPr>
-        <w:t xml:space="preserve"> Se ele dizia: 'Os salpicados serão o seu pagamento', então os rebanhos davam crias salpicadas; e se dizia: 'Os listrados serão o seu pagamento’, então os rebanhos produziam crias listradas.</w:t>
+        <w:t xml:space="preserve"> Se ele dizia: ‘Os salpicados serão o seu pagamento’, então os rebanhos davam crias salpicadas; e se dizia: ‘Os listrados serão o seu pagamento’, então os rebanhos produziam crias listradas.</w:t>
       </w:r>
     </w:p>
     <w:p>
@@ -19216,7 +19216,7 @@
         <w:rPr>
           <w:lang w:val="pt_PT" w:bidi="pt_PT"/>
         </w:rPr>
-        <w:t xml:space="preserve"> Assim, Deus tomou os rebanhos de seu pai e os entregou a mim".</w:t>
+        <w:t xml:space="preserve"> Assim, Deus tomou os rebanhos de seu pai e os entregou a mim”.</w:t>
       </w:r>
     </w:p>
     <w:p>
@@ -19237,7 +19237,7 @@
         <w:rPr>
           <w:lang w:val="pt_PT" w:bidi="pt_PT"/>
         </w:rPr>
-        <w:t xml:space="preserve"> Jacó prosseguiu: "Na época do cruzamento, sonhei que os machos que cobriam as fêmeas eram listrados, salpicados e malhados.</w:t>
+        <w:t xml:space="preserve"> Jacó prosseguiu: “Na época do cruzamento, sonhei que os machos que cobriam as fêmeas eram listrados, salpicados e malhados.</w:t>
       </w:r>
     </w:p>
     <w:p>
@@ -19258,7 +19258,7 @@
         <w:rPr>
           <w:lang w:val="pt_PT" w:bidi="pt_PT"/>
         </w:rPr>
-        <w:t xml:space="preserve"> Em sonho, o anjo de Deus me chamou: 'Jacó!'. E eu respondi: ‘Aqui estou!’.</w:t>
+        <w:t xml:space="preserve"> Em sonho, o anjo de Deus me chamou: ‘Jacó!’. E eu respondi: ‘Aqui estou!’.</w:t>
       </w:r>
     </w:p>
     <w:p>
@@ -19300,7 +19300,7 @@
         <w:rPr>
           <w:lang w:val="pt_PT" w:bidi="pt_PT"/>
         </w:rPr>
-        <w:t xml:space="preserve"> Eu sou o Deus de Betel, onde você consagrou uma coluna e fez um voto. Levante-se, saia desta terra e retorne à terra dos seus parentes'".</w:t>
+        <w:t xml:space="preserve"> Eu sou o Deus de Betel, onde você consagrou uma coluna e fez um voto. Levante-se, saia desta terra e retorne à terra dos seus parentes’”.</w:t>
       </w:r>
     </w:p>
     <w:p>
@@ -19363,7 +19363,7 @@
         <w:rPr>
           <w:lang w:val="pt_PT" w:bidi="pt_PT"/>
         </w:rPr>
-        <w:t xml:space="preserve"> Toda a riqueza que Deus tomou de nosso pai é nossa e de nossos filhos. Portanto, faça conforme Deus ordenou".</w:t>
+        <w:t xml:space="preserve"> Toda a riqueza que Deus tomou de nosso pai é nossa e de nossos filhos. Portanto, faça conforme Deus ordenou”.</w:t>
       </w:r>
     </w:p>
     <w:p>
@@ -19531,7 +19531,7 @@
         <w:rPr>
           <w:lang w:val="pt_PT" w:bidi="pt_PT"/>
         </w:rPr>
-        <w:t xml:space="preserve"> Mas, à noite, Deus falou com Labão, o arameu, em sonho e lhe disse: "Tenha cuidado com o que vai fazer! Não diga a Jacó nem palavras boas nem más".</w:t>
+        <w:t xml:space="preserve"> Mas, à noite, Deus falou com Labão, o arameu, em sonho e lhe disse: “Tenha cuidado com o que vai fazer! Não diga a Jacó nem palavras boas nem más”.</w:t>
       </w:r>
     </w:p>
     <w:p>
@@ -19573,7 +19573,7 @@
         <w:rPr>
           <w:lang w:val="pt_PT" w:bidi="pt_PT"/>
         </w:rPr>
-        <w:t xml:space="preserve"> Labão falou a Jacó: "Que atitude foi essa? Você me enganou e ainda levou minhas filhas como se fossem prisioneiras de guerra.</w:t>
+        <w:t xml:space="preserve"> Labão falou a Jacó: “Que atitude foi essa? Você me enganou e ainda levou minhas filhas como se fossem prisioneiras de guerra.</w:t>
       </w:r>
     </w:p>
     <w:p>
@@ -19636,7 +19636,7 @@
         <w:rPr>
           <w:lang w:val="pt_PT" w:bidi="pt_PT"/>
         </w:rPr>
-        <w:t xml:space="preserve"> Eu teria poder para lhe fazer mal, mas o Deus de seu pai me advertiu ontem à noite, dizendo: ‘Cuidado! Não diga a Jacó nem palavras boas nem más'.</w:t>
+        <w:t xml:space="preserve"> Eu teria poder para lhe fazer mal, mas o Deus de seu pai me advertiu ontem à noite, dizendo: ‘Cuidado! Não diga a Jacó nem palavras boas nem más’.</w:t>
       </w:r>
     </w:p>
     <w:p>
@@ -19678,7 +19678,7 @@
         <w:rPr>
           <w:lang w:val="pt_PT" w:bidi="pt_PT"/>
         </w:rPr>
-        <w:t xml:space="preserve"> Jacó respondeu: "Fugi desse modo porque tive medo, pois imaginei que você tiraria suas filhas de mim à força.</w:t>
+        <w:t xml:space="preserve"> Jacó respondeu: “Fugi desse modo porque tive medo, pois imaginei que você tiraria suas filhas de mim à força.</w:t>
       </w:r>
     </w:p>
     <w:p>
@@ -19762,7 +19762,7 @@
         <w:rPr>
           <w:lang w:val="pt_PT" w:bidi="pt_PT"/>
         </w:rPr>
-        <w:t xml:space="preserve"> Ela disse ao pai: "Perdoe-me por não poder me levantar diante do senhor, pois estou no período das mulheres". Labão vasculhou toda a tenda, mas não encontrou os ídolos domésticos.</w:t>
+        <w:t xml:space="preserve"> Ela disse ao pai: “Perdoe-me por não poder me levantar diante do senhor, pois estou no período das mulheres”. Labão vasculhou toda a tenda, mas não encontrou os ídolos domésticos.</w:t>
       </w:r>
     </w:p>
     <w:p>
@@ -19783,7 +19783,7 @@
         <w:rPr>
           <w:lang w:val="pt_PT" w:bidi="pt_PT"/>
         </w:rPr>
-        <w:t xml:space="preserve"> Jacó, tomado de indignação, queixou-se a Labão: "Que transgressão foi a minha? Que erro cometi, para me perseguir de modo tão violento?</w:t>
+        <w:t xml:space="preserve"> Jacó, tomado de indignação, queixou-se a Labão: “Que transgressão foi a minha? Que erro cometi, para me perseguir de modo tão violento?</w:t>
       </w:r>
     </w:p>
     <w:p>
@@ -19909,7 +19909,7 @@
         <w:rPr>
           <w:lang w:val="pt_PT" w:bidi="pt_PT"/>
         </w:rPr>
-        <w:t xml:space="preserve"> Se não fosse o Deus de meu pai, o Deus de Abraão e o Temor de Isaque, você certamente me despediria de mãos vazias. Mas Deus viu o meu sofrimento e o esforço das minhas mãos, e ontem à noite ele o advertiu".</w:t>
+        <w:t xml:space="preserve"> Se não fosse o Deus de meu pai, o Deus de Abraão e o Temor de Isaque, você certamente me despediria de mãos vazias. Mas Deus viu o meu sofrimento e o esforço das minhas mãos, e ontem à noite ele o advertiu”.</w:t>
       </w:r>
     </w:p>
     <w:p>
@@ -19930,7 +19930,7 @@
         <w:rPr>
           <w:lang w:val="pt_PT" w:bidi="pt_PT"/>
         </w:rPr>
-        <w:t xml:space="preserve"> Então Labão disse a Jacó: "Estas mulheres são minhas filhas, estes filhos são meus netos, e igualmente os rebanhos e tudo o que está com você. Tudo é meu. Mas o que posso fazer agora por elas e por seus filhos?</w:t>
+        <w:t xml:space="preserve"> Então Labão disse a Jacó: “Estas mulheres são minhas filhas, estes filhos são meus netos, e igualmente os rebanhos e tudo o que está com você. Tudo é meu. Mas o que posso fazer agora por elas e por seus filhos?</w:t>
       </w:r>
     </w:p>
     <w:p>
@@ -19951,7 +19951,7 @@
         <w:rPr>
           <w:lang w:val="pt_PT" w:bidi="pt_PT"/>
         </w:rPr>
-        <w:t xml:space="preserve"> Venha, façamos um acordo, eu e você, e que ele seja testemunho entre nós dois".</w:t>
+        <w:t xml:space="preserve"> Venha, façamos um acordo, eu e você, e que ele seja testemunho entre nós dois”.</w:t>
       </w:r>
     </w:p>
     <w:p>
@@ -19993,7 +19993,7 @@
         <w:rPr>
           <w:lang w:val="pt_PT" w:bidi="pt_PT"/>
         </w:rPr>
-        <w:t xml:space="preserve"> E disse aos seus parentes: "Juntem pedras". Eles trouxeram pedras e levantaram uma pilha.</w:t>
+        <w:t xml:space="preserve"> E disse aos seus parentes: “Juntem pedras”. Eles trouxeram pedras e levantaram uma pilha.</w:t>
       </w:r>
     </w:p>
     <w:p>
@@ -20035,7 +20035,7 @@
         <w:rPr>
           <w:lang w:val="pt_PT" w:bidi="pt_PT"/>
         </w:rPr>
-        <w:t xml:space="preserve"> Labão declarou: "Que esta pilha de pedras seja hoje testemunho entre mim e você". Por isso recebeu o nome de Galeede.</w:t>
+        <w:t xml:space="preserve"> Labão declarou: “Que esta pilha de pedras seja hoje testemunho entre mim e você”. Por isso recebeu o nome de Galeede.</w:t>
       </w:r>
     </w:p>
     <w:p>
@@ -20056,7 +20056,7 @@
         <w:rPr>
           <w:lang w:val="pt_PT" w:bidi="pt_PT"/>
         </w:rPr>
-        <w:t xml:space="preserve"> O lugar recebeu também o nome de Mispá, pois Labão declarou: "Que o SENHOR nos vigie, cada um de nós, quando estivermos distantes, em relação a este acordo.</w:t>
+        <w:t xml:space="preserve"> O lugar recebeu também o nome de Mispá, pois Labão declarou: “Que o SENHOR nos vigie, cada um de nós, quando estivermos distantes, em relação a este acordo.</w:t>
       </w:r>
     </w:p>
     <w:p>
@@ -20077,7 +20077,7 @@
         <w:rPr>
           <w:lang w:val="pt_PT" w:bidi="pt_PT"/>
         </w:rPr>
-        <w:t xml:space="preserve"> Se você fizer mal às minhas filhas ou tomar outras mulheres além delas, eu estarei distante, mas Deus será testemunha entre mim e você".</w:t>
+        <w:t xml:space="preserve"> Se você fizer mal às minhas filhas ou tomar outras mulheres além delas, eu estarei distante, mas Deus será testemunha entre mim e você”.</w:t>
       </w:r>
     </w:p>
     <w:p>
@@ -20098,7 +20098,7 @@
         <w:rPr>
           <w:lang w:val="pt_PT" w:bidi="pt_PT"/>
         </w:rPr>
-        <w:t xml:space="preserve"> Labão prosseguiu: "Aqui está a pilha de pedras e esta coluna que levantei entre mim e você.</w:t>
+        <w:t xml:space="preserve"> Labão prosseguiu: “Aqui está a pilha de pedras e esta coluna que levantei entre mim e você.</w:t>
       </w:r>
     </w:p>
     <w:p>
@@ -20140,7 +20140,7 @@
         <w:rPr>
           <w:lang w:val="pt_PT" w:bidi="pt_PT"/>
         </w:rPr>
-        <w:t xml:space="preserve"> Que o Deus de Abraão e o Deus de Naor, o Deus de seus pais, seja nosso juiz". Então Jacó jurou pelo Deus temível a quem seu pai Isaque servia.</w:t>
+        <w:t xml:space="preserve"> Que o Deus de Abraão e o Deus de Naor, o Deus de seus pais, seja nosso juiz”. Então Jacó jurou pelo Deus temível a quem seu pai Isaque servia.</w:t>
       </w:r>
     </w:p>
     <w:p>
@@ -20240,7 +20240,7 @@
         <w:rPr>
           <w:lang w:val="pt_PT" w:bidi="pt_PT"/>
         </w:rPr>
-        <w:t xml:space="preserve"> Quando Jacó viu os anjos, exclamou: "Este é o acampamento de Deus!". E chamou o lugar de Maanaim.</w:t>
+        <w:t xml:space="preserve"> Quando Jacó viu os anjos, exclamou: “Este é o acampamento de Deus!”. E chamou o lugar de Maanaim.</w:t>
       </w:r>
     </w:p>
     <w:p>
@@ -20282,7 +20282,7 @@
         <w:rPr>
           <w:lang w:val="pt_PT" w:bidi="pt_PT"/>
         </w:rPr>
-        <w:t xml:space="preserve"> Ele instruiu os mensageiros: "Digam ao meu senhor Esaú: 'Seu servo Jacó esteve com Labão e lá permaneceu até agora.</w:t>
+        <w:t xml:space="preserve"> Ele instruiu os mensageiros: “Digam ao meu senhor Esaú: ‘Seu servo Jacó esteve com Labão e lá permaneceu até agora.</w:t>
       </w:r>
     </w:p>
     <w:p>
@@ -20303,7 +20303,7 @@
         <w:rPr>
           <w:lang w:val="pt_PT" w:bidi="pt_PT"/>
         </w:rPr>
-        <w:t xml:space="preserve"> Estou voltando com bois, jumentos, ovelhas e cabras, junto com servos e servas. Mando estes mensageiros para avisar ao meu senhor, a fim de que me acolha com bondade'".</w:t>
+        <w:t xml:space="preserve"> Estou voltando com bois, jumentos, ovelhas e cabras, junto com servos e servas. Mando estes mensageiros para avisar ao meu senhor, a fim de que me acolha com bondade’”.</w:t>
       </w:r>
     </w:p>
     <w:p>
@@ -20324,7 +20324,7 @@
         <w:rPr>
           <w:lang w:val="pt_PT" w:bidi="pt_PT"/>
         </w:rPr>
-        <w:t xml:space="preserve"> Os mensageiros retornaram a Jacó e disseram: "Fomos até seu irmão Esaú, e ele vem ao seu encontro acompanhado de quatrocentos homens".</w:t>
+        <w:t xml:space="preserve"> Os mensageiros retornaram a Jacó e disseram: “Fomos até seu irmão Esaú, e ele vem ao seu encontro acompanhado de quatrocentos homens”.</w:t>
       </w:r>
     </w:p>
     <w:p>
@@ -20366,7 +20366,7 @@
         <w:rPr>
           <w:lang w:val="pt_PT" w:bidi="pt_PT"/>
         </w:rPr>
-        <w:t xml:space="preserve"> Ele pensou consigo: "Se Esaú atacar um grupo, o outro terá chance de escapar".</w:t>
+        <w:t xml:space="preserve"> Ele pensou consigo: “Se Esaú atacar um grupo, o outro terá chance de escapar”.</w:t>
       </w:r>
     </w:p>
     <w:p>
@@ -20387,7 +20387,7 @@
         <w:rPr>
           <w:lang w:val="pt_PT" w:bidi="pt_PT"/>
         </w:rPr>
-        <w:t xml:space="preserve"> Em seguida, Jacó fez esta oração: "Deus de meu pai Abraão e Deus de meu pai Isaque! Ó SENHOR, tu me mandaste voltar para minha terra e para os meus parentes e prometeste me abençoar.</w:t>
+        <w:t xml:space="preserve"> Em seguida, Jacó fez esta oração: “Deus de meu pai Abraão e Deus de meu pai Isaque! Ó SENHOR, tu me mandaste voltar para minha terra e para os meus parentes e prometeste me abençoar.</w:t>
       </w:r>
     </w:p>
     <w:p>
@@ -20450,7 +20450,7 @@
         <w:rPr>
           <w:lang w:val="pt_PT" w:bidi="pt_PT"/>
         </w:rPr>
-        <w:t xml:space="preserve"> Mas tu me prometeste: 'Eu o abençoarei e multiplicarei sua família como a areia da praia, tão numerosa que não se poderá contar'".</w:t>
+        <w:t xml:space="preserve"> Mas tu me prometeste: ‘Eu o abençoarei e multiplicarei sua família como a areia da praia, tão numerosa que não se poderá contar’”.</w:t>
       </w:r>
     </w:p>
     <w:p>
@@ -20534,7 +20534,7 @@
         <w:rPr>
           <w:lang w:val="pt_PT" w:bidi="pt_PT"/>
         </w:rPr>
-        <w:t xml:space="preserve"> Ele entregou os rebanhos do presente a seus servos e lhes ordenou: "Vão à minha frente, mas mantenham uma boa distância entre um rebanho e outro".</w:t>
+        <w:t xml:space="preserve"> Ele entregou os rebanhos do presente a seus servos e lhes ordenou: “Vão à minha frente, mas mantenham uma boa distância entre um rebanho e outro”.</w:t>
       </w:r>
     </w:p>
     <w:p>
@@ -20555,7 +20555,7 @@
         <w:rPr>
           <w:lang w:val="pt_PT" w:bidi="pt_PT"/>
         </w:rPr>
-        <w:t xml:space="preserve"> Jacó orientou o primeiro servo, dizendo: "Quando meu irmão Esaú o encontrar e perguntar: 'Para quem você trabalha? Para onde está indo? Quem é o dono deste rebanho que segue à sua frente?'.</w:t>
+        <w:t xml:space="preserve"> Jacó orientou o primeiro servo, dizendo: “Quando meu irmão Esaú o encontrar e perguntar: ‘Para quem você trabalha? Para onde está indo? Quem é o dono deste rebanho que segue à sua frente?’.</w:t>
       </w:r>
     </w:p>
     <w:p>
@@ -20576,7 +20576,7 @@
         <w:rPr>
           <w:lang w:val="pt_PT" w:bidi="pt_PT"/>
         </w:rPr>
-        <w:t xml:space="preserve"> Responda assim: 'É propriedade de seu servo Jacó. Trata-se de um presente para meu senhor Esaú. Ele vem logo atrás de nós'".</w:t>
+        <w:t xml:space="preserve"> Responda assim: ‘É propriedade de seu servo Jacó. Trata-se de um presente para meu senhor Esaú. Ele vem logo atrás de nós’”.</w:t>
       </w:r>
     </w:p>
     <w:p>
@@ -20597,7 +20597,7 @@
         <w:rPr>
           <w:lang w:val="pt_PT" w:bidi="pt_PT"/>
         </w:rPr>
-        <w:t xml:space="preserve"> Jacó deu as mesmas instruções ao segundo, ao terceiro e a todos os que guiavam os rebanhos: "Digam exatamente isso a Esaú quando o encontrarem".</w:t>
+        <w:t xml:space="preserve"> Jacó deu as mesmas instruções ao segundo, ao terceiro e a todos os que guiavam os rebanhos: “Digam exatamente isso a Esaú quando o encontrarem”.</w:t>
       </w:r>
     </w:p>
     <w:p>
@@ -20618,7 +20618,7 @@
         <w:rPr>
           <w:lang w:val="pt_PT" w:bidi="pt_PT"/>
         </w:rPr>
-        <w:t xml:space="preserve"> E acrescentou: "Vocês devem dizer: 'O seu servo Jacó vem logo atrás de nós'". Porque pensava: "Aplacarei a ira dele com o presente que vai adiante de mim; depois o verei pessoalmente; talvez me receba com bondade".</w:t>
+        <w:t xml:space="preserve"> E acrescentou: “Vocês devem dizer: ‘O seu servo Jacó vem logo atrás de nós’”. Porque pensava: “Aplacarei a ira dele com o presente que vai adiante de mim; depois o verei pessoalmente; talvez me receba com bondade”.</w:t>
       </w:r>
     </w:p>
     <w:p>
@@ -20744,7 +20744,7 @@
         <w:rPr>
           <w:lang w:val="pt_PT" w:bidi="pt_PT"/>
         </w:rPr>
-        <w:t xml:space="preserve"> O homem disse: "Deixe-me ir; já está amanhecendo". Mas Jacó respondeu: "Não vou deixá-lo ir enquanto não me abençoar".</w:t>
+        <w:t xml:space="preserve"> O homem disse: “Deixe-me ir; já está amanhecendo”. Mas Jacó respondeu: “Não vou deixá-lo ir enquanto não me abençoar”.</w:t>
       </w:r>
     </w:p>
     <w:p>
@@ -20765,7 +20765,7 @@
         <w:rPr>
           <w:lang w:val="pt_PT" w:bidi="pt_PT"/>
         </w:rPr>
-        <w:t xml:space="preserve"> O homem perguntou: "Qual é o seu nome?". E ele respondeu: "Jacó".</w:t>
+        <w:t xml:space="preserve"> O homem perguntou: “Qual é o seu nome?”. E ele respondeu: “Jacó”.</w:t>
       </w:r>
     </w:p>
     <w:p>
@@ -20807,7 +20807,7 @@
         <w:rPr>
           <w:lang w:val="pt_PT" w:bidi="pt_PT"/>
         </w:rPr>
-        <w:t xml:space="preserve"> Jacó pediu: "Diga-me o seu nome". O homem respondeu: "Por que você deseja saber meu nome?". E ali concedeu-lhe uma bênção.</w:t>
+        <w:t xml:space="preserve"> Jacó pediu: “Diga-me o seu nome”. O homem respondeu: “Por que você deseja saber meu nome?”. E ali concedeu-lhe uma bênção.</w:t>
       </w:r>
     </w:p>
     <w:p>
@@ -20828,7 +20828,7 @@
         <w:rPr>
           <w:lang w:val="pt_PT" w:bidi="pt_PT"/>
         </w:rPr>
-        <w:t xml:space="preserve"> Jacó deu ao lugar o nome de Peniel e declarou: "Vi o próprio Deus face a face, e sobrevivi".</w:t>
+        <w:t xml:space="preserve"> Jacó deu ao lugar o nome de Peniel e declarou: “Vi o próprio Deus face a face, e sobrevivi”.</w:t>
       </w:r>
     </w:p>
     <w:p>
@@ -20991,7 +20991,7 @@
         <w:rPr>
           <w:lang w:val="pt_PT" w:bidi="pt_PT"/>
         </w:rPr>
-        <w:t xml:space="preserve"> Esaú, ao ver as mulheres e as crianças, perguntou: "Quem são estes que estão com você?". Jacó respondeu: "São os filhos que Deus generosamente deu ao seu servo".</w:t>
+        <w:t xml:space="preserve"> Esaú, ao ver as mulheres e as crianças, perguntou: “Quem são estes que estão com você?”. Jacó respondeu: “São os filhos que Deus generosamente deu ao seu servo”.</w:t>
       </w:r>
     </w:p>
     <w:p>
@@ -21054,7 +21054,7 @@
         <w:rPr>
           <w:lang w:val="pt_PT" w:bidi="pt_PT"/>
         </w:rPr>
-        <w:t xml:space="preserve"> Esaú perguntou: "Qual foi o propósito de enviar todos esses rebanhos que encontrei?". Jacó respondeu: "Para que eu fosse acolhido com favor diante do meu senhor".</w:t>
+        <w:t xml:space="preserve"> Esaú perguntou: “Qual foi o propósito de enviar todos esses rebanhos que encontrei?”. Jacó respondeu: “Para que eu fosse acolhido com favor diante do meu senhor”.</w:t>
       </w:r>
     </w:p>
     <w:p>
@@ -21075,7 +21075,7 @@
         <w:rPr>
           <w:lang w:val="pt_PT" w:bidi="pt_PT"/>
         </w:rPr>
-        <w:t xml:space="preserve"> Mas Esaú respondeu: "Eu já possuo bens em abundância, meu irmão. Fique com o que é seu".</w:t>
+        <w:t xml:space="preserve"> Mas Esaú respondeu: “Eu já possuo bens em abundância, meu irmão. Fique com o que é seu”.</w:t>
       </w:r>
     </w:p>
     <w:p>
@@ -21096,7 +21096,7 @@
         <w:rPr>
           <w:lang w:val="pt_PT" w:bidi="pt_PT"/>
         </w:rPr>
-        <w:t xml:space="preserve"> Jacó insistiu: "Não recuse! Se tenho seu favor, aceite meu presente. Ver seu rosto é como ver o rosto de Deus, e o senhor me recebeu com tanta generosidade.</w:t>
+        <w:t xml:space="preserve"> Jacó insistiu: “Não recuse! Se tenho seu favor, aceite meu presente. Ver seu rosto é como ver o rosto de Deus, e o senhor me recebeu com tanta generosidade.</w:t>
       </w:r>
     </w:p>
     <w:p>
@@ -21117,7 +21117,7 @@
         <w:rPr>
           <w:lang w:val="pt_PT" w:bidi="pt_PT"/>
         </w:rPr>
-        <w:t xml:space="preserve"> Por favor, aceite o presente que lhe trouxe. Deus tem sido muito generoso comigo, e tenho mais do que preciso". Jacó insistiu tanto que Esaú aceitou.</w:t>
+        <w:t xml:space="preserve"> Por favor, aceite o presente que lhe trouxe. Deus tem sido muito generoso comigo, e tenho mais do que preciso”. Jacó insistiu tanto que Esaú aceitou.</w:t>
       </w:r>
     </w:p>
     <w:p>
@@ -21138,7 +21138,7 @@
         <w:rPr>
           <w:lang w:val="pt_PT" w:bidi="pt_PT"/>
         </w:rPr>
-        <w:t xml:space="preserve"> Esaú disse: "Vamos embora, eu vou na frente".</w:t>
+        <w:t xml:space="preserve"> Esaú disse: “Vamos embora, eu vou na frente”.</w:t>
       </w:r>
     </w:p>
     <w:p>
@@ -21159,7 +21159,7 @@
         <w:rPr>
           <w:lang w:val="pt_PT" w:bidi="pt_PT"/>
         </w:rPr>
-        <w:t xml:space="preserve"> Mas Jacó respondeu: "Meu senhor sabe que as crianças que me acompanham são frágeis. Também tenho ovelhas e vacas de leite, que ainda amamentam suas crias. Se forem forçadas demais num só dia, os rebanhos todos acabarão morrendo.</w:t>
+        <w:t xml:space="preserve"> Mas Jacó respondeu: “Meu senhor sabe que as crianças que me acompanham são frágeis. Também tenho ovelhas e vacas de leite, que ainda amamentam suas crias. Se forem forçadas demais num só dia, os rebanhos todos acabarão morrendo.</w:t>
       </w:r>
     </w:p>
     <w:p>
@@ -21180,7 +21180,7 @@
         <w:rPr>
           <w:lang w:val="pt_PT" w:bidi="pt_PT"/>
         </w:rPr>
-        <w:t xml:space="preserve"> Por isso, é melhor que meu senhor siga adiante de seu servo. Nós avançaremos mais devagar, acompanhando o ritmo dos rebanhos e das crianças, até que eu me encontre com meu senhor em Seir".</w:t>
+        <w:t xml:space="preserve"> Por isso, é melhor que meu senhor siga adiante de seu servo. Nós avançaremos mais devagar, acompanhando o ritmo dos rebanhos e das crianças, até que eu me encontre com meu senhor em Seir”.</w:t>
       </w:r>
     </w:p>
     <w:p>
@@ -21201,7 +21201,7 @@
         <w:rPr>
           <w:lang w:val="pt_PT" w:bidi="pt_PT"/>
         </w:rPr>
-        <w:t xml:space="preserve"> Esaú disse: "Então permita que eu deixe alguns homens com você". Jacó respondeu: "Para quê? O fato de ter sido bem acolhido pelo meu senhor já me basta".</w:t>
+        <w:t xml:space="preserve"> Esaú disse: “Então permita que eu deixe alguns homens com você”. Jacó respondeu: “Para quê? O fato de ter sido bem acolhido pelo meu senhor já me basta”.</w:t>
       </w:r>
     </w:p>
     <w:p>
@@ -21406,7 +21406,7 @@
         <w:rPr>
           <w:lang w:val="pt_PT" w:bidi="pt_PT"/>
         </w:rPr>
-        <w:t xml:space="preserve"> Então, ele disse a seu pai Hamor: "Peça por mim a mão daquela moça".</w:t>
+        <w:t xml:space="preserve"> Então, ele disse a seu pai Hamor: “Peça por mim a mão daquela moça”.</w:t>
       </w:r>
     </w:p>
     <w:p>
@@ -21490,7 +21490,7 @@
         <w:rPr>
           <w:lang w:val="pt_PT" w:bidi="pt_PT"/>
         </w:rPr>
-        <w:t xml:space="preserve"> Hamor falou com eles, dizendo: "Siquém, meu filho, apaixonou-se pela filha de vocês. Concedam-na para que se torne sua mulher.</w:t>
+        <w:t xml:space="preserve"> Hamor falou com eles, dizendo: “Siquém, meu filho, apaixonou-se pela filha de vocês. Concedam-na para que se torne sua mulher.</w:t>
       </w:r>
     </w:p>
     <w:p>
@@ -21532,7 +21532,7 @@
         <w:rPr>
           <w:lang w:val="pt_PT" w:bidi="pt_PT"/>
         </w:rPr>
-        <w:t xml:space="preserve"> Estabeleçam-se aqui. A terra está disponível para vocês. Habitem, façam negócios e adquiram propriedades".</w:t>
+        <w:t xml:space="preserve"> Estabeleçam-se aqui. A terra está disponível para vocês. Habitem, façam negócios e adquiram propriedades”.</w:t>
       </w:r>
     </w:p>
     <w:p>
@@ -21553,7 +21553,7 @@
         <w:rPr>
           <w:lang w:val="pt_PT" w:bidi="pt_PT"/>
         </w:rPr>
-        <w:t xml:space="preserve"> O próprio Siquém disse ao pai e aos irmãos de Diná: "Concedam-me este favor, e darei o que pedirem.</w:t>
+        <w:t xml:space="preserve"> O próprio Siquém disse ao pai e aos irmãos de Diná: “Concedam-me este favor, e darei o que pedirem.</w:t>
       </w:r>
     </w:p>
     <w:p>
@@ -21574,7 +21574,7 @@
         <w:rPr>
           <w:lang w:val="pt_PT" w:bidi="pt_PT"/>
         </w:rPr>
-        <w:t xml:space="preserve"> Peçam o quanto julgarem necessário pelo dote de casamento e pelo presente da moça. Eu pagarei conforme pedirem. Apenas peço que me permitam casar com ela".</w:t>
+        <w:t xml:space="preserve"> Peçam o quanto julgarem necessário pelo dote de casamento e pelo presente da moça. Eu pagarei conforme pedirem. Apenas peço que me permitam casar com ela”.</w:t>
       </w:r>
     </w:p>
     <w:p>
@@ -21679,7 +21679,7 @@
         <w:rPr>
           <w:lang w:val="pt_PT" w:bidi="pt_PT"/>
         </w:rPr>
-        <w:t xml:space="preserve"> Mas, se não aceitarem e não se dispuserem à circuncisão, levaremos nossa irmã Diná e partiremos deste lugar".</w:t>
+        <w:t xml:space="preserve"> Mas, se não aceitarem e não se dispuserem à circuncisão, levaremos nossa irmã Diná e partiremos deste lugar”.</w:t>
       </w:r>
     </w:p>
     <w:p>
@@ -21805,7 +21805,7 @@
         <w:rPr>
           <w:lang w:val="pt_PT" w:bidi="pt_PT"/>
         </w:rPr>
-        <w:t xml:space="preserve"> Acaso não herdaremos todo o seu rebanho, suas riquezas e todos os outros animais? Vamos, portanto, aceitar a exigência, para que vivam conosco".</w:t>
+        <w:t xml:space="preserve"> Acaso não herdaremos todo o seu rebanho, suas riquezas e todos os outros animais? Vamos, portanto, aceitar a exigência, para que vivam conosco”.</w:t>
       </w:r>
     </w:p>
     <w:p>
@@ -21952,7 +21952,7 @@
         <w:rPr>
           <w:lang w:val="pt_PT" w:bidi="pt_PT"/>
         </w:rPr>
-        <w:t xml:space="preserve"> Então Jacó disse a Simeão e a Levi: "Vocês me causaram enorme problema! Agora os habitantes desta terra, cananeus e ferezeus, terão ódio de mim. Somos poucos; se eles se juntarem contra nós, eu e minha casa seremos aniquilados".</w:t>
+        <w:t xml:space="preserve"> Então Jacó disse a Simeão e a Levi: “Vocês me causaram enorme problema! Agora os habitantes desta terra, cananeus e ferezeus, terão ódio de mim. Somos poucos; se eles se juntarem contra nós, eu e minha casa seremos aniquilados”.</w:t>
       </w:r>
     </w:p>
     <w:p>
@@ -21973,7 +21973,7 @@
         <w:rPr>
           <w:lang w:val="pt_PT" w:bidi="pt_PT"/>
         </w:rPr>
-        <w:t xml:space="preserve"> Mas eles responderam: "Seria correto permitir que ele tratasse nossa irmã como uma prostituta?".</w:t>
+        <w:t xml:space="preserve"> Mas eles responderam: “Seria correto permitir que ele tratasse nossa irmã como uma prostituta?”.</w:t>
       </w:r>
     </w:p>
     <w:p>
@@ -22052,7 +22052,7 @@
         <w:rPr>
           <w:lang w:val="pt_PT" w:bidi="pt_PT"/>
         </w:rPr>
-        <w:t xml:space="preserve"> Preparem-se, subamos para Betel. Lá erguerei um altar ao Deus que me ouviu no dia da minha angústia e que me acompanha em cada lugar por onde passo".</w:t>
+        <w:t xml:space="preserve"> Preparem-se, subamos para Betel. Lá erguerei um altar ao Deus que me ouviu no dia da minha angústia e que me acompanha em cada lugar por onde passo”.</w:t>
       </w:r>
     </w:p>
     <w:p>
@@ -22199,7 +22199,7 @@
         <w:rPr>
           <w:lang w:val="pt_PT" w:bidi="pt_PT"/>
         </w:rPr>
-        <w:t xml:space="preserve"> Deus declarou: "Seu nome é Jacó, mas não será mais assim; seu nome será Israel". E o chamou Israel.</w:t>
+        <w:t xml:space="preserve"> Deus declarou: “Seu nome é Jacó, mas não será mais assim; seu nome será Israel”. E o chamou Israel.</w:t>
       </w:r>
     </w:p>
     <w:p>
@@ -22241,7 +22241,7 @@
         <w:rPr>
           <w:lang w:val="pt_PT" w:bidi="pt_PT"/>
         </w:rPr>
-        <w:t xml:space="preserve"> Eu dou a você e aos seus descendentes a terra que já dei a Abraão e Isaque".</w:t>
+        <w:t xml:space="preserve"> Eu dou a você e aos seus descendentes a terra que já dei a Abraão e Isaque”.</w:t>
       </w:r>
     </w:p>
     <w:p>
@@ -23659,7 +23659,7 @@
         <w:rPr>
           <w:lang w:val="pt_PT" w:bidi="pt_PT"/>
         </w:rPr>
-        <w:t xml:space="preserve"> José lhes falou: "Peço que escutem o sonho que tive.</w:t>
+        <w:t xml:space="preserve"> José lhes falou: “Peço que escutem o sonho que tive.</w:t>
       </w:r>
     </w:p>
     <w:p>
@@ -23680,7 +23680,7 @@
         <w:rPr>
           <w:lang w:val="pt_PT" w:bidi="pt_PT"/>
         </w:rPr>
-        <w:t xml:space="preserve"> Escutem! Sonhei que estávamos atando feixes de trigo no campo. Então o meu feixe se ergueu e permaneceu de pé, enquanto os de vocês o cercaram e se curvaram diante dele".</w:t>
+        <w:t xml:space="preserve"> Escutem! Sonhei que estávamos atando feixes de trigo no campo. Então o meu feixe se ergueu e permaneceu de pé, enquanto os de vocês o cercaram e se curvaram diante dele”.</w:t>
       </w:r>
     </w:p>
     <w:p>
@@ -23701,7 +23701,7 @@
         <w:rPr>
           <w:lang w:val="pt_PT" w:bidi="pt_PT"/>
         </w:rPr>
-        <w:t xml:space="preserve"> Eles retrucaram: "Quer dizer que vai ser nosso rei, ou que vai nos governar?". Por causa dos sonhos e das palavras de José, o rancor deles crescia ainda mais.</w:t>
+        <w:t xml:space="preserve"> Eles retrucaram: “Quer dizer que vai ser nosso rei, ou que vai nos governar?”. Por causa dos sonhos e das palavras de José, o rancor deles crescia ainda mais.</w:t>
       </w:r>
     </w:p>
     <w:p>
@@ -23722,7 +23722,7 @@
         <w:rPr>
           <w:lang w:val="pt_PT" w:bidi="pt_PT"/>
         </w:rPr>
-        <w:t xml:space="preserve"> José teve mais um sonho e o relatou a seus irmãos: "Sonhei que o sol, a lua e onze estrelas se prostravam diante de mim".</w:t>
+        <w:t xml:space="preserve"> José teve mais um sonho e o relatou a seus irmãos: “Sonhei que o sol, a lua e onze estrelas se prostravam diante de mim”.</w:t>
       </w:r>
     </w:p>
     <w:p>
@@ -23743,7 +23743,7 @@
         <w:rPr>
           <w:lang w:val="pt_PT" w:bidi="pt_PT"/>
         </w:rPr>
-        <w:t xml:space="preserve"> José compartilhou o sonho com seu pai e seus irmãos; mas o pai o repreendeu, dizendo: "Que sonho é esse? Acaso eu, sua mãe e seus irmãos nos prostraremos diante de você?".</w:t>
+        <w:t xml:space="preserve"> José compartilhou o sonho com seu pai e seus irmãos; mas o pai o repreendeu, dizendo: “Que sonho é esse? Acaso eu, sua mãe e seus irmãos nos prostraremos diante de você?”.</w:t>
       </w:r>
     </w:p>
     <w:p>
@@ -23806,7 +23806,7 @@
         <w:rPr>
           <w:lang w:val="pt_PT" w:bidi="pt_PT"/>
         </w:rPr>
-        <w:t xml:space="preserve"> Israel disse: "Seus irmãos estão em Siquém cuidando das ovelhas. Quero que vá até eles". E José disse: "Sim, pai, estou pronto".</w:t>
+        <w:t xml:space="preserve"> Israel disse: “Seus irmãos estão em Siquém cuidando das ovelhas. Quero que vá até eles”. E José disse: “Sim, pai, estou pronto”.</w:t>
       </w:r>
     </w:p>
     <w:p>
@@ -23827,7 +23827,7 @@
         <w:rPr>
           <w:lang w:val="pt_PT" w:bidi="pt_PT"/>
         </w:rPr>
-        <w:t xml:space="preserve"> Jacó pediu: "Veja como estão seus irmãos e o rebanho e me conte". José saiu do vale de Hebrom e foi até Siquém.</w:t>
+        <w:t xml:space="preserve"> Jacó pediu: “Veja como estão seus irmãos e o rebanho e me conte”. José saiu do vale de Hebrom e foi até Siquém.</w:t>
       </w:r>
     </w:p>
     <w:p>
@@ -23848,7 +23848,7 @@
         <w:rPr>
           <w:lang w:val="pt_PT" w:bidi="pt_PT"/>
         </w:rPr>
-        <w:t xml:space="preserve"> Um homem o encontrou vagando perdido pelos campos e lhe perguntou: "O que você está procurando?".</w:t>
+        <w:t xml:space="preserve"> Um homem o encontrou vagando perdido pelos campos e lhe perguntou: “O que você está procurando?”.</w:t>
       </w:r>
     </w:p>
     <w:p>
@@ -23869,7 +23869,7 @@
         <w:rPr>
           <w:lang w:val="pt_PT" w:bidi="pt_PT"/>
         </w:rPr>
-        <w:t xml:space="preserve"> José respondeu: "Procuro meus irmãos. O senhor poderia indicar onde estão pastoreando os rebanhos?".</w:t>
+        <w:t xml:space="preserve"> José respondeu: “Procuro meus irmãos. O senhor poderia indicar onde estão pastoreando os rebanhos?”.</w:t>
       </w:r>
     </w:p>
     <w:p>
@@ -23890,7 +23890,7 @@
         <w:rPr>
           <w:lang w:val="pt_PT" w:bidi="pt_PT"/>
         </w:rPr>
-        <w:t xml:space="preserve"> O homem declarou: "Eles já se foram daqui. Ouvi quando diziam: 'Vamos a Dotã'". Então José procurou seus irmãos e os encontrou nas proximidades de Dotã.</w:t>
+        <w:t xml:space="preserve"> O homem declarou: “Eles já se foram daqui. Ouvi quando diziam: ‘Vamos a Dotã’”. Então José procurou seus irmãos e os encontrou nas proximidades de Dotã.</w:t>
       </w:r>
     </w:p>
     <w:p>
@@ -23932,7 +23932,7 @@
         <w:rPr>
           <w:lang w:val="pt_PT" w:bidi="pt_PT"/>
         </w:rPr>
-        <w:t xml:space="preserve"> E comentavam entre si: "Olhem quem vem aí: o sonhador!</w:t>
+        <w:t xml:space="preserve"> E comentavam entre si: “Olhem quem vem aí: o sonhador!</w:t>
       </w:r>
     </w:p>
     <w:p>
@@ -23974,7 +23974,7 @@
         <w:rPr>
           <w:lang w:val="pt_PT" w:bidi="pt_PT"/>
         </w:rPr>
-        <w:t xml:space="preserve"> Quando Rúben escutou o plano dos irmãos, tentou salvá-lo e disse: "Não tiremos a vida de nosso irmão!".</w:t>
+        <w:t xml:space="preserve"> Quando Rúben escutou o plano dos irmãos, tentou salvá-lo e disse: “Não tiremos a vida de nosso irmão!”.</w:t>
       </w:r>
     </w:p>
     <w:p>
@@ -23995,7 +23995,7 @@
         <w:rPr>
           <w:lang w:val="pt_PT" w:bidi="pt_PT"/>
         </w:rPr>
-        <w:t xml:space="preserve"> E acrescentou: "Não derramem sangue. Lancem-no neste poço no deserto, mas não o toquem". Rúben falou assim para poder libertá-lo depois e levá-lo de volta ao pai.</w:t>
+        <w:t xml:space="preserve"> E acrescentou: “Não derramem sangue. Lancem-no neste poço no deserto, mas não o toquem”. Rúben falou assim para poder libertá-lo depois e levá-lo de volta ao pai.</w:t>
       </w:r>
     </w:p>
     <w:p>
@@ -24079,7 +24079,7 @@
         <w:rPr>
           <w:lang w:val="pt_PT" w:bidi="pt_PT"/>
         </w:rPr>
-        <w:t xml:space="preserve"> Judá disse aos irmãos: "Que proveito teremos em matar nosso irmão, ocultar sua morte e carregar esse peso na consciência?</w:t>
+        <w:t xml:space="preserve"> Judá disse aos irmãos: “Que proveito teremos em matar nosso irmão, ocultar sua morte e carregar esse peso na consciência?</w:t>
       </w:r>
     </w:p>
     <w:p>
@@ -24163,7 +24163,7 @@
         <w:rPr>
           <w:lang w:val="pt_PT" w:bidi="pt_PT"/>
         </w:rPr>
-        <w:t xml:space="preserve"> Então, dirigindo-se aos irmãos, exclamou: "O menino desapareceu! E agora, o que será de mim?".</w:t>
+        <w:t xml:space="preserve"> Então, dirigindo-se aos irmãos, exclamou: “O menino desapareceu! E agora, o que será de mim?”.</w:t>
       </w:r>
     </w:p>
     <w:p>
@@ -24205,7 +24205,7 @@
         <w:rPr>
           <w:lang w:val="pt_PT" w:bidi="pt_PT"/>
         </w:rPr>
-        <w:t xml:space="preserve"> Em seguida, enviaram ao pai a túnica longa e colorida, manchada de sangue, com este recado: "Encontramos isto no campo. Será que é a túnica de seu filho?".</w:t>
+        <w:t xml:space="preserve"> Em seguida, enviaram ao pai a túnica longa e colorida, manchada de sangue, com este recado: “Encontramos isto no campo. Será que é a túnica de seu filho?”.</w:t>
       </w:r>
     </w:p>
     <w:p>
@@ -24226,7 +24226,7 @@
         <w:rPr>
           <w:lang w:val="pt_PT" w:bidi="pt_PT"/>
         </w:rPr>
-        <w:t xml:space="preserve"> Jacó a reconheceu e exclamou: "É a túnica de meu filho! Um animal selvagem deve tê-lo devorado! José certamente foi despedaçado!".</w:t>
+        <w:t xml:space="preserve"> Jacó a reconheceu e exclamou: “É a túnica de meu filho! Um animal selvagem deve tê-lo devorado! José certamente foi despedaçado!”.</w:t>
       </w:r>
     </w:p>
     <w:p>
@@ -24268,7 +24268,7 @@
         <w:rPr>
           <w:lang w:val="pt_PT" w:bidi="pt_PT"/>
         </w:rPr>
-        <w:t xml:space="preserve"> Todos os filhos e filhas tentaram consolá-lo. Mas ele não quis ser consolado e disse: "Vou lamentar a morte de meu filho até o fim da minha vida". E continuou a chorar.</w:t>
+        <w:t xml:space="preserve"> Todos os filhos e filhas tentaram consolá-lo. Mas ele não quis ser consolado e disse: “Vou lamentar a morte de meu filho até o fim da minha vida”. E continuou a chorar.</w:t>
       </w:r>
     </w:p>
     <w:p>
@@ -24473,7 +24473,7 @@
         <w:rPr>
           <w:lang w:val="pt_PT" w:bidi="pt_PT"/>
         </w:rPr>
-        <w:t xml:space="preserve"> Judá ordenou a Onã, irmão de Er: "Case-se com a esposa de seu irmão e cumpra as obrigações de cunhado, para que a linhagem de seu irmão continue por seu intermédio".</w:t>
+        <w:t xml:space="preserve"> Judá ordenou a Onã, irmão de Er: “Case-se com a esposa de seu irmão e cumpra as obrigações de cunhado, para que a linhagem de seu irmão continue por seu intermédio”.</w:t>
       </w:r>
     </w:p>
     <w:p>
@@ -24536,7 +24536,7 @@
         <w:rPr>
           <w:lang w:val="pt_PT" w:bidi="pt_PT"/>
         </w:rPr>
-        <w:t xml:space="preserve"> Judá disse a Tamar, sua nora: "Volte para a casa de seus pais e permaneça viúva até que Selá, meu filho, seja adulto". A intenção de Judá era evitar que o filho mais novo morresse como já havia acontecido com os dois irmãos. Tamar, então, voltou à casa de seus pais.</w:t>
+        <w:t xml:space="preserve"> Judá disse a Tamar, sua nora: “Volte para a casa de seus pais e permaneça viúva até que Selá, meu filho, seja adulto”. A intenção de Judá era evitar que o filho mais novo morresse como já havia acontecido com os dois irmãos. Tamar, então, voltou à casa de seus pais.</w:t>
       </w:r>
     </w:p>
     <w:p>
@@ -24578,7 +24578,7 @@
         <w:rPr>
           <w:lang w:val="pt_PT" w:bidi="pt_PT"/>
         </w:rPr>
-        <w:t xml:space="preserve"> Disseram a Tamar: "Seu sogro vai a Timna cortar a lã das ovelhas".</w:t>
+        <w:t xml:space="preserve"> Disseram a Tamar: “Seu sogro vai a Timna cortar a lã das ovelhas”.</w:t>
       </w:r>
     </w:p>
     <w:p>
@@ -24641,7 +24641,7 @@
         <w:rPr>
           <w:lang w:val="pt_PT" w:bidi="pt_PT"/>
         </w:rPr>
-        <w:t xml:space="preserve"> Judá aproximou-se dela e disse: "Venha, deite-se comigo". Ele não sabia que era sua nora. Então Tamar perguntou: "Qual será o pagamento para que eu me deite com você?".</w:t>
+        <w:t xml:space="preserve"> Judá aproximou-se dela e disse: “Venha, deite-se comigo”. Ele não sabia que era sua nora. Então Tamar perguntou: “Qual será o pagamento para que eu me deite com você?”.</w:t>
       </w:r>
     </w:p>
     <w:p>
@@ -24662,7 +24662,7 @@
         <w:rPr>
           <w:lang w:val="pt_PT" w:bidi="pt_PT"/>
         </w:rPr>
-        <w:t xml:space="preserve"> Judá respondeu: "Mandarei um cabrito do meu rebanho para você". Ela então perguntou: "Que garantia me dá de que realmente cumprirá esse pagamento?".</w:t>
+        <w:t xml:space="preserve"> Judá respondeu: “Mandarei um cabrito do meu rebanho para você”. Ela então perguntou: “Que garantia me dá de que realmente cumprirá esse pagamento?”.</w:t>
       </w:r>
     </w:p>
     <w:p>
@@ -24683,7 +24683,7 @@
         <w:rPr>
           <w:lang w:val="pt_PT" w:bidi="pt_PT"/>
         </w:rPr>
-        <w:t xml:space="preserve"> Judá perguntou: "O que você deseja como garantia?". Tamar respondeu: "Quero o seu selo de identificação, o cordão e o cajado que você traz na mão". Ele lhe entregou esses objetos, teve relações com ela, e Tamar engravidou.</w:t>
+        <w:t xml:space="preserve"> Judá perguntou: “O que você deseja como garantia?”. Tamar respondeu: “Quero o seu selo de identificação, o cordão e o cajado que você traz na mão”. Ele lhe entregou esses objetos, teve relações com ela, e Tamar engravidou.</w:t>
       </w:r>
     </w:p>
     <w:p>
@@ -24746,7 +24746,7 @@
         <w:rPr>
           <w:lang w:val="pt_PT" w:bidi="pt_PT"/>
         </w:rPr>
-        <w:t xml:space="preserve"> Hira perguntou aos moradores dali: "Onde está a prostituta que se sentava perto do caminho de Enaim". E eles responderam: "Jamais vimos prostituta por aqui".</w:t>
+        <w:t xml:space="preserve"> Hira perguntou aos moradores dali: “Onde está a prostituta que se sentava perto do caminho de Enaim”. E eles responderam: “Jamais vimos prostituta por aqui”.</w:t>
       </w:r>
     </w:p>
     <w:p>
@@ -24767,7 +24767,7 @@
         <w:rPr>
           <w:lang w:val="pt_PT" w:bidi="pt_PT"/>
         </w:rPr>
-        <w:t xml:space="preserve"> De volta a Timna, Hira disse a Judá: "Não consegui encontrá-la. Além disso, os homens do lugar afirmaram que nunca houve prostituta ali".</w:t>
+        <w:t xml:space="preserve"> De volta a Timna, Hira disse a Judá: “Não consegui encontrá-la. Além disso, os homens do lugar afirmaram que nunca houve prostituta ali”.</w:t>
       </w:r>
     </w:p>
     <w:p>
@@ -24788,7 +24788,7 @@
         <w:rPr>
           <w:lang w:val="pt_PT" w:bidi="pt_PT"/>
         </w:rPr>
-        <w:t xml:space="preserve"> Judá respondeu: "Que ela fique com os meus objetos. Assim ninguém zombará de nós. Afinal, enviei o cabrito para ela, mas você não a encontrou".</w:t>
+        <w:t xml:space="preserve"> Judá respondeu: “Que ela fique com os meus objetos. Assim ninguém zombará de nós. Afinal, enviei o cabrito para ela, mas você não a encontrou”.</w:t>
       </w:r>
     </w:p>
     <w:p>
@@ -24809,7 +24809,7 @@
         <w:rPr>
           <w:lang w:val="pt_PT" w:bidi="pt_PT"/>
         </w:rPr>
-        <w:t xml:space="preserve"> Passados cerca de três meses, informaram a Judá: "Tamar, sua nora, comportou-se como prostituta, pois está grávida". Então Judá ordenou: "Levem-na para fora e que seja queimada!".</w:t>
+        <w:t xml:space="preserve"> Passados cerca de três meses, informaram a Judá: “Tamar, sua nora, comportou-se como prostituta, pois está grávida”. Então Judá ordenou: “Levem-na para fora e que seja queimada!”.</w:t>
       </w:r>
     </w:p>
     <w:p>
@@ -24830,7 +24830,7 @@
         <w:rPr>
           <w:lang w:val="pt_PT" w:bidi="pt_PT"/>
         </w:rPr>
-        <w:t xml:space="preserve"> Enquanto a levavam para fora, Tamar mandou dizer ao sogro: "Estou grávida do homem a quem pertencem estes objetos". E acrescentou: "Veja se reconhece de quem são este selo, este cordão e este cajado".</w:t>
+        <w:t xml:space="preserve"> Enquanto a levavam para fora, Tamar mandou dizer ao sogro: “Estou grávida do homem a quem pertencem estes objetos”. E acrescentou: “Veja se reconhece de quem são este selo, este cordão e este cajado”.</w:t>
       </w:r>
     </w:p>
     <w:p>
@@ -24851,7 +24851,7 @@
         <w:rPr>
           <w:lang w:val="pt_PT" w:bidi="pt_PT"/>
         </w:rPr>
-        <w:t xml:space="preserve"> Judá os reconheceu e declarou: "Ela foi mais correta do que eu, pois não a entreguei a meu filho Selá". E nunca mais se deitou com ela.</w:t>
+        <w:t xml:space="preserve"> Judá os reconheceu e declarou: “Ela foi mais correta do que eu, pois não a entreguei a meu filho Selá”. E nunca mais se deitou com ela.</w:t>
       </w:r>
     </w:p>
     <w:p>
@@ -24893,7 +24893,7 @@
         <w:rPr>
           <w:lang w:val="pt_PT" w:bidi="pt_PT"/>
         </w:rPr>
-        <w:t xml:space="preserve"> Durante o nascimento, um dos meninos pôs a mão para fora. A parteira amarrou um fio vermelho em seu pulso e disse: "Este saiu primeiro".</w:t>
+        <w:t xml:space="preserve"> Durante o nascimento, um dos meninos pôs a mão para fora. A parteira amarrou um fio vermelho em seu pulso e disse: “Este saiu primeiro”.</w:t>
       </w:r>
     </w:p>
     <w:p>
@@ -24914,7 +24914,7 @@
         <w:rPr>
           <w:lang w:val="pt_PT" w:bidi="pt_PT"/>
         </w:rPr>
-        <w:t xml:space="preserve"> Mas quando o primeiro recolheu a mão, nasceu o irmão. Então a parteira exclamou: "Que brecha você abriu para nascer!". E por esse motivo foi chamado Perez.</w:t>
+        <w:t xml:space="preserve"> Mas quando o primeiro recolheu a mão, nasceu o irmão. Então a parteira exclamou: “Que brecha você abriu para nascer!”. E por esse motivo foi chamado Perez.</w:t>
       </w:r>
     </w:p>
     <w:p>
@@ -25098,7 +25098,7 @@
         <w:rPr>
           <w:lang w:val="pt_PT" w:bidi="pt_PT"/>
         </w:rPr>
-        <w:t xml:space="preserve"> Com o passar do tempo, a mulher de seu senhor começou a desejar José e disse: "Deite-se comigo!".</w:t>
+        <w:t xml:space="preserve"> Com o passar do tempo, a mulher de seu senhor começou a desejar José e disse: “Deite-se comigo!”.</w:t>
       </w:r>
     </w:p>
     <w:p>
@@ -25119,7 +25119,7 @@
         <w:rPr>
           <w:lang w:val="pt_PT" w:bidi="pt_PT"/>
         </w:rPr>
-        <w:t xml:space="preserve"> Mas José recusou e disse à esposa de seu senhor: "Meu senhor confia em mim e colocou tudo o que tem em minhas mãos.</w:t>
+        <w:t xml:space="preserve"> Mas José recusou e disse à esposa de seu senhor: “Meu senhor confia em mim e colocou tudo o que tem em minhas mãos.</w:t>
       </w:r>
     </w:p>
     <w:p>
@@ -25203,7 +25203,7 @@
         <w:rPr>
           <w:lang w:val="pt_PT" w:bidi="pt_PT"/>
         </w:rPr>
-        <w:t xml:space="preserve"> Ela o agarrou pela roupa e disse: "Quero que você se deite comigo". Mas José deixou a roupa nas mãos dela e correu para fora.</w:t>
+        <w:t xml:space="preserve"> Ela o agarrou pela roupa e disse: “Quero que você se deite comigo”. Mas José deixou a roupa nas mãos dela e correu para fora.</w:t>
       </w:r>
     </w:p>
     <w:p>
@@ -25245,7 +25245,7 @@
         <w:rPr>
           <w:lang w:val="pt_PT" w:bidi="pt_PT"/>
         </w:rPr>
-        <w:t xml:space="preserve"> chamou os empregados da casa e disse: "Esse hebreu foi trazido para nos envergonhar. Ele tentou se deitar comigo, mas eu gritei bem alto.</w:t>
+        <w:t xml:space="preserve"> chamou os empregados da casa e disse: “Esse hebreu foi trazido para nos envergonhar. Ele tentou se deitar comigo, mas eu gritei bem alto.</w:t>
       </w:r>
     </w:p>
     <w:p>
@@ -25266,7 +25266,7 @@
         <w:rPr>
           <w:lang w:val="pt_PT" w:bidi="pt_PT"/>
         </w:rPr>
-        <w:t xml:space="preserve"> Assim que ouviu meu grito, ele largou a roupa e correu para fora".</w:t>
+        <w:t xml:space="preserve"> Assim que ouviu meu grito, ele largou a roupa e correu para fora”.</w:t>
       </w:r>
     </w:p>
     <w:p>
@@ -25308,7 +25308,7 @@
         <w:rPr>
           <w:lang w:val="pt_PT" w:bidi="pt_PT"/>
         </w:rPr>
-        <w:t xml:space="preserve"> Então ela repetiu ao marido a mesma versão dos fatos e disse: "Esse servo hebreu que você trouxe aproximou-se de mim para me desonrar.</w:t>
+        <w:t xml:space="preserve"> Então ela repetiu ao marido a mesma versão dos fatos e disse: “Esse servo hebreu que você trouxe aproximou-se de mim para me desonrar.</w:t>
       </w:r>
     </w:p>
     <w:p>
@@ -25329,7 +25329,7 @@
         <w:rPr>
           <w:lang w:val="pt_PT" w:bidi="pt_PT"/>
         </w:rPr>
-        <w:t xml:space="preserve"> Mas quando eu gritei por socorro, ele deixou sua capa ao meu lado e fugiu".</w:t>
+        <w:t xml:space="preserve"> Mas quando eu gritei por socorro, ele deixou sua capa ao meu lado e fugiu”.</w:t>
       </w:r>
     </w:p>
     <w:p>
@@ -25350,7 +25350,7 @@
         <w:rPr>
           <w:lang w:val="pt_PT" w:bidi="pt_PT"/>
         </w:rPr>
-        <w:t xml:space="preserve"> Quando Potifar ouviu o que sua esposa dizia sobre José: "Foi assim que o escravo agiu comigo", ficou muito irado.</w:t>
+        <w:t xml:space="preserve"> Quando Potifar ouviu o que sua esposa dizia sobre José: “Foi assim que o escravo agiu comigo”, ficou muito irado.</w:t>
       </w:r>
     </w:p>
     <w:p>
@@ -25597,7 +25597,7 @@
         <w:rPr>
           <w:lang w:val="pt_PT" w:bidi="pt_PT"/>
         </w:rPr>
-        <w:t xml:space="preserve"> Então, José perguntou aos oficiais do faraó que estavam igualmente presos na casa do seu senhor: "Por que vocês estão tão tristes hoje?".</w:t>
+        <w:t xml:space="preserve"> Então, José perguntou aos oficiais do faraó que estavam igualmente presos na casa do seu senhor: “Por que vocês estão tão tristes hoje?”.</w:t>
       </w:r>
     </w:p>
     <w:p>
@@ -25618,7 +25618,7 @@
         <w:rPr>
           <w:lang w:val="pt_PT" w:bidi="pt_PT"/>
         </w:rPr>
-        <w:t xml:space="preserve"> Eles disseram: "Cada um de nós sonhou nesta noite, mas não há quem interprete nossos sonhos". José disse: "As interpretações pertencem a Deus. Contem-me o que vocês sonharam".</w:t>
+        <w:t xml:space="preserve"> Eles disseram: “Cada um de nós sonhou nesta noite, mas não há quem interprete nossos sonhos”. José disse: “As interpretações pertencem a Deus. Contem-me o que vocês sonharam”.</w:t>
       </w:r>
     </w:p>
     <w:p>
@@ -25639,7 +25639,7 @@
         <w:rPr>
           <w:lang w:val="pt_PT" w:bidi="pt_PT"/>
         </w:rPr>
-        <w:t xml:space="preserve"> Então o chefe dos copeiros relatou o seu sonho a José. Disse: "No meu sonho, vi diante de mim uma videira</w:t>
+        <w:t xml:space="preserve"> Então o chefe dos copeiros relatou o seu sonho a José. Disse: “No meu sonho, vi diante de mim uma videira</w:t>
       </w:r>
     </w:p>
     <w:p>
@@ -25681,7 +25681,7 @@
         <w:rPr>
           <w:lang w:val="pt_PT" w:bidi="pt_PT"/>
         </w:rPr>
-        <w:t xml:space="preserve"> A taça do faraó estava na minha mão. Espremi as uvas dentro da taça e a entreguei pessoalmente ao faraó".</w:t>
+        <w:t xml:space="preserve"> A taça do faraó estava na minha mão. Espremi as uvas dentro da taça e a entreguei pessoalmente ao faraó”.</w:t>
       </w:r>
     </w:p>
     <w:p>
@@ -25702,7 +25702,7 @@
         <w:rPr>
           <w:lang w:val="pt_PT" w:bidi="pt_PT"/>
         </w:rPr>
-        <w:t xml:space="preserve"> José lhe respondeu: "Aqui está a interpretação: os três ramos representam três dias.</w:t>
+        <w:t xml:space="preserve"> José lhe respondeu: “Aqui está a interpretação: os três ramos representam três dias.</w:t>
       </w:r>
     </w:p>
     <w:p>
@@ -25765,7 +25765,7 @@
         <w:rPr>
           <w:lang w:val="pt_PT" w:bidi="pt_PT"/>
         </w:rPr>
-        <w:t xml:space="preserve"> Fui arrancado da terra dos hebreus contra a minha vontade; e aqui não cometi crime algum para estar preso".</w:t>
+        <w:t xml:space="preserve"> Fui arrancado da terra dos hebreus contra a minha vontade; e aqui não cometi crime algum para estar preso”.</w:t>
       </w:r>
     </w:p>
     <w:p>
@@ -25786,7 +25786,7 @@
         <w:rPr>
           <w:lang w:val="pt_PT" w:bidi="pt_PT"/>
         </w:rPr>
-        <w:t xml:space="preserve"> O chefe dos padeiros, animado ao ouvir a boa interpretação, também contou seu sonho a José: "No meu sonho havia três cestas de pão branco empilhadas sobre a minha cabeça.</w:t>
+        <w:t xml:space="preserve"> O chefe dos padeiros, animado ao ouvir a boa interpretação, também contou seu sonho a José: “No meu sonho havia três cestas de pão branco empilhadas sobre a minha cabeça.</w:t>
       </w:r>
     </w:p>
     <w:p>
@@ -25807,7 +25807,7 @@
         <w:rPr>
           <w:lang w:val="pt_PT" w:bidi="pt_PT"/>
         </w:rPr>
-        <w:t xml:space="preserve"> Na cesta de cima havia todo tipo de pão e comida para o faraó, mas as aves vinham e comiam da cesta que estava sobre minha cabeça".</w:t>
+        <w:t xml:space="preserve"> Na cesta de cima havia todo tipo de pão e comida para o faraó, mas as aves vinham e comiam da cesta que estava sobre minha cabeça”.</w:t>
       </w:r>
     </w:p>
     <w:p>
@@ -25828,7 +25828,7 @@
         <w:rPr>
           <w:lang w:val="pt_PT" w:bidi="pt_PT"/>
         </w:rPr>
-        <w:t xml:space="preserve"> José lhe respondeu: "A explicação é esta: as três cestas representam três dias.</w:t>
+        <w:t xml:space="preserve"> José lhe respondeu: “A explicação é esta: as três cestas representam três dias.</w:t>
       </w:r>
     </w:p>
     <w:p>
@@ -25849,7 +25849,7 @@
         <w:rPr>
           <w:lang w:val="pt_PT" w:bidi="pt_PT"/>
         </w:rPr>
-        <w:t xml:space="preserve"> Em três dias o faraó vai mandar decapitá-lo, pendurá-lo num poste, e os pássaros comerão sua carne".</w:t>
+        <w:t xml:space="preserve"> Em três dias o faraó vai mandar decapitá-lo, pendurá-lo num poste, e os pássaros comerão sua carne”.</w:t>
       </w:r>
     </w:p>
     <w:p>
@@ -26138,7 +26138,7 @@
         <w:rPr>
           <w:lang w:val="pt_PT" w:bidi="pt_PT"/>
         </w:rPr>
-        <w:t xml:space="preserve"> Foi então que o chefe dos copeiros se recordou de José e falou ao faraó: "Hoje percebo que cometi um erro.</w:t>
+        <w:t xml:space="preserve"> Foi então que o chefe dos copeiros se recordou de José e falou ao faraó: “Hoje percebo que cometi um erro.</w:t>
       </w:r>
     </w:p>
     <w:p>
@@ -26222,7 +26222,7 @@
         <w:rPr>
           <w:lang w:val="pt_PT" w:bidi="pt_PT"/>
         </w:rPr>
-        <w:t xml:space="preserve"> E tudo ocorreu exatamente como ele havia interpretado: eu fui restituído ao meu cargo, e o outro foi suspenso num poste".</w:t>
+        <w:t xml:space="preserve"> E tudo ocorreu exatamente como ele havia interpretado: eu fui restituído ao meu cargo, e o outro foi suspenso num poste”.</w:t>
       </w:r>
     </w:p>
     <w:p>
@@ -26264,7 +26264,7 @@
         <w:rPr>
           <w:lang w:val="pt_PT" w:bidi="pt_PT"/>
         </w:rPr>
-        <w:t xml:space="preserve"> O faraó disse a José: "Tive um sonho, e ninguém pôde interpretá-lo. Fiquei sabendo que, ao ouvir um sonho, você consegue explicá-lo".</w:t>
+        <w:t xml:space="preserve"> O faraó disse a José: “Tive um sonho, e ninguém pôde interpretá-lo. Fiquei sabendo que, ao ouvir um sonho, você consegue explicá-lo”.</w:t>
       </w:r>
     </w:p>
     <w:p>
@@ -26285,7 +26285,7 @@
         <w:rPr>
           <w:lang w:val="pt_PT" w:bidi="pt_PT"/>
         </w:rPr>
-        <w:t xml:space="preserve"> José respondeu: "Eu, por mim, não tenho poder para isso; mas Deus dará ao faraó uma resposta que lhe trará paz".</w:t>
+        <w:t xml:space="preserve"> José respondeu: “Eu, por mim, não tenho poder para isso; mas Deus dará ao faraó uma resposta que lhe trará paz”.</w:t>
       </w:r>
     </w:p>
     <w:p>
@@ -26306,7 +26306,7 @@
         <w:rPr>
           <w:lang w:val="pt_PT" w:bidi="pt_PT"/>
         </w:rPr>
-        <w:t xml:space="preserve"> Então o faraó relatou o sonho a José: "Sonhei que estava de pé, junto à margem do rio Nilo.</w:t>
+        <w:t xml:space="preserve"> Então o faraó relatou o sonho a José: “Sonhei que estava de pé, junto à margem do rio Nilo.</w:t>
       </w:r>
     </w:p>
     <w:p>
@@ -26453,7 +26453,7 @@
         <w:rPr>
           <w:lang w:val="pt_PT" w:bidi="pt_PT"/>
         </w:rPr>
-        <w:t xml:space="preserve"> E as espigas miúdas devoraram as sete espigas cheias. Contei os sonhos aos magos, mas nenhum deles conseguiu dar a interpretação".</w:t>
+        <w:t xml:space="preserve"> E as espigas miúdas devoraram as sete espigas cheias. Contei os sonhos aos magos, mas nenhum deles conseguiu dar a interpretação”.</w:t>
       </w:r>
     </w:p>
     <w:p>
@@ -26474,7 +26474,7 @@
         <w:rPr>
           <w:lang w:val="pt_PT" w:bidi="pt_PT"/>
         </w:rPr>
-        <w:t xml:space="preserve"> Então José respondeu: "Os dois sonhos são, na verdade, um só. Deus revelou ao faraó o que está prestes a fazer.</w:t>
+        <w:t xml:space="preserve"> Então José respondeu: “Os dois sonhos são, na verdade, um só. Deus revelou ao faraó o que está prestes a fazer.</w:t>
       </w:r>
     </w:p>
     <w:p>
@@ -26705,7 +26705,7 @@
         <w:rPr>
           <w:lang w:val="pt_PT" w:bidi="pt_PT"/>
         </w:rPr>
-        <w:t xml:space="preserve"> Esse suprimento será uma reserva para os sete anos de fome que virão sobre o Egito, a fim de que o povo consiga atravessar a crise".</w:t>
+        <w:t xml:space="preserve"> Esse suprimento será uma reserva para os sete anos de fome que virão sobre o Egito, a fim de que o povo consiga atravessar a crise”.</w:t>
       </w:r>
     </w:p>
     <w:p>
@@ -26747,7 +26747,7 @@
         <w:rPr>
           <w:lang w:val="pt_PT" w:bidi="pt_PT"/>
         </w:rPr>
-        <w:t xml:space="preserve"> O faraó disse aos seus oficiais: "Poderíamos encontrar outro homem como este, em quem está o Espírito de Deus?".</w:t>
+        <w:t xml:space="preserve"> O faraó disse aos seus oficiais: “Poderíamos encontrar outro homem como este, em quem está o Espírito de Deus?”.</w:t>
       </w:r>
     </w:p>
     <w:p>
@@ -26768,7 +26768,7 @@
         <w:rPr>
           <w:lang w:val="pt_PT" w:bidi="pt_PT"/>
         </w:rPr>
-        <w:t xml:space="preserve"> Então o faraó disse a José: "Já que Deus lhe revelou tudo isso, não existe ninguém tão sábio e capaz quanto você.</w:t>
+        <w:t xml:space="preserve"> Então o faraó disse a José: “Já que Deus lhe revelou tudo isso, não existe ninguém tão sábio e capaz quanto você.</w:t>
       </w:r>
     </w:p>
     <w:p>
@@ -26789,7 +26789,7 @@
         <w:rPr>
           <w:lang w:val="pt_PT" w:bidi="pt_PT"/>
         </w:rPr>
-        <w:t xml:space="preserve"> Você ficará responsável pela minha casa, e todo o meu povo obedecerá às suas ordens; só no trono eu estarei acima de você".</w:t>
+        <w:t xml:space="preserve"> Você ficará responsável pela minha casa, e todo o meu povo obedecerá às suas ordens; só no trono eu estarei acima de você”.</w:t>
       </w:r>
     </w:p>
     <w:p>
@@ -26810,7 +26810,7 @@
         <w:rPr>
           <w:lang w:val="pt_PT" w:bidi="pt_PT"/>
         </w:rPr>
-        <w:t xml:space="preserve"> E acrescentou: "Eu lhe concedo autoridade sobre toda a terra do Egito".</w:t>
+        <w:t xml:space="preserve"> E acrescentou: “Eu lhe concedo autoridade sobre toda a terra do Egito”.</w:t>
       </w:r>
     </w:p>
     <w:p>
@@ -26852,7 +26852,7 @@
         <w:rPr>
           <w:lang w:val="pt_PT" w:bidi="pt_PT"/>
         </w:rPr>
-        <w:t xml:space="preserve"> Também o fez subir em seu segundo carro e ordenou que os homens fossem adiante, proclamando: "Prestai homenagem a José! Curvem-se diante dele". Assim, o faraó estabeleceu José como a maior autoridade sobre toda a terra do Egito.</w:t>
+        <w:t xml:space="preserve"> Também o fez subir em seu segundo carro e ordenou que os homens fossem adiante, proclamando: “Prestai homenagem a José! Curvem-se diante dele”. Assim, o faraó estabeleceu José como a maior autoridade sobre toda a terra do Egito.</w:t>
       </w:r>
     </w:p>
     <w:p>
@@ -26873,7 +26873,7 @@
         <w:rPr>
           <w:lang w:val="pt_PT" w:bidi="pt_PT"/>
         </w:rPr>
-        <w:t xml:space="preserve"> O faraó continuou: "Eu sou o faraó, mas ninguém dará um passo ou tomará qualquer ação no Egito sem a sua permissão".</w:t>
+        <w:t xml:space="preserve"> O faraó continuou: “Eu sou o faraó, mas ninguém dará um passo ou tomará qualquer ação no Egito sem a sua permissão”.</w:t>
       </w:r>
     </w:p>
     <w:p>
@@ -27020,7 +27020,7 @@
         <w:rPr>
           <w:lang w:val="pt_PT" w:bidi="pt_PT"/>
         </w:rPr>
-        <w:t xml:space="preserve"> José chamou o primeiro filho de Manassés, dizendo: "Deus me fez esquecer todo o meu sofrimento e toda a casa de meu pai".</w:t>
+        <w:t xml:space="preserve"> José chamou o primeiro filho de Manassés, dizendo: “Deus me fez esquecer todo o meu sofrimento e toda a casa de meu pai”.</w:t>
       </w:r>
     </w:p>
     <w:p>
@@ -27041,7 +27041,7 @@
         <w:rPr>
           <w:lang w:val="pt_PT" w:bidi="pt_PT"/>
         </w:rPr>
-        <w:t xml:space="preserve"> Ao segundo filho, José deu o nome de Efraim, dizendo: "Deus me fez prosperar na terra onde sofri".</w:t>
+        <w:t xml:space="preserve"> Ao segundo filho, José deu o nome de Efraim, dizendo: “Deus me fez prosperar na terra onde sofri”.</w:t>
       </w:r>
     </w:p>
     <w:p>
@@ -27104,7 +27104,7 @@
         <w:rPr>
           <w:lang w:val="pt_PT" w:bidi="pt_PT"/>
         </w:rPr>
-        <w:t xml:space="preserve"> Quando a fome se espalhou pelo Egito, o povo pediu pão ao faraó, e ele respondeu: "Vão até José e façam tudo o que ele disser".</w:t>
+        <w:t xml:space="preserve"> Quando a fome se espalhou pelo Egito, o povo pediu pão ao faraó, e ele respondeu: “Vão até José e façam tudo o que ele disser”.</w:t>
       </w:r>
     </w:p>
     <w:p>
@@ -27183,7 +27183,7 @@
         <w:rPr>
           <w:lang w:val="pt_PT" w:bidi="pt_PT"/>
         </w:rPr>
-        <w:t xml:space="preserve"> Quando Jacó recebeu notícia de que havia alimento no Egito, perguntou aos filhos: "Vocês vão ficar parados, olhando uns para os outros, sem fazer nada?".</w:t>
+        <w:t xml:space="preserve"> Quando Jacó recebeu notícia de que havia alimento no Egito, perguntou aos filhos: “Vocês vão ficar parados, olhando uns para os outros, sem fazer nada?”.</w:t>
       </w:r>
     </w:p>
     <w:p>
@@ -27204,7 +27204,7 @@
         <w:rPr>
           <w:lang w:val="pt_PT" w:bidi="pt_PT"/>
         </w:rPr>
-        <w:t xml:space="preserve"> E prosseguiu: "Soube que há trigo no Egito. Vão até lá, comprem suprimentos, para que possamos sobreviver e não sejamos consumidos pela fome".</w:t>
+        <w:t xml:space="preserve"> E prosseguiu: “Soube que há trigo no Egito. Vão até lá, comprem suprimentos, para que possamos sobreviver e não sejamos consumidos pela fome”.</w:t>
       </w:r>
     </w:p>
     <w:p>
@@ -27309,7 +27309,7 @@
         <w:rPr>
           <w:lang w:val="pt_PT" w:bidi="pt_PT"/>
         </w:rPr>
-        <w:t xml:space="preserve"> José reconheceu rapidamente seus irmãos, mas fingiu não saber quem eram e lhes falou com dureza: "De onde vocês vêm?". Eles disseram: "Viemos da terra de Canaã para comprar alimento".</w:t>
+        <w:t xml:space="preserve"> José reconheceu rapidamente seus irmãos, mas fingiu não saber quem eram e lhes falou com dureza: “De onde vocês vêm?”. Eles disseram: “Viemos da terra de Canaã para comprar alimento”.</w:t>
       </w:r>
     </w:p>
     <w:p>
@@ -27351,7 +27351,7 @@
         <w:rPr>
           <w:lang w:val="pt_PT" w:bidi="pt_PT"/>
         </w:rPr>
-        <w:t xml:space="preserve"> José se lembrou dos sonhos que havia tido a respeito deles e disse: "Vocês são espiões, vieram sondar os pontos frágeis do Egito".</w:t>
+        <w:t xml:space="preserve"> José se lembrou dos sonhos que havia tido a respeito deles e disse: “Vocês são espiões, vieram sondar os pontos frágeis do Egito”.</w:t>
       </w:r>
     </w:p>
     <w:p>
@@ -27372,7 +27372,7 @@
         <w:rPr>
           <w:lang w:val="pt_PT" w:bidi="pt_PT"/>
         </w:rPr>
-        <w:t xml:space="preserve"> Eles replicaram: "De modo algum, senhor! Seus servos vieram até aqui para comprar alimento.</w:t>
+        <w:t xml:space="preserve"> Eles replicaram: “De modo algum, senhor! Seus servos vieram até aqui para comprar alimento.</w:t>
       </w:r>
     </w:p>
     <w:p>
@@ -27393,7 +27393,7 @@
         <w:rPr>
           <w:lang w:val="pt_PT" w:bidi="pt_PT"/>
         </w:rPr>
-        <w:t xml:space="preserve"> Somos todos filhos de um mesmo homem. Somos homens honestos; seus servos não são espiões".</w:t>
+        <w:t xml:space="preserve"> Somos todos filhos de um mesmo homem. Somos homens honestos; seus servos não são espiões”.</w:t>
       </w:r>
     </w:p>
     <w:p>
@@ -27414,7 +27414,7 @@
         <w:rPr>
           <w:lang w:val="pt_PT" w:bidi="pt_PT"/>
         </w:rPr>
-        <w:t xml:space="preserve"> Mas José insistiu: “Não, vocês vieram para sondar os pontos vulneráveis desta terra".</w:t>
+        <w:t xml:space="preserve"> Mas José insistiu: “Não, vocês vieram para sondar os pontos vulneráveis desta terra”.</w:t>
       </w:r>
     </w:p>
     <w:p>
@@ -27435,7 +27435,7 @@
         <w:rPr>
           <w:lang w:val="pt_PT" w:bidi="pt_PT"/>
         </w:rPr>
-        <w:t xml:space="preserve"> Eles responderam: "Meu senhor, nós, seus servos, éramos doze irmãos, filhos de um mesmo homem que vive na terra de Canaã. O caçula permanece com nosso pai, e um de nossos irmãos já não está entre nós".</w:t>
+        <w:t xml:space="preserve"> Eles responderam: “Meu senhor, nós, seus servos, éramos doze irmãos, filhos de um mesmo homem que vive na terra de Canaã. O caçula permanece com nosso pai, e um de nossos irmãos já não está entre nós”.</w:t>
       </w:r>
     </w:p>
     <w:p>
@@ -27456,7 +27456,7 @@
         <w:rPr>
           <w:lang w:val="pt_PT" w:bidi="pt_PT"/>
         </w:rPr>
-        <w:t xml:space="preserve"> José tornou a falar: "É exatamente como lhes disse: vocês são espiões!".</w:t>
+        <w:t xml:space="preserve"> José tornou a falar: “É exatamente como lhes disse: vocês são espiões!”.</w:t>
       </w:r>
     </w:p>
     <w:p>
@@ -27477,7 +27477,7 @@
         <w:rPr>
           <w:lang w:val="pt_PT" w:bidi="pt_PT"/>
         </w:rPr>
-        <w:t xml:space="preserve"> E acrescentou: "Há uma forma de provar o que dizem. Pela vida do faraó, vocês não sairão daqui até mostrarem o irmão mais jovem.</w:t>
+        <w:t xml:space="preserve"> E acrescentou: “Há uma forma de provar o que dizem. Pela vida do faraó, vocês não sairão daqui até mostrarem o irmão mais jovem.</w:t>
       </w:r>
     </w:p>
     <w:p>
@@ -27498,7 +27498,7 @@
         <w:rPr>
           <w:lang w:val="pt_PT" w:bidi="pt_PT"/>
         </w:rPr>
-        <w:t xml:space="preserve"> Um de vocês deve trazê-lo, e os outros permanecerão presos. Assim se confirmará se falaram a verdade. Caso contrário, pela vida do faraó, ficará provado que são espiões".</w:t>
+        <w:t xml:space="preserve"> Um de vocês deve trazê-lo, e os outros permanecerão presos. Assim se confirmará se falaram a verdade. Caso contrário, pela vida do faraó, ficará provado que são espiões”.</w:t>
       </w:r>
     </w:p>
     <w:p>
@@ -27540,7 +27540,7 @@
         <w:rPr>
           <w:lang w:val="pt_PT" w:bidi="pt_PT"/>
         </w:rPr>
-        <w:t xml:space="preserve"> Passados três dias, José voltou a falar com eles: "Ofereço a vocês a possibilidade de se salvarem, pois temo a Deus.</w:t>
+        <w:t xml:space="preserve"> Passados três dias, José voltou a falar com eles: “Ofereço a vocês a possibilidade de se salvarem, pois temo a Deus.</w:t>
       </w:r>
     </w:p>
     <w:p>
@@ -27582,7 +27582,7 @@
         <w:rPr>
           <w:lang w:val="pt_PT" w:bidi="pt_PT"/>
         </w:rPr>
-        <w:t xml:space="preserve"> Em seguida, tragam-me o mais jovem. Dessa forma demonstrarão que suas palavras são verdadeiras e não serão condenados à morte". Eles concordaram.</w:t>
+        <w:t xml:space="preserve"> Em seguida, tragam-me o mais jovem. Dessa forma demonstrarão que suas palavras são verdadeiras e não serão condenados à morte”. Eles concordaram.</w:t>
       </w:r>
     </w:p>
     <w:p>
@@ -27603,7 +27603,7 @@
         <w:rPr>
           <w:lang w:val="pt_PT" w:bidi="pt_PT"/>
         </w:rPr>
-        <w:t xml:space="preserve"> Então comentaram entre si: "De fato somos culpados, e agora sofremos pelo que fizemos a nosso irmão. Vimos sua aflição quando nos implorava por compaixão, mas não o escutamos. É por isso que estamos passando por esta angústia".</w:t>
+        <w:t xml:space="preserve"> Então comentaram entre si: “De fato somos culpados, e agora sofremos pelo que fizemos a nosso irmão. Vimos sua aflição quando nos implorava por compaixão, mas não o escutamos. É por isso que estamos passando por esta angústia”.</w:t>
       </w:r>
     </w:p>
     <w:p>
@@ -27624,7 +27624,7 @@
         <w:rPr>
           <w:lang w:val="pt_PT" w:bidi="pt_PT"/>
         </w:rPr>
-        <w:t xml:space="preserve"> Rúben falou: "Não avisei que não fizessem mal ao rapaz? Vocês, porém, não me deram atenção. Agora teremos de prestar contas pelo sangue dele".</w:t>
+        <w:t xml:space="preserve"> Rúben falou: “Não avisei que não fizessem mal ao rapaz? Vocês, porém, não me deram atenção. Agora teremos de prestar contas pelo sangue dele”.</w:t>
       </w:r>
     </w:p>
     <w:p>
@@ -27750,7 +27750,7 @@
         <w:rPr>
           <w:lang w:val="pt_PT" w:bidi="pt_PT"/>
         </w:rPr>
-        <w:t xml:space="preserve"> Então disse aos irmãos: “Devolveram meu dinheiro! Está aqui no saco de trigo". O coração deles se abalou, e cada um ficou aterrorizado diante do outro, dizendo: “O que é isto que Deus está fazendo com a gente?".</w:t>
+        <w:t xml:space="preserve"> Então disse aos irmãos: “Devolveram meu dinheiro! Está aqui no saco de trigo”. O coração deles se abalou, e cada um ficou aterrorizado diante do outro, dizendo: “O que é isto que Deus está fazendo com a gente?”.</w:t>
       </w:r>
     </w:p>
     <w:p>
@@ -27813,7 +27813,7 @@
         <w:rPr>
           <w:lang w:val="pt_PT" w:bidi="pt_PT"/>
         </w:rPr>
-        <w:t xml:space="preserve"> Mas nós lhe dissemos: 'Somos homens honestos, não somos espiões.</w:t>
+        <w:t xml:space="preserve"> Mas nós lhe dissemos: ‘Somos homens honestos, não somos espiões.</w:t>
       </w:r>
     </w:p>
     <w:p>
@@ -27834,7 +27834,7 @@
         <w:rPr>
           <w:lang w:val="pt_PT" w:bidi="pt_PT"/>
         </w:rPr>
-        <w:t xml:space="preserve"> Somos doze irmãos filhos de um mesmo pai. Um já não está entre nós, e o mais jovem está com nosso pai na terra de Canaã'.</w:t>
+        <w:t xml:space="preserve"> Somos doze irmãos filhos de um mesmo pai. Um já não está entre nós, e o mais jovem está com nosso pai na terra de Canaã’.</w:t>
       </w:r>
     </w:p>
     <w:p>
@@ -27855,7 +27855,7 @@
         <w:rPr>
           <w:lang w:val="pt_PT" w:bidi="pt_PT"/>
         </w:rPr>
-        <w:t xml:space="preserve"> Mas o homem que governa aquela terra disse: 'Há apenas uma maneira de provarem que são honestos. Um dos irmãos ficará preso aqui, e os outros poderão voltar levando alimento para saciar a fome de seus familiares.</w:t>
+        <w:t xml:space="preserve"> Mas o homem que governa aquela terra disse: ‘Há apenas uma maneira de provarem que são honestos. Um dos irmãos ficará preso aqui, e os outros poderão voltar levando alimento para saciar a fome de seus familiares.</w:t>
       </w:r>
     </w:p>
     <w:p>
@@ -27876,7 +27876,7 @@
         <w:rPr>
           <w:lang w:val="pt_PT" w:bidi="pt_PT"/>
         </w:rPr>
-        <w:t xml:space="preserve"> Depois tragam o irmão mais novo de vocês, para que se confirme que não são espiões, mas homens íntegros. Então libertarei o irmão de vocês, e poderão negociar nesta terra'".</w:t>
+        <w:t xml:space="preserve"> Depois tragam o irmão mais novo de vocês, para que se confirme que não são espiões, mas homens íntegros. Então libertarei o irmão de vocês, e poderão negociar nesta terra’”.</w:t>
       </w:r>
     </w:p>
     <w:p>
@@ -27918,7 +27918,7 @@
         <w:rPr>
           <w:lang w:val="pt_PT" w:bidi="pt_PT"/>
         </w:rPr>
-        <w:t xml:space="preserve"> Jacó lhes disse: "Vocês estão tirando meus filhos de mim. José já se foi, Simeão também, e agora querem levar Benjamim? Quanta dor!".</w:t>
+        <w:t xml:space="preserve"> Jacó lhes disse: “Vocês estão tirando meus filhos de mim. José já se foi, Simeão também, e agora querem levar Benjamim? Quanta dor!”.</w:t>
       </w:r>
     </w:p>
     <w:p>
@@ -27939,7 +27939,7 @@
         <w:rPr>
           <w:lang w:val="pt_PT" w:bidi="pt_PT"/>
         </w:rPr>
-        <w:t xml:space="preserve"> Então Rúben disse ao pai: "Se eu não o trouxer de volta, pode tirar a vida dos meus dois filhos. Confie Benjamim aos meus cuidados; ele voltará comigo".</w:t>
+        <w:t xml:space="preserve"> Então Rúben disse ao pai: “Se eu não o trouxer de volta, pode tirar a vida dos meus dois filhos. Confie Benjamim aos meus cuidados; ele voltará comigo”.</w:t>
       </w:r>
     </w:p>
     <w:p>
@@ -27960,7 +27960,7 @@
         <w:rPr>
           <w:lang w:val="pt_PT" w:bidi="pt_PT"/>
         </w:rPr>
-        <w:t xml:space="preserve"> Mas ele respondeu: "Meu filho não irá com vocês. Seu irmão já morreu, e Benjamim é o único que me resta. Se algum mal lhe acontecer na viagem, vocês me matarão de tristeza".</w:t>
+        <w:t xml:space="preserve"> Mas ele respondeu: “Meu filho não irá com vocês. Seu irmão já morreu, e Benjamim é o único que me resta. Se algum mal lhe acontecer na viagem, vocês me matarão de tristeza”.</w:t>
       </w:r>
     </w:p>
     <w:p>
@@ -28018,7 +28018,7 @@
         <w:rPr>
           <w:lang w:val="pt_PT" w:bidi="pt_PT"/>
         </w:rPr>
-        <w:t xml:space="preserve"> Quando terminou o cereal que os filhos de Israel haviam trazido do Egito, o pai lhes disse: "Voltem lá e comprem mais provisões".</w:t>
+        <w:t xml:space="preserve"> Quando terminou o cereal que os filhos de Israel haviam trazido do Egito, o pai lhes disse: “Voltem lá e comprem mais provisões”.</w:t>
       </w:r>
     </w:p>
     <w:p>
@@ -28039,7 +28039,7 @@
         <w:rPr>
           <w:lang w:val="pt_PT" w:bidi="pt_PT"/>
         </w:rPr>
-        <w:t xml:space="preserve"> Mas Judá respondeu ao pai: "Aquele homem nos advertiu com firmeza: 'Não apareçam diante de mim sem trazer o irmão de vocês'.</w:t>
+        <w:t xml:space="preserve"> Mas Judá respondeu ao pai: “Aquele homem nos advertiu com firmeza: ‘Não apareçam diante de mim sem trazer o irmão de vocês’.</w:t>
       </w:r>
     </w:p>
     <w:p>
@@ -28081,7 +28081,7 @@
         <w:rPr>
           <w:lang w:val="pt_PT" w:bidi="pt_PT"/>
         </w:rPr>
-        <w:t xml:space="preserve"> Mas, se o senhor não permitir que ele vá, não iremos, já que o homem nos advertiu: 'Não apareçam diante de mim sem trazer o irmão de vocês'".</w:t>
+        <w:t xml:space="preserve"> Mas, se o senhor não permitir que ele vá, não iremos, já que o homem nos advertiu: ‘Não apareçam diante de mim sem trazer o irmão de vocês’”.</w:t>
       </w:r>
     </w:p>
     <w:p>
@@ -28102,7 +28102,7 @@
         <w:rPr>
           <w:lang w:val="pt_PT" w:bidi="pt_PT"/>
         </w:rPr>
-        <w:t xml:space="preserve"> Israel perguntou: "Por que vocês me causaram esse mal, contando ao homem que tinham outro irmão?".</w:t>
+        <w:t xml:space="preserve"> Israel perguntou: “Por que vocês me causaram esse mal, contando ao homem que tinham outro irmão?”.</w:t>
       </w:r>
     </w:p>
     <w:p>
@@ -28123,7 +28123,7 @@
         <w:rPr>
           <w:lang w:val="pt_PT" w:bidi="pt_PT"/>
         </w:rPr>
-        <w:t xml:space="preserve"> Eles responderam: "O homem nos interrogou sobre nós e sobre nossa família. Ele quis saber: 'O pai de vocês ainda vive? Há mais algum irmão?'. Apenas demos as respostas que ele pediu. Como imaginar que ele exigiria: 'Tragam o irmão de vocês'?".</w:t>
+        <w:t xml:space="preserve"> Eles responderam: “O homem nos interrogou sobre nós e sobre nossa família. Ele quis saber: ‘O pai de vocês ainda vive? Há mais algum irmão?’. Apenas demos as respostas que ele pediu. Como imaginar que ele exigiria: ‘Tragam o irmão de vocês’?”.</w:t>
       </w:r>
     </w:p>
     <w:p>
@@ -28144,7 +28144,7 @@
         <w:rPr>
           <w:lang w:val="pt_PT" w:bidi="pt_PT"/>
         </w:rPr>
-        <w:t xml:space="preserve"> Judá insistiu com seu pai, Israel: "Entregue o rapaz aos meus cuidados, e iremos. Só assim poderemos ir e continuar vivos: nós, o senhor e nossas crianças.</w:t>
+        <w:t xml:space="preserve"> Judá insistiu com seu pai, Israel: “Entregue o rapaz aos meus cuidados, e iremos. Só assim poderemos ir e continuar vivos: nós, o senhor e nossas crianças.</w:t>
       </w:r>
     </w:p>
     <w:p>
@@ -28186,7 +28186,7 @@
         <w:rPr>
           <w:lang w:val="pt_PT" w:bidi="pt_PT"/>
         </w:rPr>
-        <w:t xml:space="preserve"> Por isso, não prolongue ainda mais a demora. Se tivéssemos ido, a esta altura já estaríamos de volta".</w:t>
+        <w:t xml:space="preserve"> Por isso, não prolongue ainda mais a demora. Se tivéssemos ido, a esta altura já estaríamos de volta”.</w:t>
       </w:r>
     </w:p>
     <w:p>
@@ -28207,7 +28207,7 @@
         <w:rPr>
           <w:lang w:val="pt_PT" w:bidi="pt_PT"/>
         </w:rPr>
-        <w:t xml:space="preserve"> Então Israel, o pai deles, respondeu: "Pelo visto, não há outra saída. Se precisa ser assim, que seja. Levem, porém, o que há de mais valioso nesta terra; coloquem nos sacos e entreguem ao homem: um pouco de bálsamo, um pouco de mel, essências aromáticas e mirra, além de pistaches e amêndoas.</w:t>
+        <w:t xml:space="preserve"> Então Israel, o pai deles, respondeu: “Pelo visto, não há outra saída. Se precisa ser assim, que seja. Levem, porém, o que há de mais valioso nesta terra; coloquem nos sacos e entreguem ao homem: um pouco de bálsamo, um pouco de mel, essências aromáticas e mirra, além de pistaches e amêndoas.</w:t>
       </w:r>
     </w:p>
     <w:p>
@@ -28270,7 +28270,7 @@
         <w:rPr>
           <w:lang w:val="pt_PT" w:bidi="pt_PT"/>
         </w:rPr>
-        <w:t xml:space="preserve"> Que o Deus Todo‑poderoso lhes dê graça diante daquele homem, para que ele solte o outro irmão de vocês e permita que Benjamim volte. Quanto a mim, se eu perder meus filhos, nada me restará senão o sofrimento".</w:t>
+        <w:t xml:space="preserve"> Que o Deus Todo‑poderoso lhes dê graça diante daquele homem, para que ele solte o outro irmão de vocês e permita que Benjamim volte. Quanto a mim, se eu perder meus filhos, nada me restará senão o sofrimento”.</w:t>
       </w:r>
     </w:p>
     <w:p>
@@ -28312,7 +28312,7 @@
         <w:rPr>
           <w:lang w:val="pt_PT" w:bidi="pt_PT"/>
         </w:rPr>
-        <w:t xml:space="preserve"> Quando José percebeu que Benjamim estava com eles, disse ao administrador de sua casa: "Conduza esses homens para a minha residência, escolha algumas cabeças de gado para o abate e organize tudo, porque eles comerão comigo ao meio‑dia".</w:t>
+        <w:t xml:space="preserve"> Quando José percebeu que Benjamim estava com eles, disse ao administrador de sua casa: “Conduza esses homens para a minha residência, escolha algumas cabeças de gado para o abate e organize tudo, porque eles comerão comigo ao meio‑dia”.</w:t>
       </w:r>
     </w:p>
     <w:p>
@@ -28354,7 +28354,7 @@
         <w:rPr>
           <w:lang w:val="pt_PT" w:bidi="pt_PT"/>
         </w:rPr>
-        <w:t xml:space="preserve"> Os filhos de Israel ficaram assustados quando perceberam que estavam sendo levados para a casa de José e diziam: "É por causa do dinheiro que voltou nos nossos sacos. Ele vai nos acusar, nos escravizar e ainda tomar nossos jumentos".</w:t>
+        <w:t xml:space="preserve"> Os filhos de Israel ficaram assustados quando perceberam que estavam sendo levados para a casa de José e diziam: “É por causa do dinheiro que voltou nos nossos sacos. Ele vai nos acusar, nos escravizar e ainda tomar nossos jumentos”.</w:t>
       </w:r>
     </w:p>
     <w:p>
@@ -28396,7 +28396,7 @@
         <w:rPr>
           <w:lang w:val="pt_PT" w:bidi="pt_PT"/>
         </w:rPr>
-        <w:t xml:space="preserve"> Disseram: "Senhor, pedimos licença. Estivemos aqui antes para comprar alimento.</w:t>
+        <w:t xml:space="preserve"> Disseram: “Senhor, pedimos licença. Estivemos aqui antes para comprar alimento.</w:t>
       </w:r>
     </w:p>
     <w:p>
@@ -28438,7 +28438,7 @@
         <w:rPr>
           <w:lang w:val="pt_PT" w:bidi="pt_PT"/>
         </w:rPr>
-        <w:t xml:space="preserve"> Também trouxemos dinheiro extra para adquirir provisões. Não fazemos ideia de quem colocou o dinheiro nos sacos".</w:t>
+        <w:t xml:space="preserve"> Também trouxemos dinheiro extra para adquirir provisões. Não fazemos ideia de quem colocou o dinheiro nos sacos”.</w:t>
       </w:r>
     </w:p>
     <w:p>
@@ -28459,7 +28459,7 @@
         <w:rPr>
           <w:lang w:val="pt_PT" w:bidi="pt_PT"/>
         </w:rPr>
-        <w:t xml:space="preserve"> Mas o administrador respondeu: "Que a paz esteja com vocês. Não tenham medo! Foi o Deus de vocês, o Deus de seu pai, quem lhes concedeu o presente que encontraram nos sacos. O pagamento de vocês chegou às minhas mãos". Então ele libertou Simeão e o conduziu até onde eles estavam.</w:t>
+        <w:t xml:space="preserve"> Mas o administrador respondeu: “Que a paz esteja com vocês. Não tenham medo! Foi o Deus de vocês, o Deus de seu pai, quem lhes concedeu o presente que encontraram nos sacos. O pagamento de vocês chegou às minhas mãos”. Então ele libertou Simeão e o conduziu até onde eles estavam.</w:t>
       </w:r>
     </w:p>
     <w:p>
@@ -28543,7 +28543,7 @@
         <w:rPr>
           <w:lang w:val="pt_PT" w:bidi="pt_PT"/>
         </w:rPr>
-        <w:t xml:space="preserve"> Ele perguntou como eles estavam e, em seguida, disse: "Vocês me falaram sobre o pai idoso de vocês. Como ele está? Ainda está vivo?".</w:t>
+        <w:t xml:space="preserve"> Ele perguntou como eles estavam e, em seguida, disse: “Vocês me falaram sobre o pai idoso de vocês. Como ele está? Ainda está vivo?”.</w:t>
       </w:r>
     </w:p>
     <w:p>
@@ -28564,7 +28564,7 @@
         <w:rPr>
           <w:lang w:val="pt_PT" w:bidi="pt_PT"/>
         </w:rPr>
-        <w:t xml:space="preserve"> Eles responderam: "O seu servo, nosso pai, está bem e continua vivo". E mais uma vez se inclinaram em reverência.</w:t>
+        <w:t xml:space="preserve"> Eles responderam: “O seu servo, nosso pai, está bem e continua vivo”. E mais uma vez se inclinaram em reverência.</w:t>
       </w:r>
     </w:p>
     <w:p>
@@ -28585,7 +28585,7 @@
         <w:rPr>
           <w:lang w:val="pt_PT" w:bidi="pt_PT"/>
         </w:rPr>
-        <w:t xml:space="preserve"> José voltou o olhar para Benjamim, seu irmão por parte de mãe, e perguntou: "Então este é o caçula de quem vocês me falaram?". E acrescentou: "Que Deus lhe mostre favor, meu filho".</w:t>
+        <w:t xml:space="preserve"> José voltou o olhar para Benjamim, seu irmão por parte de mãe, e perguntou: “Então este é o caçula de quem vocês me falaram?”. E acrescentou: “Que Deus lhe mostre favor, meu filho”.</w:t>
       </w:r>
     </w:p>
     <w:p>
@@ -28627,7 +28627,7 @@
         <w:rPr>
           <w:lang w:val="pt_PT" w:bidi="pt_PT"/>
         </w:rPr>
-        <w:t xml:space="preserve"> Depois lavou o rosto e voltou. Recuperou o controle das emoções e ordenou: "Sirvam a refeição".</w:t>
+        <w:t xml:space="preserve"> Depois lavou o rosto e voltou. Recuperou o controle das emoções e ordenou: “Sirvam a refeição”.</w:t>
       </w:r>
     </w:p>
     <w:p>
@@ -28811,7 +28811,7 @@
         <w:rPr>
           <w:lang w:val="pt_PT" w:bidi="pt_PT"/>
         </w:rPr>
-        <w:t xml:space="preserve"> Por que vocês tomaram a taça de prata que meu senhor usa para beber e para praticar adivinhações? O que fizeram foi extremamente errado'".</w:t>
+        <w:t xml:space="preserve"> Por que vocês tomaram a taça de prata que meu senhor usa para beber e para praticar adivinhações? O que fizeram foi extremamente errado’”.</w:t>
       </w:r>
     </w:p>
     <w:p>
@@ -28895,7 +28895,7 @@
         <w:rPr>
           <w:lang w:val="pt_PT" w:bidi="pt_PT"/>
         </w:rPr>
-        <w:t xml:space="preserve"> Se a taça de prata for achada com algum de nós, que aquele que a tiver seja condenado à morte, e quanto aos demais? Nós nos entregaremos como seus servos".</w:t>
+        <w:t xml:space="preserve"> Se a taça de prata for achada com algum de nós, que aquele que a tiver seja condenado à morte, e quanto aos demais? Nós nos entregaremos como seus servos”.</w:t>
       </w:r>
     </w:p>
     <w:p>
@@ -29042,7 +29042,7 @@
         <w:rPr>
           <w:lang w:val="pt_PT" w:bidi="pt_PT"/>
         </w:rPr>
-        <w:t xml:space="preserve"> Judá respondeu: "O que podemos dizer ao meu senhor? Como nos defender? Deus revelou a culpa dos seus servos. Somos seus servos, todos nós, inclusive aquele com quem a taça foi encontrada".</w:t>
+        <w:t xml:space="preserve"> Judá respondeu: “O que podemos dizer ao meu senhor? Como nos defender? Deus revelou a culpa dos seus servos. Somos seus servos, todos nós, inclusive aquele com quem a taça foi encontrada”.</w:t>
       </w:r>
     </w:p>
     <w:p>
@@ -29105,7 +29105,7 @@
         <w:rPr>
           <w:lang w:val="pt_PT" w:bidi="pt_PT"/>
         </w:rPr>
-        <w:t xml:space="preserve"> Meu senhor perguntou a seus servos: 'Vocês têm pai ou algum irmão?'.</w:t>
+        <w:t xml:space="preserve"> Meu senhor perguntou a seus servos: ‘Vocês têm pai ou algum irmão?’.</w:t>
       </w:r>
     </w:p>
     <w:p>
@@ -29231,7 +29231,7 @@
         <w:rPr>
           <w:lang w:val="pt_PT" w:bidi="pt_PT"/>
         </w:rPr>
-        <w:t xml:space="preserve"> Foi então que nosso pai falou: 'Retornem e adquiram mais provisões’.</w:t>
+        <w:t xml:space="preserve"> Foi então que nosso pai falou: ‘Retornem e adquiram mais provisões’.</w:t>
       </w:r>
     </w:p>
     <w:p>
@@ -29273,7 +29273,7 @@
         <w:rPr>
           <w:lang w:val="pt_PT" w:bidi="pt_PT"/>
         </w:rPr>
-        <w:t xml:space="preserve"> Então nosso pai, seu servo, disse: 'Vocês sabem que minha mulher me deu dois filhos.</w:t>
+        <w:t xml:space="preserve"> Então nosso pai, seu servo, disse: ‘Vocês sabem que minha mulher me deu dois filhos.</w:t>
       </w:r>
     </w:p>
     <w:p>
@@ -29315,7 +29315,7 @@
         <w:rPr>
           <w:lang w:val="pt_PT" w:bidi="pt_PT"/>
         </w:rPr>
-        <w:t xml:space="preserve"> Se agora levarem este outro, e algo ruim lhe acontecer, a tristeza me fará descer à sepultura'.</w:t>
+        <w:t xml:space="preserve"> Se agora levarem este outro, e algo ruim lhe acontecer, a tristeza me fará descer à sepultura’.</w:t>
       </w:r>
     </w:p>
     <w:p>
@@ -29378,7 +29378,7 @@
         <w:rPr>
           <w:lang w:val="pt_PT" w:bidi="pt_PT"/>
         </w:rPr>
-        <w:t xml:space="preserve"> Eu garanti ao meu pai que cuidaria do rapaz. Disse a ele: ‘Se eu não o trouxer de volta, carregarei a culpa diante do meu pai para sempre'.</w:t>
+        <w:t xml:space="preserve"> Eu garanti ao meu pai que cuidaria do rapaz. Disse a ele: ‘Se eu não o trouxer de volta, carregarei a culpa diante do meu pai para sempre’.</w:t>
       </w:r>
     </w:p>
     <w:p>
@@ -29420,7 +29420,7 @@
         <w:rPr>
           <w:lang w:val="pt_PT" w:bidi="pt_PT"/>
         </w:rPr>
-        <w:t xml:space="preserve"> Como poderei voltar e me apresentar diante de meu pai se o jovem não estiver comigo? Eu não suportaria ver o sofrimento que isso traria ao meu pai".</w:t>
+        <w:t xml:space="preserve"> Como poderei voltar e me apresentar diante de meu pai se o jovem não estiver comigo? Eu não suportaria ver o sofrimento que isso traria ao meu pai”.</w:t>
       </w:r>
     </w:p>
     <w:p>
@@ -29625,7 +29625,7 @@
         <w:rPr>
           <w:lang w:val="pt_PT" w:bidi="pt_PT"/>
         </w:rPr>
-        <w:t xml:space="preserve"> Portanto, apressem-se! Retornem ao meu pai e digam: 'Estas são as palavras de seu filho José: Deus me fez governante de toda a terra do Egito. Venha para cá o quanto antes.</w:t>
+        <w:t xml:space="preserve"> Portanto, apressem-se! Retornem ao meu pai e digam: ‘Estas são as palavras de seu filho José: Deus me fez governante de toda a terra do Egito. Venha para cá o quanto antes.</w:t>
       </w:r>
     </w:p>
     <w:p>
@@ -29667,7 +29667,7 @@
         <w:rPr>
           <w:lang w:val="pt_PT" w:bidi="pt_PT"/>
         </w:rPr>
-        <w:t xml:space="preserve"> Eu mesmo garantirei o seu alimento, porque restam ainda cinco anos de escassez. Faça conforme minhas palavras, para que a pobreza não recaia sobre o senhor, sua casa e seus bens'.</w:t>
+        <w:t xml:space="preserve"> Eu mesmo garantirei o seu alimento, porque restam ainda cinco anos de escassez. Faça conforme minhas palavras, para que a pobreza não recaia sobre o senhor, sua casa e seus bens’.</w:t>
       </w:r>
     </w:p>
     <w:p>
@@ -29709,7 +29709,7 @@
         <w:rPr>
           <w:lang w:val="pt_PT" w:bidi="pt_PT"/>
         </w:rPr>
-        <w:t xml:space="preserve"> Contem ao meu pai toda a honra que recebi no Egito e tudo o que vocês mesmos viram. Vão depressa e tragam meu pai".</w:t>
+        <w:t xml:space="preserve"> Contem ao meu pai toda a honra que recebi no Egito e tudo o que vocês mesmos viram. Vão depressa e tragam meu pai”.</w:t>
       </w:r>
     </w:p>
     <w:p>
@@ -29856,7 +29856,7 @@
         <w:rPr>
           <w:lang w:val="pt_PT" w:bidi="pt_PT"/>
         </w:rPr>
-        <w:t xml:space="preserve"> E não se preocupem com os seus bens, pois o melhor que há no Egito será dado a vocês'".</w:t>
+        <w:t xml:space="preserve"> E não se preocupem com os seus bens, pois o melhor que há no Egito será dado a vocês’”.</w:t>
       </w:r>
     </w:p>
     <w:p>
@@ -30024,7 +30024,7 @@
         <w:rPr>
           <w:lang w:val="pt_PT" w:bidi="pt_PT"/>
         </w:rPr>
-        <w:t xml:space="preserve"> Então Israel exclamou: “Não é preciso dizer mais nada! Meu filho José continua vivo. Quero ir vê-lo antes que eu morra".</w:t>
+        <w:t xml:space="preserve"> Então Israel exclamou: “Não é preciso dizer mais nada! Meu filho José continua vivo. Quero ir vê-lo antes que eu morra”.</w:t>
       </w:r>
     </w:p>
     <w:p>
@@ -30082,7 +30082,7 @@
         <w:rPr>
           <w:lang w:val="pt_PT" w:bidi="pt_PT"/>
         </w:rPr>
-        <w:t xml:space="preserve"> Enquanto estava em Berseba, Deus falou com Israel durante a noite por meio de visões. Deus o chamou: "Jacó, Jacó!". E ele respondeu: "Aqui estou".</w:t>
+        <w:t xml:space="preserve"> Enquanto estava em Berseba, Deus falou com Israel durante a noite por meio de visões. Deus o chamou: “Jacó, Jacó!”. E ele respondeu: “Aqui estou”.</w:t>
       </w:r>
     </w:p>
     <w:p>
@@ -30103,7 +30103,7 @@
         <w:rPr>
           <w:lang w:val="pt_PT" w:bidi="pt_PT"/>
         </w:rPr>
-        <w:t xml:space="preserve"> Deus disse: "Eu sou Deus, o Deus de seu pai. Não tenha medo de descer ao Egito, pois ali farei de você uma grande nação.</w:t>
+        <w:t xml:space="preserve"> Deus disse: “Eu sou Deus, o Deus de seu pai. Não tenha medo de descer ao Egito, pois ali farei de você uma grande nação.</w:t>
       </w:r>
     </w:p>
     <w:p>
@@ -30124,7 +30124,7 @@
         <w:rPr>
           <w:lang w:val="pt_PT" w:bidi="pt_PT"/>
         </w:rPr>
-        <w:t xml:space="preserve"> Eu irei com você ao Egito e depois o trarei de volta. E José estará ao seu lado quando você fechar os olhos".</w:t>
+        <w:t xml:space="preserve"> Eu irei com você ao Egito e depois o trarei de volta. E José estará ao seu lado quando você fechar os olhos”.</w:t>
       </w:r>
     </w:p>
     <w:p>
@@ -30670,7 +30670,7 @@
         <w:rPr>
           <w:lang w:val="pt_PT" w:bidi="pt_PT"/>
         </w:rPr>
-        <w:t xml:space="preserve"> Então Israel disse a José: "Agora posso partir em paz, pois vi o seu rosto. Meu filho está vivo!".</w:t>
+        <w:t xml:space="preserve"> Então Israel disse a José: “Agora posso partir em paz, pois vi o seu rosto. Meu filho está vivo!”.</w:t>
       </w:r>
     </w:p>
     <w:p>
@@ -30691,7 +30691,7 @@
         <w:rPr>
           <w:lang w:val="pt_PT" w:bidi="pt_PT"/>
         </w:rPr>
-        <w:t xml:space="preserve"> José disse aos irmãos e à família do pai: "Vou falar com o faraó e dizer que meus irmãos e a casa de meu pai vieram da terra de Canaã para estar comigo.</w:t>
+        <w:t xml:space="preserve"> José disse aos irmãos e à família do pai: “Vou falar com o faraó e dizer que meus irmãos e a casa de meu pai vieram da terra de Canaã para estar comigo.</w:t>
       </w:r>
     </w:p>
     <w:p>
@@ -30733,7 +30733,7 @@
         <w:rPr>
           <w:lang w:val="pt_PT" w:bidi="pt_PT"/>
         </w:rPr>
-        <w:t xml:space="preserve"> Quando o faraó convocá-los e perguntar: 'Qual é a ocupação de vocês?',</w:t>
+        <w:t xml:space="preserve"> Quando o faraó convocá-los e perguntar: ‘Qual é a ocupação de vocês?’,</w:t>
       </w:r>
     </w:p>
     <w:p>
@@ -30754,7 +30754,7 @@
         <w:rPr>
           <w:lang w:val="pt_PT" w:bidi="pt_PT"/>
         </w:rPr>
-        <w:t xml:space="preserve"> respondam assim: 'Seus servos cuidam de rebanhos desde a juventude; esse também era o ofício de nossos antepassados’. Assim, vocês poderão permanecer na terra de Gósen, pois os egípcios têm aversão aos pastores”.</w:t>
+        <w:t xml:space="preserve"> respondam assim: ‘Seus servos cuidam de rebanhos desde a juventude; esse também era o ofício de nossos antepassados’. Assim, vocês poderão permanecer na terra de Gósen, pois os egípcios têm aversão aos pastores”.</w:t>
       </w:r>
     </w:p>
     <w:p>
@@ -30875,7 +30875,7 @@
         <w:rPr>
           <w:lang w:val="pt_PT" w:bidi="pt_PT"/>
         </w:rPr>
-        <w:t xml:space="preserve"> O faraó declarou a José: "Seu pai e seus irmãos vieram para junto de você.</w:t>
+        <w:t xml:space="preserve"> O faraó declarou a José: “Seu pai e seus irmãos vieram para junto de você.</w:t>
       </w:r>
     </w:p>
     <w:p>
@@ -30959,7 +30959,7 @@
         <w:rPr>
           <w:lang w:val="pt_PT" w:bidi="pt_PT"/>
         </w:rPr>
-        <w:t xml:space="preserve"> Jacó afirmou: "Vivo há 130 anos, e não foram anos fáceis. Porém, diante da vida longa dos meus antepassados, a minha parece pequena".</w:t>
+        <w:t xml:space="preserve"> Jacó afirmou: “Vivo há 130 anos, e não foram anos fáceis. Porém, diante da vida longa dos meus antepassados, a minha parece pequena”.</w:t>
       </w:r>
     </w:p>
     <w:p>
@@ -31379,7 +31379,7 @@
         <w:rPr>
           <w:lang w:val="pt_PT" w:bidi="pt_PT"/>
         </w:rPr>
-        <w:t xml:space="preserve"> Ao perceber que sua morte estava próxima, Israel chamou José e disse: "Se realmente quer me tratar com bondade, coloque a mão sob minha coxa e prometa que não vai me enterrar no Egito.</w:t>
+        <w:t xml:space="preserve"> Ao perceber que sua morte estava próxima, Israel chamou José e disse: “Se realmente quer me tratar com bondade, coloque a mão sob minha coxa e prometa que não vai me enterrar no Egito.</w:t>
       </w:r>
     </w:p>
     <w:p>
@@ -31521,7 +31521,7 @@
         <w:rPr>
           <w:lang w:val="pt_PT" w:bidi="pt_PT"/>
         </w:rPr>
-        <w:t xml:space="preserve"> Ele declarou: 'Eu o tornarei fecundo, e sua descendência se multiplicará até formar muitas nações. E ainda: entregarei esta terra à sua linhagem como posse permanente'.</w:t>
+        <w:t xml:space="preserve"> Ele declarou: ‘Eu o tornarei fecundo, e sua descendência se multiplicará até formar muitas nações. E ainda: entregarei esta terra à sua linhagem como posse permanente’.</w:t>
       </w:r>
     </w:p>
     <w:p>
@@ -31668,7 +31668,7 @@
         <w:rPr>
           <w:lang w:val="pt_PT" w:bidi="pt_PT"/>
         </w:rPr>
-        <w:t xml:space="preserve"> Israel falou a José: “Eu havia perdido a esperança de revê‑lo, e agora Deus me concedeu também a alegria de ver seus filhos".</w:t>
+        <w:t xml:space="preserve"> Israel falou a José: “Eu havia perdido a esperança de revê‑lo, e agora Deus me concedeu também a alegria de ver seus filhos”.</w:t>
       </w:r>
     </w:p>
     <w:p>
@@ -31936,7 +31936,7 @@
         <w:rPr>
           <w:lang w:val="pt_PT" w:bidi="pt_PT"/>
         </w:rPr>
-        <w:t xml:space="preserve"> Jacó chamou seus filhos e disse: "Reúnam-se ao meu redor, e eu lhes direi o que lhes ocorrerá nos dias futuros.</w:t>
+        <w:t xml:space="preserve"> Jacó chamou seus filhos e disse: “Reúnam-se ao meu redor, e eu lhes direi o que lhes ocorrerá nos dias futuros.</w:t>
       </w:r>
     </w:p>
     <w:p>
@@ -32482,7 +32482,7 @@
         <w:rPr>
           <w:lang w:val="pt_PT" w:bidi="pt_PT"/>
         </w:rPr>
-        <w:t xml:space="preserve"> "Benjamim é semelhante a um lobo feroz: de manhã devora a presa, e ao fim do dia distribui o que sobrou".</w:t>
+        <w:t xml:space="preserve"> "Benjamim é semelhante a um lobo feroz: de manhã devora a presa, e ao fim do dia distribui o que sobrou”.</w:t>
       </w:r>
     </w:p>
     <w:p>
@@ -32524,7 +32524,7 @@
         <w:rPr>
           <w:lang w:val="pt_PT" w:bidi="pt_PT"/>
         </w:rPr>
-        <w:t xml:space="preserve"> Depois lhes deu estas instruções: "Estou prestes a morrer e a reunir‑me ao meu povo. Sepultem‑me com meus pais, na caverna que fica no campo de Efrom, o heteu.</w:t>
+        <w:t xml:space="preserve"> Depois lhes deu estas instruções: “Estou prestes a morrer e a reunir‑me ao meu povo. Sepultem‑me com meus pais, na caverna que fica no campo de Efrom, o heteu.</w:t>
       </w:r>
     </w:p>
     <w:p>
@@ -32587,7 +32587,7 @@
         <w:rPr>
           <w:lang w:val="pt_PT" w:bidi="pt_PT"/>
         </w:rPr>
-        <w:t xml:space="preserve"> Tanto o campo quanto a caverna que há nele foram comprados dos hititas".</w:t>
+        <w:t xml:space="preserve"> Tanto o campo quanto a caverna que há nele foram comprados dos hititas”.</w:t>
       </w:r>
     </w:p>
     <w:p>
@@ -32708,7 +32708,7 @@
         <w:rPr>
           <w:lang w:val="pt_PT" w:bidi="pt_PT"/>
         </w:rPr>
-        <w:t xml:space="preserve"> Quando se completaram os dias de luto, José dirigiu-se aos oficiais da corte do faraó e lhes disse: "Peço a gentileza de apresentarem ao faraó meu pedido com tais palavras:</w:t>
+        <w:t xml:space="preserve"> Quando se completaram os dias de luto, José dirigiu-se aos oficiais da corte do faraó e lhes disse: “Peço a gentileza de apresentarem ao faraó meu pedido com tais palavras:</w:t>
       </w:r>
     </w:p>
     <w:p>
@@ -32729,7 +32729,7 @@
         <w:rPr>
           <w:lang w:val="pt_PT" w:bidi="pt_PT"/>
         </w:rPr>
-        <w:t xml:space="preserve"> Meu pai me fez jurar, dizendo: ‘Estou prestes a morrer; sepulte-me na terra de Canaã, no túmulo que preparei para mim’. Permita-me subir para enterrar meu pai; depois retornarei".</w:t>
+        <w:t xml:space="preserve"> Meu pai me fez jurar, dizendo: ‘Estou prestes a morrer; sepulte-me na terra de Canaã, no túmulo que preparei para mim’. Permita-me subir para enterrar meu pai; depois retornarei”.</w:t>
       </w:r>
     </w:p>
     <w:p>
@@ -32750,7 +32750,7 @@
         <w:rPr>
           <w:lang w:val="pt_PT" w:bidi="pt_PT"/>
         </w:rPr>
-        <w:t xml:space="preserve"> O faraó respondeu: "Pode ir e sepultar seu pai, conforme ele fez você jurar".</w:t>
+        <w:t xml:space="preserve"> O faraó respondeu: “Pode ir e sepultar seu pai, conforme ele fez você jurar”.</w:t>
       </w:r>
     </w:p>
     <w:p>
@@ -32855,7 +32855,7 @@
         <w:rPr>
           <w:lang w:val="pt_PT" w:bidi="pt_PT"/>
         </w:rPr>
-        <w:t xml:space="preserve"> Quando os cananeus, habitantes daquela região, viram o luto realizado em Atade, comentaram: "Como é intenso o pranto desses egípcios!". Por isso, aquele lugar, situado além do Jordão, recebeu o nome de Abel-Mizraim.</w:t>
+        <w:t xml:space="preserve"> Quando os cananeus, habitantes daquela região, viram o luto realizado em Atade, comentaram: “Como é intenso o pranto desses egípcios!”. Por isso, aquele lugar, situado além do Jordão, recebeu o nome de Abel-Mizraim.</w:t>
       </w:r>
     </w:p>
     <w:p>
@@ -32939,7 +32939,7 @@
         <w:rPr>
           <w:lang w:val="pt_PT" w:bidi="pt_PT"/>
         </w:rPr>
-        <w:t xml:space="preserve"> Quando perceberam que o pai tinha partido, os irmãos disseram: "E se José ainda estiver magoado e resolver retribuir todo o mal que lhe causamos?".</w:t>
+        <w:t xml:space="preserve"> Quando perceberam que o pai tinha partido, os irmãos disseram: “E se José ainda estiver magoado e resolver retribuir todo o mal que lhe causamos?”.</w:t>
       </w:r>
     </w:p>
     <w:p>
@@ -32960,7 +32960,7 @@
         <w:rPr>
           <w:lang w:val="pt_PT" w:bidi="pt_PT"/>
         </w:rPr>
-        <w:t xml:space="preserve"> Por isso, enviaram uma mensagem a José: "Antes de morrer, seu pai nos pediu que falássemos algo a você.</w:t>
+        <w:t xml:space="preserve"> Por isso, enviaram uma mensagem a José: “Antes de morrer, seu pai nos pediu que falássemos algo a você.</w:t>
       </w:r>
     </w:p>
     <w:p>
@@ -32981,7 +32981,7 @@
         <w:rPr>
           <w:lang w:val="pt_PT" w:bidi="pt_PT"/>
         </w:rPr>
-        <w:t xml:space="preserve"> Esta é a mensagem: 'Perdoe a maldade de seus irmãos e o pecado que cometeram quando lhe fizeram o mal'". E acrescentaram: "Agora pedimos que perdoe a culpa dos servos do Deus de seu pai". Enquanto diziam isso, José começou a chorar.</w:t>
+        <w:t xml:space="preserve"> Esta é a mensagem: ‘Perdoe a maldade de seus irmãos e o pecado que cometeram quando lhe fizeram o mal’”. E acrescentaram: “Agora pedimos que perdoe a culpa dos servos do Deus de seu pai”. Enquanto diziam isso, José começou a chorar.</w:t>
       </w:r>
     </w:p>
     <w:p>
@@ -33002,7 +33002,7 @@
         <w:rPr>
           <w:lang w:val="pt_PT" w:bidi="pt_PT"/>
         </w:rPr>
-        <w:t xml:space="preserve"> Então os irmãos se aproximaram de José, prostraram-se diante dele e disseram: "Somos seus escravos".</w:t>
+        <w:t xml:space="preserve"> Então os irmãos se aproximaram de José, prostraram-se diante dele e disseram: “Somos seus escravos”.</w:t>
       </w:r>
     </w:p>
     <w:p>
@@ -33023,7 +33023,7 @@
         <w:rPr>
           <w:lang w:val="pt_PT" w:bidi="pt_PT"/>
         </w:rPr>
-        <w:t xml:space="preserve"> José respondeu: "Não tenham medo; acaso estou eu no lugar de Deus?</w:t>
+        <w:t xml:space="preserve"> José respondeu: “Não tenham medo; acaso estou eu no lugar de Deus?</w:t>
       </w:r>
     </w:p>
     <w:p>
@@ -33065,7 +33065,7 @@
         <w:rPr>
           <w:lang w:val="pt_PT" w:bidi="pt_PT"/>
         </w:rPr>
-        <w:t xml:space="preserve"> Portanto, não tenham medo. Eu cuidarei de vocês e de seus filhos". E assim José os acalmou, falando-lhes com bondade.</w:t>
+        <w:t xml:space="preserve"> Portanto, não tenham medo. Eu cuidarei de vocês e de seus filhos”. E assim José os acalmou, falando-lhes com bondade.</w:t>
       </w:r>
     </w:p>
     <w:p>
@@ -33128,7 +33128,7 @@
         <w:rPr>
           <w:lang w:val="pt_PT" w:bidi="pt_PT"/>
         </w:rPr>
-        <w:t xml:space="preserve"> José disse aos irmãos: "Minha morte se aproxima; porém Deus, no tempo certo, visitará vocês e os tirará desta terra, conduzindo-os de volta à terra que prometeu a Abraão, Isaque e Jacó".</w:t>
+        <w:t xml:space="preserve"> José disse aos irmãos: “Minha morte se aproxima; porém Deus, no tempo certo, visitará vocês e os tirará desta terra, conduzindo-os de volta à terra que prometeu a Abraão, Isaque e Jacó”.</w:t>
       </w:r>
     </w:p>
     <w:p>
@@ -33149,7 +33149,7 @@
         <w:rPr>
           <w:lang w:val="pt_PT" w:bidi="pt_PT"/>
         </w:rPr>
-        <w:t xml:space="preserve"> E José fez os filhos de Israel jurarem, dizendo: "Quando Deus visitar vocês, levem daqui os meus ossos".</w:t>
+        <w:t xml:space="preserve"> E José fez os filhos de Israel jurarem, dizendo: “Quando Deus visitar vocês, levem daqui os meus ossos”.</w:t>
       </w:r>
     </w:p>
     <w:p>

</xml_diff>